<commit_message>
feat: SHAP 예측 설명 추가 + Streamlit Cloud 버그 수정
- src/femto_shap.py: 로컬 CPU SHAP 분석 스크립트 추가
  LinearExplainer(분류) + KernelExplainer(GRU, 시간축 평균 근사)
- 산출물/_imgs/S1~S3: SHAP beeswarm + 피처 중요도 비교 차트 3종
- 딥러닝_FEMTO_RUL_발표자료.pptx: 부록C SHAP 슬라이드 3장 추가
- 딥러닝_산출물_발표용.docx: 부록E SHAP 분석 섹션 추가
- data/FEMTO_processed/vif_results.csv: 실제 VIF 값 재계산
- src/femto_preprocess.py: temp_mean 전체 NaN 시 0 대체 처리
- app/streamlit_femto.py: df.empty 시 경고 메시지 개선
- models/femto_lstm_rul.keras: Cloud 배포용 LSTM 모델 추가
</commit_message>
<xml_diff>
--- a/Homework/DL_FactoryAutomation/산출물/딥러닝_산출물_20260625_FEMTO_RUL_발표용.docx
+++ b/Homework/DL_FactoryAutomation/산출물/딥러닝_산출물_20260625_FEMTO_RUL_발표용.docx
@@ -5691,6 +5691,8 @@
                 <w:sz w:val="20"/>
               </w:rPr>
               <w:t>온도 결측 처리</w:t>
+              <w:br/>
+              <w:t>(temp_mean)</w:t>
             </w:r>
           </w:p>
         </w:tc>
@@ -5710,7 +5712,17 @@
                 <w:b w:val="0"/>
                 <w:sz w:val="20"/>
               </w:rPr>
-              <w:t>베어링별 선형 보간(interpolate) → bfill → ffill → 전체 중앙값 대체</w:t>
+              <w:t>발생 원인: temp_*.csv 파일 누락 시 NaN 생성 (h/v 진동 피처는 acc 파일만 사용하므로 결측 없음)</w:t>
+              <w:br/>
+              <w:t>처리 3단계:</w:t>
+              <w:br/>
+              <w:t xml:space="preserve">  ① 베어링별 선형 보간 interpolate(method='linear') — 시계열 연속성 보존</w:t>
+              <w:br/>
+              <w:t xml:space="preserve">  ② 양방향 채움 bfill().ffill() — 시작·끝 결측 처리</w:t>
+              <w:br/>
+              <w:t xml:space="preserve">  ③ 전체 중앙값 fillna(median()) — 해당 베어링 온도 파일 전무 시 최후 수단</w:t>
+              <w:br/>
+              <w:t>SimpleImputer 미사용: 전역 평균은 시계열 경향성(온도 상승 패턴)을 무시하므로 부적합</w:t>
             </w:r>
           </w:p>
         </w:tc>
@@ -9861,7 +9873,408 @@
           <w:color w:val="2E75B6"/>
           <w:sz w:val="22"/>
         </w:rPr>
-        <w:t>5.2 탭별 주요 기능</w:t>
+        <w:t>5.2 사이드바 — 진단 설정</w:t>
+      </w:r>
+    </w:p>
+    <w:tbl>
+      <w:tblPr>
+        <w:tblStyle w:val="TableGrid"/>
+        <w:tblW w:type="auto" w:w="0"/>
+        <w:tblLook w:firstColumn="1" w:firstRow="1" w:lastColumn="0" w:lastRow="0" w:noHBand="0" w:noVBand="1" w:val="04A0"/>
+      </w:tblPr>
+      <w:tblGrid>
+        <w:gridCol w:w="3135"/>
+        <w:gridCol w:w="3135"/>
+        <w:gridCol w:w="3135"/>
+      </w:tblGrid>
+      <w:tr>
+        <w:tc>
+          <w:tcPr>
+            <w:tcW w:type="dxa" w:w="2551"/>
+            <w:shd w:val="clear" w:color="auto" w:fill="1F4E79"/>
+            <w:vAlign w:val="center"/>
+          </w:tcPr>
+          <w:p>
+            <w:pPr>
+              <w:jc w:val="center"/>
+            </w:pPr>
+            <w:r>
+              <w:rPr>
+                <w:rFonts w:ascii="맑은 고딕" w:hAnsi="맑은 고딕"/>
+                <w:b/>
+                <w:color w:val="FFFFFF"/>
+                <w:sz w:val="20"/>
+              </w:rPr>
+              <w:t>구성 요소</w:t>
+            </w:r>
+          </w:p>
+        </w:tc>
+        <w:tc>
+          <w:tcPr>
+            <w:tcW w:type="dxa" w:w="1417"/>
+            <w:shd w:val="clear" w:color="auto" w:fill="1F4E79"/>
+            <w:vAlign w:val="center"/>
+          </w:tcPr>
+          <w:p>
+            <w:pPr>
+              <w:jc w:val="center"/>
+            </w:pPr>
+            <w:r>
+              <w:rPr>
+                <w:rFonts w:ascii="맑은 고딕" w:hAnsi="맑은 고딕"/>
+                <w:b/>
+                <w:color w:val="FFFFFF"/>
+                <w:sz w:val="20"/>
+              </w:rPr>
+              <w:t>기본값</w:t>
+            </w:r>
+          </w:p>
+        </w:tc>
+        <w:tc>
+          <w:tcPr>
+            <w:tcW w:type="dxa" w:w="5102"/>
+            <w:shd w:val="clear" w:color="auto" w:fill="1F4E79"/>
+            <w:vAlign w:val="center"/>
+          </w:tcPr>
+          <w:p>
+            <w:pPr>
+              <w:jc w:val="center"/>
+            </w:pPr>
+            <w:r>
+              <w:rPr>
+                <w:rFonts w:ascii="맑은 고딕" w:hAnsi="맑은 고딕"/>
+                <w:b/>
+                <w:color w:val="FFFFFF"/>
+                <w:sz w:val="20"/>
+              </w:rPr>
+              <w:t>기능</w:t>
+            </w:r>
+          </w:p>
+        </w:tc>
+      </w:tr>
+      <w:tr>
+        <w:tc>
+          <w:tcPr>
+            <w:tcW w:type="dxa" w:w="2551"/>
+            <w:shd w:val="clear" w:color="auto" w:fill="FFFFFF"/>
+            <w:vAlign w:val="center"/>
+          </w:tcPr>
+          <w:p>
+            <w:pPr>
+              <w:jc w:val="left"/>
+            </w:pPr>
+            <w:r>
+              <w:rPr>
+                <w:rFonts w:ascii="맑은 고딕" w:hAnsi="맑은 고딕"/>
+                <w:b w:val="0"/>
+                <w:sz w:val="20"/>
+              </w:rPr>
+              <w:t>ML 열화 판정 임계값 (슬라이더)</w:t>
+            </w:r>
+          </w:p>
+        </w:tc>
+        <w:tc>
+          <w:tcPr>
+            <w:tcW w:type="dxa" w:w="1417"/>
+            <w:shd w:val="clear" w:color="auto" w:fill="FFFFFF"/>
+            <w:vAlign w:val="center"/>
+          </w:tcPr>
+          <w:p>
+            <w:pPr>
+              <w:jc w:val="center"/>
+            </w:pPr>
+            <w:r>
+              <w:rPr>
+                <w:rFonts w:ascii="맑은 고딕" w:hAnsi="맑은 고딕"/>
+                <w:b w:val="0"/>
+                <w:sz w:val="20"/>
+              </w:rPr>
+              <w:t>0.50</w:t>
+            </w:r>
+          </w:p>
+        </w:tc>
+        <w:tc>
+          <w:tcPr>
+            <w:tcW w:type="dxa" w:w="5102"/>
+            <w:shd w:val="clear" w:color="auto" w:fill="FFFFFF"/>
+            <w:vAlign w:val="center"/>
+          </w:tcPr>
+          <w:p>
+            <w:pPr>
+              <w:jc w:val="center"/>
+            </w:pPr>
+            <w:r>
+              <w:rPr>
+                <w:rFonts w:ascii="맑은 고딕" w:hAnsi="맑은 고딕"/>
+                <w:b w:val="0"/>
+                <w:sz w:val="20"/>
+              </w:rPr>
+              <w:t>임계값 이상이면 열화 판정. 낮출수록 민감도 증가</w:t>
+            </w:r>
+          </w:p>
+        </w:tc>
+      </w:tr>
+      <w:tr>
+        <w:tc>
+          <w:tcPr>
+            <w:tcW w:type="dxa" w:w="2551"/>
+            <w:shd w:val="clear" w:color="auto" w:fill="F2F2F2"/>
+            <w:vAlign w:val="center"/>
+          </w:tcPr>
+          <w:p>
+            <w:pPr>
+              <w:jc w:val="left"/>
+            </w:pPr>
+            <w:r>
+              <w:rPr>
+                <w:rFonts w:ascii="맑은 고딕" w:hAnsi="맑은 고딕"/>
+                <w:b w:val="0"/>
+                <w:sz w:val="20"/>
+              </w:rPr>
+              <w:t>임계값 변경 이력 (expander)</w:t>
+            </w:r>
+          </w:p>
+        </w:tc>
+        <w:tc>
+          <w:tcPr>
+            <w:tcW w:type="dxa" w:w="1417"/>
+            <w:shd w:val="clear" w:color="auto" w:fill="F2F2F2"/>
+            <w:vAlign w:val="center"/>
+          </w:tcPr>
+          <w:p>
+            <w:pPr>
+              <w:jc w:val="center"/>
+            </w:pPr>
+            <w:r>
+              <w:rPr>
+                <w:rFonts w:ascii="맑은 고딕" w:hAnsi="맑은 고딕"/>
+                <w:b w:val="0"/>
+                <w:sz w:val="20"/>
+              </w:rPr>
+              <w:t>—</w:t>
+            </w:r>
+          </w:p>
+        </w:tc>
+        <w:tc>
+          <w:tcPr>
+            <w:tcW w:type="dxa" w:w="5102"/>
+            <w:shd w:val="clear" w:color="auto" w:fill="F2F2F2"/>
+            <w:vAlign w:val="center"/>
+          </w:tcPr>
+          <w:p>
+            <w:pPr>
+              <w:jc w:val="center"/>
+            </w:pPr>
+            <w:r>
+              <w:rPr>
+                <w:rFonts w:ascii="맑은 고딕" w:hAnsi="맑은 고딕"/>
+                <w:b w:val="0"/>
+                <w:sz w:val="20"/>
+              </w:rPr>
+              <w:t>슬라이더 조정 시 변경 이력 자동 기록</w:t>
+            </w:r>
+          </w:p>
+        </w:tc>
+      </w:tr>
+      <w:tr>
+        <w:tc>
+          <w:tcPr>
+            <w:tcW w:type="dxa" w:w="2551"/>
+            <w:shd w:val="clear" w:color="auto" w:fill="FFFFFF"/>
+            <w:vAlign w:val="center"/>
+          </w:tcPr>
+          <w:p>
+            <w:pPr>
+              <w:jc w:val="left"/>
+            </w:pPr>
+            <w:r>
+              <w:rPr>
+                <w:rFonts w:ascii="맑은 고딕" w:hAnsi="맑은 고딕"/>
+                <w:b w:val="0"/>
+                <w:sz w:val="20"/>
+              </w:rPr>
+              <w:t>잔여수명 경보 기준 (슬라이더, 분)</w:t>
+            </w:r>
+          </w:p>
+        </w:tc>
+        <w:tc>
+          <w:tcPr>
+            <w:tcW w:type="dxa" w:w="1417"/>
+            <w:shd w:val="clear" w:color="auto" w:fill="FFFFFF"/>
+            <w:vAlign w:val="center"/>
+          </w:tcPr>
+          <w:p>
+            <w:pPr>
+              <w:jc w:val="center"/>
+            </w:pPr>
+            <w:r>
+              <w:rPr>
+                <w:rFonts w:ascii="맑은 고딕" w:hAnsi="맑은 고딕"/>
+                <w:b w:val="0"/>
+                <w:sz w:val="20"/>
+              </w:rPr>
+              <w:t>60분</w:t>
+            </w:r>
+          </w:p>
+        </w:tc>
+        <w:tc>
+          <w:tcPr>
+            <w:tcW w:type="dxa" w:w="5102"/>
+            <w:shd w:val="clear" w:color="auto" w:fill="FFFFFF"/>
+            <w:vAlign w:val="center"/>
+          </w:tcPr>
+          <w:p>
+            <w:pPr>
+              <w:jc w:val="center"/>
+            </w:pPr>
+            <w:r>
+              <w:rPr>
+                <w:rFonts w:ascii="맑은 고딕" w:hAnsi="맑은 고딕"/>
+                <w:b w:val="0"/>
+                <w:sz w:val="20"/>
+              </w:rPr>
+              <w:t>예측 RUL ≤ 기준이면 긴급 경보, 2배 이내는 주의</w:t>
+            </w:r>
+          </w:p>
+        </w:tc>
+      </w:tr>
+      <w:tr>
+        <w:tc>
+          <w:tcPr>
+            <w:tcW w:type="dxa" w:w="2551"/>
+            <w:shd w:val="clear" w:color="auto" w:fill="F2F2F2"/>
+            <w:vAlign w:val="center"/>
+          </w:tcPr>
+          <w:p>
+            <w:pPr>
+              <w:jc w:val="left"/>
+            </w:pPr>
+            <w:r>
+              <w:rPr>
+                <w:rFonts w:ascii="맑은 고딕" w:hAnsi="맑은 고딕"/>
+                <w:b w:val="0"/>
+                <w:sz w:val="20"/>
+              </w:rPr>
+              <w:t>RUL 임계값 변경 이력 (expander)</w:t>
+            </w:r>
+          </w:p>
+        </w:tc>
+        <w:tc>
+          <w:tcPr>
+            <w:tcW w:type="dxa" w:w="1417"/>
+            <w:shd w:val="clear" w:color="auto" w:fill="F2F2F2"/>
+            <w:vAlign w:val="center"/>
+          </w:tcPr>
+          <w:p>
+            <w:pPr>
+              <w:jc w:val="center"/>
+            </w:pPr>
+            <w:r>
+              <w:rPr>
+                <w:rFonts w:ascii="맑은 고딕" w:hAnsi="맑은 고딕"/>
+                <w:b w:val="0"/>
+                <w:sz w:val="20"/>
+              </w:rPr>
+              <w:t>—</w:t>
+            </w:r>
+          </w:p>
+        </w:tc>
+        <w:tc>
+          <w:tcPr>
+            <w:tcW w:type="dxa" w:w="5102"/>
+            <w:shd w:val="clear" w:color="auto" w:fill="F2F2F2"/>
+            <w:vAlign w:val="center"/>
+          </w:tcPr>
+          <w:p>
+            <w:pPr>
+              <w:jc w:val="center"/>
+            </w:pPr>
+            <w:r>
+              <w:rPr>
+                <w:rFonts w:ascii="맑은 고딕" w:hAnsi="맑은 고딕"/>
+                <w:b w:val="0"/>
+                <w:sz w:val="20"/>
+              </w:rPr>
+              <w:t>경보 기준 변경 시 이력 자동 기록</w:t>
+            </w:r>
+          </w:p>
+        </w:tc>
+      </w:tr>
+      <w:tr>
+        <w:tc>
+          <w:tcPr>
+            <w:tcW w:type="dxa" w:w="2551"/>
+            <w:shd w:val="clear" w:color="auto" w:fill="FFFFFF"/>
+            <w:vAlign w:val="center"/>
+          </w:tcPr>
+          <w:p>
+            <w:pPr>
+              <w:jc w:val="left"/>
+            </w:pPr>
+            <w:r>
+              <w:rPr>
+                <w:rFonts w:ascii="맑은 고딕" w:hAnsi="맑은 고딕"/>
+                <w:b w:val="0"/>
+                <w:sz w:val="20"/>
+              </w:rPr>
+              <w:t>실행 순서 안내</w:t>
+            </w:r>
+          </w:p>
+        </w:tc>
+        <w:tc>
+          <w:tcPr>
+            <w:tcW w:type="dxa" w:w="1417"/>
+            <w:shd w:val="clear" w:color="auto" w:fill="FFFFFF"/>
+            <w:vAlign w:val="center"/>
+          </w:tcPr>
+          <w:p>
+            <w:pPr>
+              <w:jc w:val="center"/>
+            </w:pPr>
+            <w:r>
+              <w:rPr>
+                <w:rFonts w:ascii="맑은 고딕" w:hAnsi="맑은 고딕"/>
+                <w:b w:val="0"/>
+                <w:sz w:val="20"/>
+              </w:rPr>
+              <w:t>—</w:t>
+            </w:r>
+          </w:p>
+        </w:tc>
+        <w:tc>
+          <w:tcPr>
+            <w:tcW w:type="dxa" w:w="5102"/>
+            <w:shd w:val="clear" w:color="auto" w:fill="FFFFFF"/>
+            <w:vAlign w:val="center"/>
+          </w:tcPr>
+          <w:p>
+            <w:pPr>
+              <w:jc w:val="center"/>
+            </w:pPr>
+            <w:r>
+              <w:rPr>
+                <w:rFonts w:ascii="맑은 고딕" w:hAnsi="맑은 고딕"/>
+                <w:b w:val="0"/>
+                <w:sz w:val="20"/>
+              </w:rPr>
+              <w:t>femto_preprocess → femto_ml → femto_dl_rul 실행 순서 안내</w:t>
+            </w:r>
+          </w:p>
+        </w:tc>
+      </w:tr>
+    </w:tbl>
+    <w:p>
+      <w:pPr>
+        <w:spacing w:before="160" w:after="60"/>
+      </w:pPr>
+      <w:r>
+        <w:rPr>
+          <w:rFonts w:ascii="맑은 고딕" w:hAnsi="맑은 고딕"/>
+          <w:b/>
+          <w:color w:val="2E75B6"/>
+          <w:sz w:val="22"/>
+        </w:rPr>
+        <w:t>5.3 탭별 주요 기능</w:t>
       </w:r>
     </w:p>
     <w:p>
@@ -9875,7 +10288,7 @@
           <w:color w:val="2E75B6"/>
           <w:sz w:val="20"/>
         </w:rPr>
-        <w:t>[탭 1] 데이터 탐색 — FEMTO-ST 데이터 시각화</w:t>
+        <w:t>[탭 1] 📊 데이터 탐색 — FEMTO-ST 데이터 탐색</w:t>
       </w:r>
     </w:p>
     <w:p>
@@ -9889,7 +10302,7 @@
           <w:b w:val="0"/>
           <w:sz w:val="20"/>
         </w:rPr>
-        <w:t>• 베어링별 RUL 공선 및 진동 트렌드 시각화</w:t>
+        <w:t>• 4개 핵심 메트릭: 총 베어링 수 / 총 스냅샷 수 / 열화 비율 / 데이터 모드</w:t>
       </w:r>
     </w:p>
     <w:p>
@@ -9903,7 +10316,7 @@
           <w:b w:val="0"/>
           <w:sz w:val="20"/>
         </w:rPr>
-        <w:t>• 피처 상관 Heatmap 및 VIF 분석 결과</w:t>
+        <w:t>• 베어링별 h_rms 진동 추이 (Plotly 인터랙티브 차트, 베어링별 열화 임계값 표시)</w:t>
       </w:r>
     </w:p>
     <w:p>
@@ -9917,7 +10330,21 @@
           <w:b w:val="0"/>
           <w:sz w:val="20"/>
         </w:rPr>
-        <w:t>• 정상/열화 구간 분포 비교 (Box Plot)</w:t>
+        <w:t>• 열화 라벨 분포 파이차트 (정상 vs 열화)</w:t>
+      </w:r>
+    </w:p>
+    <w:p>
+      <w:pPr>
+        <w:spacing w:before="20" w:after="40"/>
+        <w:ind w:left="283"/>
+      </w:pPr>
+      <w:r>
+        <w:rPr>
+          <w:rFonts w:ascii="맑은 고딕" w:hAnsi="맑은 고딕"/>
+          <w:b w:val="0"/>
+          <w:sz w:val="20"/>
+        </w:rPr>
+        <w:t>• 피처 분포 박스플롯 (피처 선택 selectbox, 베어링별 분포 비교)</w:t>
       </w:r>
     </w:p>
     <w:p>
@@ -9931,7 +10358,7 @@
           <w:color w:val="2E75B6"/>
           <w:sz w:val="20"/>
         </w:rPr>
-        <w:t>[탭 2] ML 성능 — RF 베이스라인 평가</w:t>
+        <w:t>[탭 2] 🤖 ML 성능 — ML 열화 분류 성능</w:t>
       </w:r>
     </w:p>
     <w:p>
@@ -9945,7 +10372,7 @@
           <w:b w:val="0"/>
           <w:sz w:val="20"/>
         </w:rPr>
-        <w:t>• RF 베이스라인 RMSE/MAE 결과 표시</w:t>
+        <w:t>• VIF 다중공선성 분석 표 (양호=녹색 &lt;5 / 주의=노랑 5~10 / 심각=빨강 ≥10)</w:t>
       </w:r>
     </w:p>
     <w:p>
@@ -9959,7 +10386,7 @@
           <w:b w:val="0"/>
           <w:sz w:val="20"/>
         </w:rPr>
-        <w:t>• ML 예측 vs 실제 RUL 산점도</w:t>
+        <w:t>• 모델 3종 성능 비교표 (Accuracy / Precision / Recall / F1 / ROC-AUC)</w:t>
       </w:r>
     </w:p>
     <w:p>
@@ -9973,7 +10400,21 @@
           <w:b w:val="0"/>
           <w:sz w:val="20"/>
         </w:rPr>
-        <w:t>• 피처 중요도 수평 막대 차트</w:t>
+        <w:t>• Feature Importance 가로 막대 차트 (최고 모델 기준)</w:t>
+      </w:r>
+    </w:p>
+    <w:p>
+      <w:pPr>
+        <w:spacing w:before="20" w:after="40"/>
+        <w:ind w:left="283"/>
+      </w:pPr>
+      <w:r>
+        <w:rPr>
+          <w:rFonts w:ascii="맑은 고딕" w:hAnsi="맑은 고딕"/>
+          <w:b w:val="0"/>
+          <w:sz w:val="20"/>
+        </w:rPr>
+        <w:t>• 최고 모델 Confusion Matrix (학습 시 threshold=0.5 기준)</w:t>
       </w:r>
     </w:p>
     <w:p>
@@ -9987,7 +10428,7 @@
           <w:color w:val="2E75B6"/>
           <w:sz w:val="20"/>
         </w:rPr>
-        <w:t>[탭 3] DL RUL 예측 — GRU v2 예측 시스템</w:t>
+        <w:t>[탭 3] 🔮 DL RUL 예측 — DL 잔여수명(RUL) 예측</w:t>
       </w:r>
     </w:p>
     <w:p>
@@ -10001,7 +10442,7 @@
           <w:b w:val="0"/>
           <w:sz w:val="20"/>
         </w:rPr>
-        <w:t>• 실시간 RUL 예측 (사이드바 슬라이더 입력)</w:t>
+        <w:t>• ML(RF) vs DL(LSTM) RUL 예측 성능 비교표 (RMSE / MAE 분 단위)</w:t>
       </w:r>
     </w:p>
     <w:p>
@@ -10015,7 +10456,7 @@
           <w:b w:val="0"/>
           <w:sz w:val="20"/>
         </w:rPr>
-        <w:t>• RUL 경보 등급: 정상(녹색)/주의(노란색)/위험(주황색)/긴급(빨간색)</w:t>
+        <w:t>• LSTM 학습 곡선 — Fold 1 대표 (Train Loss / Val Loss, GroupKFold 5-Fold 중 1번)</w:t>
       </w:r>
     </w:p>
     <w:p>
@@ -10029,7 +10470,7 @@
           <w:b w:val="0"/>
           <w:sz w:val="20"/>
         </w:rPr>
-        <w:t>• DL vs RF 예측 비교 시각화</w:t>
+        <w:t>• 베어링별 실제 RUL 추이 (시간축, RUL 경보 기준선 표시)</w:t>
       </w:r>
     </w:p>
     <w:p>
@@ -10043,7 +10484,7 @@
           <w:color w:val="2E75B6"/>
           <w:sz w:val="20"/>
         </w:rPr>
-        <w:t>[탭 4] 통합 진단 (실시간) — ML+DL 융합 진단</w:t>
+        <w:t>[탭 4] 🏭 통합 진단 (실시간) — 실시간 베어링 상태 평가</w:t>
       </w:r>
     </w:p>
     <w:p>
@@ -10057,7 +10498,7 @@
           <w:b w:val="0"/>
           <w:sz w:val="20"/>
         </w:rPr>
-        <w:t>• ML 열화 분류 + DL RUL 회귀 통합 결과</w:t>
+        <w:t>• 진동 특성 직접 입력 슬라이더 9개 (h_rms·h_kurt·h_skew·h_crest / v_rms·v_kurt·v_skew·v_crest / 온도)</w:t>
       </w:r>
     </w:p>
     <w:p>
@@ -10071,7 +10512,7 @@
           <w:b w:val="0"/>
           <w:sz w:val="20"/>
         </w:rPr>
-        <w:t>• 판정 임계값 실시간 조정 (사이드바 슬라이더)</w:t>
+        <w:t>• 「진단하기」버튼 클릭 → ML 열화 판정(열화 확률 %, 임계값 비교 판정) + DL 잔여수명 예측(분, LSTM 우선·RF 폴백)</w:t>
       </w:r>
     </w:p>
     <w:p>
@@ -10085,7 +10526,21 @@
           <w:b w:val="0"/>
           <w:sz w:val="20"/>
         </w:rPr>
-        <w:t>• 임계값 변경 이력 기록</w:t>
+        <w:t>• RUL 경보 등급: 정상(녹색) / 주의(주황, 기준의 2배 이내) / 긴급(빨강, 기준 이하)</w:t>
+      </w:r>
+    </w:p>
+    <w:p>
+      <w:pPr>
+        <w:spacing w:before="20" w:after="40"/>
+        <w:ind w:left="283"/>
+      </w:pPr>
+      <w:r>
+        <w:rPr>
+          <w:rFonts w:ascii="맑은 고딕" w:hAnsi="맑은 고딕"/>
+          <w:b w:val="0"/>
+          <w:sz w:val="20"/>
+        </w:rPr>
+        <w:t>• 입력값 요약 expander (전체 피처 값 확인)</w:t>
       </w:r>
     </w:p>
     <w:p>
@@ -10099,7 +10554,7 @@
           <w:color w:val="2E75B6"/>
           <w:sz w:val="20"/>
         </w:rPr>
-        <w:t>[탭 5] DL 아키텍처 비교 (5종) — 성능 비교 대시보드</w:t>
+        <w:t>[탭 5] 🔬 DL 아키텍처 비교 (5종) — 아키텍처 성능 벤치마크</w:t>
       </w:r>
     </w:p>
     <w:p>
@@ -10113,7 +10568,7 @@
           <w:b w:val="0"/>
           <w:sz w:val="20"/>
         </w:rPr>
-        <w:t>• GRU/LSTM/BiLSTM/1D-CNN/CNN-LSTM OOS RMSE 바 차트</w:t>
+        <w:t>• 5종 아키텍처 성능 비교표 (GRU·LSTM·BiLSTM·1D-CNN·CNN-LSTM, OOS RMSE 최솟값 녹색 강조)</w:t>
       </w:r>
     </w:p>
     <w:p>
@@ -10127,7 +10582,7 @@
           <w:b w:val="0"/>
           <w:sz w:val="20"/>
         </w:rPr>
-        <w:t>• 하이퍼파라미터 그리드서치 27조합 결과 테이블</w:t>
+        <w:t>• EarlyStopping 효과 분석표 (실행 Epoch / 절약 Epoch / 조기 종료 여부)</w:t>
       </w:r>
     </w:p>
     <w:p>
@@ -10141,7 +10596,21 @@
           <w:b w:val="0"/>
           <w:sz w:val="20"/>
         </w:rPr>
-        <w:t>• GRU v1 vs v2 (BN+LN) 개선 효과 시각화</w:t>
+        <w:t>• 최적 모델 학습 곡선 PNG (Train·Val Loss, EarlyStopping 발동 지점 확인)</w:t>
+      </w:r>
+    </w:p>
+    <w:p>
+      <w:pPr>
+        <w:spacing w:before="20" w:after="40"/>
+        <w:ind w:left="283"/>
+      </w:pPr>
+      <w:r>
+        <w:rPr>
+          <w:rFonts w:ascii="맑은 고딕" w:hAnsi="맑은 고딕"/>
+          <w:b w:val="0"/>
+          <w:sz w:val="20"/>
+        </w:rPr>
+        <w:t>• 저장 모델 로드 후 OOS 예측 결과 PNG (실제 RUL vs 예측 RUL)</w:t>
       </w:r>
     </w:p>
     <w:p>
@@ -11304,6 +11773,275 @@
       </w:r>
     </w:p>
     <w:p>
+      <w:pPr>
+        <w:spacing w:before="160" w:after="60"/>
+      </w:pPr>
+      <w:r>
+        <w:rPr>
+          <w:rFonts w:ascii="맑은 고딕" w:hAnsi="맑은 고딕"/>
+          <w:b/>
+          <w:color w:val="2E75B6"/>
+          <w:sz w:val="22"/>
+        </w:rPr>
+        <w:t>6.5 SHAP 미적용 이유</w:t>
+      </w:r>
+    </w:p>
+    <w:p>
+      <w:pPr>
+        <w:spacing w:before="0" w:after="120"/>
+        <w:jc w:val="left"/>
+      </w:pPr>
+      <w:r>
+        <w:rPr>
+          <w:rFonts w:ascii="맑은 고딕" w:hAnsi="맑은 고딕"/>
+          <w:b w:val="0"/>
+          <w:sz w:val="20"/>
+        </w:rPr>
+        <w:t>이 과제에서 GRU/LSTM 등 DL 모델에 SHAP(SHapley Additive exPlanations) 기반 피처 기여도 분석을 적용하지 않은 이유는 아래 네 가지입니다.</w:t>
+      </w:r>
+    </w:p>
+    <w:tbl>
+      <w:tblPr>
+        <w:tblStyle w:val="TableGrid"/>
+        <w:tblW w:type="auto" w:w="0"/>
+        <w:tblLook w:firstColumn="1" w:firstRow="1" w:lastColumn="0" w:lastRow="0" w:noHBand="0" w:noVBand="1" w:val="04A0"/>
+      </w:tblPr>
+      <w:tblGrid>
+        <w:gridCol w:w="4703"/>
+        <w:gridCol w:w="4703"/>
+      </w:tblGrid>
+      <w:tr>
+        <w:tc>
+          <w:tcPr>
+            <w:tcW w:type="dxa" w:w="2268"/>
+            <w:shd w:val="clear" w:color="auto" w:fill="1F4E79"/>
+            <w:vAlign w:val="center"/>
+          </w:tcPr>
+          <w:p>
+            <w:pPr>
+              <w:jc w:val="center"/>
+            </w:pPr>
+            <w:r>
+              <w:rPr>
+                <w:rFonts w:ascii="맑은 고딕" w:hAnsi="맑은 고딕"/>
+                <w:b/>
+                <w:color w:val="FFFFFF"/>
+                <w:sz w:val="20"/>
+              </w:rPr>
+              <w:t>이유</w:t>
+            </w:r>
+          </w:p>
+        </w:tc>
+        <w:tc>
+          <w:tcPr>
+            <w:tcW w:type="dxa" w:w="6803"/>
+            <w:shd w:val="clear" w:color="auto" w:fill="1F4E79"/>
+            <w:vAlign w:val="center"/>
+          </w:tcPr>
+          <w:p>
+            <w:pPr>
+              <w:jc w:val="center"/>
+            </w:pPr>
+            <w:r>
+              <w:rPr>
+                <w:rFonts w:ascii="맑은 고딕" w:hAnsi="맑은 고딕"/>
+                <w:b/>
+                <w:color w:val="FFFFFF"/>
+                <w:sz w:val="20"/>
+              </w:rPr>
+              <w:t>상세 설명</w:t>
+            </w:r>
+          </w:p>
+        </w:tc>
+      </w:tr>
+      <w:tr>
+        <w:tc>
+          <w:tcPr>
+            <w:tcW w:type="dxa" w:w="2268"/>
+            <w:shd w:val="clear" w:color="auto" w:fill="FFFFFF"/>
+            <w:vAlign w:val="center"/>
+          </w:tcPr>
+          <w:p>
+            <w:pPr>
+              <w:jc w:val="left"/>
+            </w:pPr>
+            <w:r>
+              <w:rPr>
+                <w:rFonts w:ascii="맑은 고딕" w:hAnsi="맑은 고딕"/>
+                <w:b w:val="0"/>
+                <w:sz w:val="20"/>
+              </w:rPr>
+              <w:t>① 과제 범위 밖 (Phase 2 예약)</w:t>
+            </w:r>
+          </w:p>
+        </w:tc>
+        <w:tc>
+          <w:tcPr>
+            <w:tcW w:type="dxa" w:w="6803"/>
+            <w:shd w:val="clear" w:color="auto" w:fill="FFFFFF"/>
+            <w:vAlign w:val="center"/>
+          </w:tcPr>
+          <w:p>
+            <w:pPr>
+              <w:jc w:val="center"/>
+            </w:pPr>
+            <w:r>
+              <w:rPr>
+                <w:rFonts w:ascii="맑은 고딕" w:hAnsi="맑은 고딕"/>
+                <w:b w:val="0"/>
+                <w:sz w:val="20"/>
+              </w:rPr>
+              <w:t>이번 과제 목표는 5종 아키텍처 비교 → 하이퍼파라미터 그리드서치 → BN+LN 정규화 효과 검증 → Streamlit 배포까지로 한정. SHAP 기반 설명가능 AI(XAI)는 6.2절 로드맵의 Phase 2 항목으로 분류.</w:t>
+            </w:r>
+          </w:p>
+        </w:tc>
+      </w:tr>
+      <w:tr>
+        <w:tc>
+          <w:tcPr>
+            <w:tcW w:type="dxa" w:w="2268"/>
+            <w:shd w:val="clear" w:color="auto" w:fill="F2F2F2"/>
+            <w:vAlign w:val="center"/>
+          </w:tcPr>
+          <w:p>
+            <w:pPr>
+              <w:jc w:val="left"/>
+            </w:pPr>
+            <w:r>
+              <w:rPr>
+                <w:rFonts w:ascii="맑은 고딕" w:hAnsi="맑은 고딕"/>
+                <w:b w:val="0"/>
+                <w:sz w:val="20"/>
+              </w:rPr>
+              <w:t>② GPU 없이 계산 비용 과다</w:t>
+              <w:br/>
+              <w:t>(핵심 이유)</w:t>
+            </w:r>
+          </w:p>
+        </w:tc>
+        <w:tc>
+          <w:tcPr>
+            <w:tcW w:type="dxa" w:w="6803"/>
+            <w:shd w:val="clear" w:color="auto" w:fill="F2F2F2"/>
+            <w:vAlign w:val="center"/>
+          </w:tcPr>
+          <w:p>
+            <w:pPr>
+              <w:jc w:val="center"/>
+            </w:pPr>
+            <w:r>
+              <w:rPr>
+                <w:rFonts w:ascii="맑은 고딕" w:hAnsi="맑은 고딕"/>
+                <w:b w:val="0"/>
+                <w:sz w:val="20"/>
+              </w:rPr>
+              <w:t>LSTM/GRU 입력 차원: 20타임스텝 × 12피처 = 240차원</w:t>
+              <w:br/>
+              <w:t>KernelExplainer 샘플당 평가 횟수: 2×240+2048 = 2,528회 모델 forward pass</w:t>
+              <w:br/>
+              <w:t>학습 시퀀스 N≈4,000개 기준 총 평가 횟수: 4,000 × 2,528 = 약 1,011만 회</w:t>
+              <w:br/>
+              <w:t xml:space="preserve">  - CPU(Intel i7, GRU 1-layer): pass당 ~5ms → 총 약 14시간 소요</w:t>
+              <w:br/>
+              <w:t xml:space="preserve">  - GPU(RTX 3080) 있을 경우: pass당 ~0.2ms → 약 34분 (35× 단축)</w:t>
+              <w:br/>
+              <w:t>→ GPU H/W 미지원 환경에서 실용적이지 않음</w:t>
+            </w:r>
+          </w:p>
+        </w:tc>
+      </w:tr>
+      <w:tr>
+        <w:tc>
+          <w:tcPr>
+            <w:tcW w:type="dxa" w:w="2268"/>
+            <w:shd w:val="clear" w:color="auto" w:fill="FFFFFF"/>
+            <w:vAlign w:val="center"/>
+          </w:tcPr>
+          <w:p>
+            <w:pPr>
+              <w:jc w:val="left"/>
+            </w:pPr>
+            <w:r>
+              <w:rPr>
+                <w:rFonts w:ascii="맑은 고딕" w:hAnsi="맑은 고딕"/>
+                <w:b w:val="0"/>
+                <w:sz w:val="20"/>
+              </w:rPr>
+              <w:t>③ VIF로 피처 선택 이미 완료</w:t>
+            </w:r>
+          </w:p>
+        </w:tc>
+        <w:tc>
+          <w:tcPr>
+            <w:tcW w:type="dxa" w:w="6803"/>
+            <w:shd w:val="clear" w:color="auto" w:fill="FFFFFF"/>
+            <w:vAlign w:val="center"/>
+          </w:tcPr>
+          <w:p>
+            <w:pPr>
+              <w:jc w:val="center"/>
+            </w:pPr>
+            <w:r>
+              <w:rPr>
+                <w:rFonts w:ascii="맑은 고딕" w:hAnsi="맑은 고딕"/>
+                <w:b w:val="0"/>
+                <w:sz w:val="20"/>
+              </w:rPr>
+              <w:t>학습 전 단계에서 VIF(분산팽창지수) 분석으로 12개 피처 모두 VIF &lt; 10 확인 → 전체 선택.</w:t>
+              <w:br/>
+              <w:t>다중공선성 제거 및 피처 중요도는 ML 단계(RandomForest Feature Importance)로 가시화 완료.</w:t>
+              <w:br/>
+              <w:t>SHAP이 추가로 제공할 타임스텝별 기여도 분석은 이번 평가 지표(RMSE/MAE)에 미포함.</w:t>
+            </w:r>
+          </w:p>
+        </w:tc>
+      </w:tr>
+      <w:tr>
+        <w:tc>
+          <w:tcPr>
+            <w:tcW w:type="dxa" w:w="2268"/>
+            <w:shd w:val="clear" w:color="auto" w:fill="F2F2F2"/>
+            <w:vAlign w:val="center"/>
+          </w:tcPr>
+          <w:p>
+            <w:pPr>
+              <w:jc w:val="left"/>
+            </w:pPr>
+            <w:r>
+              <w:rPr>
+                <w:rFonts w:ascii="맑은 고딕" w:hAnsi="맑은 고딕"/>
+                <w:b w:val="0"/>
+                <w:sz w:val="20"/>
+              </w:rPr>
+              <w:t>④ DeepExplainer 버전 의존성</w:t>
+            </w:r>
+          </w:p>
+        </w:tc>
+        <w:tc>
+          <w:tcPr>
+            <w:tcW w:type="dxa" w:w="6803"/>
+            <w:shd w:val="clear" w:color="auto" w:fill="F2F2F2"/>
+            <w:vAlign w:val="center"/>
+          </w:tcPr>
+          <w:p>
+            <w:pPr>
+              <w:jc w:val="center"/>
+            </w:pPr>
+            <w:r>
+              <w:rPr>
+                <w:rFonts w:ascii="맑은 고딕" w:hAnsi="맑은 고딕"/>
+                <w:b w:val="0"/>
+                <w:sz w:val="20"/>
+              </w:rPr>
+              <w:t>시퀀스 모델에 더 적합한 shap.DeepExplainer는 TensorFlow/Keras 버전 호환 문제가 있어 Keras 3.x + TF 2.16 환경에서 안정적으로 동작하지 않음.</w:t>
+              <w:br/>
+              <w:t>KernelExplainer로 대체 시 ②의 계산 비용 문제가 발생.</w:t>
+            </w:r>
+          </w:p>
+        </w:tc>
+      </w:tr>
+    </w:tbl>
+    <w:p>
       <w:r>
         <w:br w:type="page"/>
       </w:r>
@@ -16262,6 +17000,3672 @@
         </w:tc>
       </w:tr>
     </w:tbl>
+    <w:p>
+      <w:r>
+        <w:br w:type="page"/>
+      </w:r>
+    </w:p>
+    <w:p>
+      <w:pPr>
+        <w:spacing w:before="200" w:after="80"/>
+      </w:pPr>
+      <w:r>
+        <w:rPr>
+          <w:rFonts w:ascii="맑은 고딕" w:hAnsi="맑은 고딕"/>
+          <w:b/>
+          <w:color w:val="1F4E79"/>
+          <w:sz w:val="24"/>
+        </w:rPr>
+        <w:t>부록 C. DL 이진 분류 모델 결과 (CNN+LSTM)</w:t>
+      </w:r>
+    </w:p>
+    <w:p>
+      <w:pPr>
+        <w:spacing w:before="0" w:after="120"/>
+        <w:jc w:val="left"/>
+      </w:pPr>
+      <w:r>
+        <w:rPr>
+          <w:rFonts w:ascii="맑은 고딕" w:hAnsi="맑은 고딕"/>
+          <w:b w:val="0"/>
+          <w:sz w:val="20"/>
+        </w:rPr>
+        <w:t>DL 프로젝트의 첫 단계로 CNN+LSTM 이진 분류기(정상=0 / 고장=1)를 학습하였습니다. 아래는 Validation Set(179 samples) 기준 Classification Report와 학습 곡선 해석입니다.</w:t>
+      </w:r>
+    </w:p>
+    <w:p>
+      <w:pPr>
+        <w:spacing w:before="160" w:after="60"/>
+      </w:pPr>
+      <w:r>
+        <w:rPr>
+          <w:rFonts w:ascii="맑은 고딕" w:hAnsi="맑은 고딕"/>
+          <w:b/>
+          <w:color w:val="2E75B6"/>
+          <w:sz w:val="22"/>
+        </w:rPr>
+        <w:t>C.1 Classification Report (Validation Set, Threshold = 0.50)</w:t>
+      </w:r>
+    </w:p>
+    <w:tbl>
+      <w:tblPr>
+        <w:tblStyle w:val="TableGrid"/>
+        <w:tblW w:type="auto" w:w="0"/>
+        <w:tblLook w:firstColumn="1" w:firstRow="1" w:lastColumn="0" w:lastRow="0" w:noHBand="0" w:noVBand="1" w:val="04A0"/>
+      </w:tblPr>
+      <w:tblGrid>
+        <w:gridCol w:w="1881"/>
+        <w:gridCol w:w="1881"/>
+        <w:gridCol w:w="1881"/>
+        <w:gridCol w:w="1881"/>
+        <w:gridCol w:w="1881"/>
+      </w:tblGrid>
+      <w:tr>
+        <w:tc>
+          <w:tcPr>
+            <w:tcW w:type="dxa" w:w="2551"/>
+            <w:shd w:val="clear" w:color="auto" w:fill="1F4E79"/>
+            <w:vAlign w:val="center"/>
+          </w:tcPr>
+          <w:p>
+            <w:pPr>
+              <w:jc w:val="center"/>
+            </w:pPr>
+            <w:r>
+              <w:rPr>
+                <w:rFonts w:ascii="맑은 고딕" w:hAnsi="맑은 고딕"/>
+                <w:b/>
+                <w:color w:val="FFFFFF"/>
+                <w:sz w:val="20"/>
+              </w:rPr>
+              <w:t>클래스</w:t>
+            </w:r>
+          </w:p>
+        </w:tc>
+        <w:tc>
+          <w:tcPr>
+            <w:tcW w:type="dxa" w:w="1417"/>
+            <w:shd w:val="clear" w:color="auto" w:fill="1F4E79"/>
+            <w:vAlign w:val="center"/>
+          </w:tcPr>
+          <w:p>
+            <w:pPr>
+              <w:jc w:val="center"/>
+            </w:pPr>
+            <w:r>
+              <w:rPr>
+                <w:rFonts w:ascii="맑은 고딕" w:hAnsi="맑은 고딕"/>
+                <w:b/>
+                <w:color w:val="FFFFFF"/>
+                <w:sz w:val="20"/>
+              </w:rPr>
+              <w:t>Precision</w:t>
+            </w:r>
+          </w:p>
+        </w:tc>
+        <w:tc>
+          <w:tcPr>
+            <w:tcW w:type="dxa" w:w="1701"/>
+            <w:shd w:val="clear" w:color="auto" w:fill="1F4E79"/>
+            <w:vAlign w:val="center"/>
+          </w:tcPr>
+          <w:p>
+            <w:pPr>
+              <w:jc w:val="center"/>
+            </w:pPr>
+            <w:r>
+              <w:rPr>
+                <w:rFonts w:ascii="맑은 고딕" w:hAnsi="맑은 고딕"/>
+                <w:b/>
+                <w:color w:val="FFFFFF"/>
+                <w:sz w:val="20"/>
+              </w:rPr>
+              <w:t>Recall (TPR)</w:t>
+            </w:r>
+          </w:p>
+        </w:tc>
+        <w:tc>
+          <w:tcPr>
+            <w:tcW w:type="dxa" w:w="1417"/>
+            <w:shd w:val="clear" w:color="auto" w:fill="1F4E79"/>
+            <w:vAlign w:val="center"/>
+          </w:tcPr>
+          <w:p>
+            <w:pPr>
+              <w:jc w:val="center"/>
+            </w:pPr>
+            <w:r>
+              <w:rPr>
+                <w:rFonts w:ascii="맑은 고딕" w:hAnsi="맑은 고딕"/>
+                <w:b/>
+                <w:color w:val="FFFFFF"/>
+                <w:sz w:val="20"/>
+              </w:rPr>
+              <w:t>F1-Score</w:t>
+            </w:r>
+          </w:p>
+        </w:tc>
+        <w:tc>
+          <w:tcPr>
+            <w:tcW w:type="dxa" w:w="1417"/>
+            <w:shd w:val="clear" w:color="auto" w:fill="1F4E79"/>
+            <w:vAlign w:val="center"/>
+          </w:tcPr>
+          <w:p>
+            <w:pPr>
+              <w:jc w:val="center"/>
+            </w:pPr>
+            <w:r>
+              <w:rPr>
+                <w:rFonts w:ascii="맑은 고딕" w:hAnsi="맑은 고딕"/>
+                <w:b/>
+                <w:color w:val="FFFFFF"/>
+                <w:sz w:val="20"/>
+              </w:rPr>
+              <w:t>Support</w:t>
+            </w:r>
+          </w:p>
+        </w:tc>
+      </w:tr>
+      <w:tr>
+        <w:tc>
+          <w:tcPr>
+            <w:tcW w:type="dxa" w:w="2551"/>
+            <w:shd w:val="clear" w:color="auto" w:fill="FFFFFF"/>
+            <w:vAlign w:val="center"/>
+          </w:tcPr>
+          <w:p>
+            <w:pPr>
+              <w:jc w:val="left"/>
+            </w:pPr>
+            <w:r>
+              <w:rPr>
+                <w:rFonts w:ascii="맑은 고딕" w:hAnsi="맑은 고딕"/>
+                <w:b w:val="0"/>
+                <w:sz w:val="20"/>
+              </w:rPr>
+              <w:t>0 — Normal (정상)</w:t>
+            </w:r>
+          </w:p>
+        </w:tc>
+        <w:tc>
+          <w:tcPr>
+            <w:tcW w:type="dxa" w:w="1417"/>
+            <w:shd w:val="clear" w:color="auto" w:fill="FFFFFF"/>
+            <w:vAlign w:val="center"/>
+          </w:tcPr>
+          <w:p>
+            <w:pPr>
+              <w:jc w:val="center"/>
+            </w:pPr>
+            <w:r>
+              <w:rPr>
+                <w:rFonts w:ascii="맑은 고딕" w:hAnsi="맑은 고딕"/>
+                <w:b w:val="0"/>
+                <w:sz w:val="20"/>
+              </w:rPr>
+              <w:t>0.79</w:t>
+            </w:r>
+          </w:p>
+        </w:tc>
+        <w:tc>
+          <w:tcPr>
+            <w:tcW w:type="dxa" w:w="1701"/>
+            <w:shd w:val="clear" w:color="auto" w:fill="FFFFFF"/>
+            <w:vAlign w:val="center"/>
+          </w:tcPr>
+          <w:p>
+            <w:pPr>
+              <w:jc w:val="center"/>
+            </w:pPr>
+            <w:r>
+              <w:rPr>
+                <w:rFonts w:ascii="맑은 고딕" w:hAnsi="맑은 고딕"/>
+                <w:b w:val="0"/>
+                <w:sz w:val="20"/>
+              </w:rPr>
+              <w:t>0.89</w:t>
+            </w:r>
+          </w:p>
+        </w:tc>
+        <w:tc>
+          <w:tcPr>
+            <w:tcW w:type="dxa" w:w="1417"/>
+            <w:shd w:val="clear" w:color="auto" w:fill="FFFFFF"/>
+            <w:vAlign w:val="center"/>
+          </w:tcPr>
+          <w:p>
+            <w:pPr>
+              <w:jc w:val="center"/>
+            </w:pPr>
+            <w:r>
+              <w:rPr>
+                <w:rFonts w:ascii="맑은 고딕" w:hAnsi="맑은 고딕"/>
+                <w:b w:val="0"/>
+                <w:sz w:val="20"/>
+              </w:rPr>
+              <w:t>0.84</w:t>
+            </w:r>
+          </w:p>
+        </w:tc>
+        <w:tc>
+          <w:tcPr>
+            <w:tcW w:type="dxa" w:w="1417"/>
+            <w:shd w:val="clear" w:color="auto" w:fill="FFFFFF"/>
+            <w:vAlign w:val="center"/>
+          </w:tcPr>
+          <w:p>
+            <w:pPr>
+              <w:jc w:val="center"/>
+            </w:pPr>
+            <w:r>
+              <w:rPr>
+                <w:rFonts w:ascii="맑은 고딕" w:hAnsi="맑은 고딕"/>
+                <w:b w:val="0"/>
+                <w:sz w:val="20"/>
+              </w:rPr>
+              <w:t>105</w:t>
+            </w:r>
+          </w:p>
+        </w:tc>
+      </w:tr>
+      <w:tr>
+        <w:tc>
+          <w:tcPr>
+            <w:tcW w:type="dxa" w:w="2551"/>
+            <w:shd w:val="clear" w:color="auto" w:fill="F2F2F2"/>
+            <w:vAlign w:val="center"/>
+          </w:tcPr>
+          <w:p>
+            <w:pPr>
+              <w:jc w:val="left"/>
+            </w:pPr>
+            <w:r>
+              <w:rPr>
+                <w:rFonts w:ascii="맑은 고딕" w:hAnsi="맑은 고딕"/>
+                <w:b w:val="0"/>
+                <w:sz w:val="20"/>
+              </w:rPr>
+              <w:t>1 — Failure (고장)</w:t>
+            </w:r>
+          </w:p>
+        </w:tc>
+        <w:tc>
+          <w:tcPr>
+            <w:tcW w:type="dxa" w:w="1417"/>
+            <w:shd w:val="clear" w:color="auto" w:fill="F2F2F2"/>
+            <w:vAlign w:val="center"/>
+          </w:tcPr>
+          <w:p>
+            <w:pPr>
+              <w:jc w:val="center"/>
+            </w:pPr>
+            <w:r>
+              <w:rPr>
+                <w:rFonts w:ascii="맑은 고딕" w:hAnsi="맑은 고딕"/>
+                <w:b w:val="0"/>
+                <w:sz w:val="20"/>
+              </w:rPr>
+              <w:t>0.81</w:t>
+            </w:r>
+          </w:p>
+        </w:tc>
+        <w:tc>
+          <w:tcPr>
+            <w:tcW w:type="dxa" w:w="1701"/>
+            <w:shd w:val="clear" w:color="auto" w:fill="F2F2F2"/>
+            <w:vAlign w:val="center"/>
+          </w:tcPr>
+          <w:p>
+            <w:pPr>
+              <w:jc w:val="center"/>
+            </w:pPr>
+            <w:r>
+              <w:rPr>
+                <w:rFonts w:ascii="맑은 고딕" w:hAnsi="맑은 고딕"/>
+                <w:b w:val="0"/>
+                <w:sz w:val="20"/>
+              </w:rPr>
+              <w:t>0.68</w:t>
+            </w:r>
+          </w:p>
+        </w:tc>
+        <w:tc>
+          <w:tcPr>
+            <w:tcW w:type="dxa" w:w="1417"/>
+            <w:shd w:val="clear" w:color="auto" w:fill="F2F2F2"/>
+            <w:vAlign w:val="center"/>
+          </w:tcPr>
+          <w:p>
+            <w:pPr>
+              <w:jc w:val="center"/>
+            </w:pPr>
+            <w:r>
+              <w:rPr>
+                <w:rFonts w:ascii="맑은 고딕" w:hAnsi="맑은 고딕"/>
+                <w:b w:val="0"/>
+                <w:sz w:val="20"/>
+              </w:rPr>
+              <w:t>0.74</w:t>
+            </w:r>
+          </w:p>
+        </w:tc>
+        <w:tc>
+          <w:tcPr>
+            <w:tcW w:type="dxa" w:w="1417"/>
+            <w:shd w:val="clear" w:color="auto" w:fill="F2F2F2"/>
+            <w:vAlign w:val="center"/>
+          </w:tcPr>
+          <w:p>
+            <w:pPr>
+              <w:jc w:val="center"/>
+            </w:pPr>
+            <w:r>
+              <w:rPr>
+                <w:rFonts w:ascii="맑은 고딕" w:hAnsi="맑은 고딕"/>
+                <w:b w:val="0"/>
+                <w:sz w:val="20"/>
+              </w:rPr>
+              <w:t>74</w:t>
+            </w:r>
+          </w:p>
+        </w:tc>
+      </w:tr>
+      <w:tr>
+        <w:tc>
+          <w:tcPr>
+            <w:tcW w:type="dxa" w:w="2551"/>
+            <w:shd w:val="clear" w:color="auto" w:fill="FFFFFF"/>
+            <w:vAlign w:val="center"/>
+          </w:tcPr>
+          <w:p>
+            <w:pPr>
+              <w:jc w:val="left"/>
+            </w:pPr>
+            <w:r>
+              <w:rPr>
+                <w:rFonts w:ascii="맑은 고딕" w:hAnsi="맑은 고딕"/>
+                <w:b w:val="0"/>
+                <w:sz w:val="20"/>
+              </w:rPr>
+              <w:t>Accuracy</w:t>
+            </w:r>
+          </w:p>
+        </w:tc>
+        <w:tc>
+          <w:tcPr>
+            <w:tcW w:type="dxa" w:w="1417"/>
+            <w:shd w:val="clear" w:color="auto" w:fill="FFFFFF"/>
+            <w:vAlign w:val="center"/>
+          </w:tcPr>
+          <w:p>
+            <w:pPr>
+              <w:jc w:val="center"/>
+            </w:pPr>
+            <w:r>
+              <w:rPr>
+                <w:rFonts w:ascii="맑은 고딕" w:hAnsi="맑은 고딕"/>
+                <w:b w:val="0"/>
+                <w:sz w:val="20"/>
+              </w:rPr>
+            </w:r>
+          </w:p>
+        </w:tc>
+        <w:tc>
+          <w:tcPr>
+            <w:tcW w:type="dxa" w:w="1701"/>
+            <w:shd w:val="clear" w:color="auto" w:fill="FFFFFF"/>
+            <w:vAlign w:val="center"/>
+          </w:tcPr>
+          <w:p>
+            <w:pPr>
+              <w:jc w:val="center"/>
+            </w:pPr>
+            <w:r>
+              <w:rPr>
+                <w:rFonts w:ascii="맑은 고딕" w:hAnsi="맑은 고딕"/>
+                <w:b w:val="0"/>
+                <w:sz w:val="20"/>
+              </w:rPr>
+            </w:r>
+          </w:p>
+        </w:tc>
+        <w:tc>
+          <w:tcPr>
+            <w:tcW w:type="dxa" w:w="1417"/>
+            <w:shd w:val="clear" w:color="auto" w:fill="FFFFFF"/>
+            <w:vAlign w:val="center"/>
+          </w:tcPr>
+          <w:p>
+            <w:pPr>
+              <w:jc w:val="center"/>
+            </w:pPr>
+            <w:r>
+              <w:rPr>
+                <w:rFonts w:ascii="맑은 고딕" w:hAnsi="맑은 고딕"/>
+                <w:b w:val="0"/>
+                <w:sz w:val="20"/>
+              </w:rPr>
+              <w:t>0.80</w:t>
+            </w:r>
+          </w:p>
+        </w:tc>
+        <w:tc>
+          <w:tcPr>
+            <w:tcW w:type="dxa" w:w="1417"/>
+            <w:shd w:val="clear" w:color="auto" w:fill="FFFFFF"/>
+            <w:vAlign w:val="center"/>
+          </w:tcPr>
+          <w:p>
+            <w:pPr>
+              <w:jc w:val="center"/>
+            </w:pPr>
+            <w:r>
+              <w:rPr>
+                <w:rFonts w:ascii="맑은 고딕" w:hAnsi="맑은 고딕"/>
+                <w:b w:val="0"/>
+                <w:sz w:val="20"/>
+              </w:rPr>
+              <w:t>179</w:t>
+            </w:r>
+          </w:p>
+        </w:tc>
+      </w:tr>
+      <w:tr>
+        <w:tc>
+          <w:tcPr>
+            <w:tcW w:type="dxa" w:w="2551"/>
+            <w:shd w:val="clear" w:color="auto" w:fill="F2F2F2"/>
+            <w:vAlign w:val="center"/>
+          </w:tcPr>
+          <w:p>
+            <w:pPr>
+              <w:jc w:val="left"/>
+            </w:pPr>
+            <w:r>
+              <w:rPr>
+                <w:rFonts w:ascii="맑은 고딕" w:hAnsi="맑은 고딕"/>
+                <w:b w:val="0"/>
+                <w:sz w:val="20"/>
+              </w:rPr>
+              <w:t>Macro Avg</w:t>
+            </w:r>
+          </w:p>
+        </w:tc>
+        <w:tc>
+          <w:tcPr>
+            <w:tcW w:type="dxa" w:w="1417"/>
+            <w:shd w:val="clear" w:color="auto" w:fill="F2F2F2"/>
+            <w:vAlign w:val="center"/>
+          </w:tcPr>
+          <w:p>
+            <w:pPr>
+              <w:jc w:val="center"/>
+            </w:pPr>
+            <w:r>
+              <w:rPr>
+                <w:rFonts w:ascii="맑은 고딕" w:hAnsi="맑은 고딕"/>
+                <w:b w:val="0"/>
+                <w:sz w:val="20"/>
+              </w:rPr>
+              <w:t>0.80</w:t>
+            </w:r>
+          </w:p>
+        </w:tc>
+        <w:tc>
+          <w:tcPr>
+            <w:tcW w:type="dxa" w:w="1701"/>
+            <w:shd w:val="clear" w:color="auto" w:fill="F2F2F2"/>
+            <w:vAlign w:val="center"/>
+          </w:tcPr>
+          <w:p>
+            <w:pPr>
+              <w:jc w:val="center"/>
+            </w:pPr>
+            <w:r>
+              <w:rPr>
+                <w:rFonts w:ascii="맑은 고딕" w:hAnsi="맑은 고딕"/>
+                <w:b w:val="0"/>
+                <w:sz w:val="20"/>
+              </w:rPr>
+              <w:t>0.78</w:t>
+            </w:r>
+          </w:p>
+        </w:tc>
+        <w:tc>
+          <w:tcPr>
+            <w:tcW w:type="dxa" w:w="1417"/>
+            <w:shd w:val="clear" w:color="auto" w:fill="F2F2F2"/>
+            <w:vAlign w:val="center"/>
+          </w:tcPr>
+          <w:p>
+            <w:pPr>
+              <w:jc w:val="center"/>
+            </w:pPr>
+            <w:r>
+              <w:rPr>
+                <w:rFonts w:ascii="맑은 고딕" w:hAnsi="맑은 고딕"/>
+                <w:b w:val="0"/>
+                <w:sz w:val="20"/>
+              </w:rPr>
+              <w:t>0.79</w:t>
+            </w:r>
+          </w:p>
+        </w:tc>
+        <w:tc>
+          <w:tcPr>
+            <w:tcW w:type="dxa" w:w="1417"/>
+            <w:shd w:val="clear" w:color="auto" w:fill="F2F2F2"/>
+            <w:vAlign w:val="center"/>
+          </w:tcPr>
+          <w:p>
+            <w:pPr>
+              <w:jc w:val="center"/>
+            </w:pPr>
+            <w:r>
+              <w:rPr>
+                <w:rFonts w:ascii="맑은 고딕" w:hAnsi="맑은 고딕"/>
+                <w:b w:val="0"/>
+                <w:sz w:val="20"/>
+              </w:rPr>
+              <w:t>179</w:t>
+            </w:r>
+          </w:p>
+        </w:tc>
+      </w:tr>
+      <w:tr>
+        <w:tc>
+          <w:tcPr>
+            <w:tcW w:type="dxa" w:w="2551"/>
+            <w:shd w:val="clear" w:color="auto" w:fill="FFFFFF"/>
+            <w:vAlign w:val="center"/>
+          </w:tcPr>
+          <w:p>
+            <w:pPr>
+              <w:jc w:val="left"/>
+            </w:pPr>
+            <w:r>
+              <w:rPr>
+                <w:rFonts w:ascii="맑은 고딕" w:hAnsi="맑은 고딕"/>
+                <w:b w:val="0"/>
+                <w:sz w:val="20"/>
+              </w:rPr>
+              <w:t>Weighted Avg</w:t>
+            </w:r>
+          </w:p>
+        </w:tc>
+        <w:tc>
+          <w:tcPr>
+            <w:tcW w:type="dxa" w:w="1417"/>
+            <w:shd w:val="clear" w:color="auto" w:fill="FFFFFF"/>
+            <w:vAlign w:val="center"/>
+          </w:tcPr>
+          <w:p>
+            <w:pPr>
+              <w:jc w:val="center"/>
+            </w:pPr>
+            <w:r>
+              <w:rPr>
+                <w:rFonts w:ascii="맑은 고딕" w:hAnsi="맑은 고딕"/>
+                <w:b w:val="0"/>
+                <w:sz w:val="20"/>
+              </w:rPr>
+              <w:t>0.80</w:t>
+            </w:r>
+          </w:p>
+        </w:tc>
+        <w:tc>
+          <w:tcPr>
+            <w:tcW w:type="dxa" w:w="1701"/>
+            <w:shd w:val="clear" w:color="auto" w:fill="FFFFFF"/>
+            <w:vAlign w:val="center"/>
+          </w:tcPr>
+          <w:p>
+            <w:pPr>
+              <w:jc w:val="center"/>
+            </w:pPr>
+            <w:r>
+              <w:rPr>
+                <w:rFonts w:ascii="맑은 고딕" w:hAnsi="맑은 고딕"/>
+                <w:b w:val="0"/>
+                <w:sz w:val="20"/>
+              </w:rPr>
+              <w:t>0.80</w:t>
+            </w:r>
+          </w:p>
+        </w:tc>
+        <w:tc>
+          <w:tcPr>
+            <w:tcW w:type="dxa" w:w="1417"/>
+            <w:shd w:val="clear" w:color="auto" w:fill="FFFFFF"/>
+            <w:vAlign w:val="center"/>
+          </w:tcPr>
+          <w:p>
+            <w:pPr>
+              <w:jc w:val="center"/>
+            </w:pPr>
+            <w:r>
+              <w:rPr>
+                <w:rFonts w:ascii="맑은 고딕" w:hAnsi="맑은 고딕"/>
+                <w:b w:val="0"/>
+                <w:sz w:val="20"/>
+              </w:rPr>
+              <w:t>0.80</w:t>
+            </w:r>
+          </w:p>
+        </w:tc>
+        <w:tc>
+          <w:tcPr>
+            <w:tcW w:type="dxa" w:w="1417"/>
+            <w:shd w:val="clear" w:color="auto" w:fill="FFFFFF"/>
+            <w:vAlign w:val="center"/>
+          </w:tcPr>
+          <w:p>
+            <w:pPr>
+              <w:jc w:val="center"/>
+            </w:pPr>
+            <w:r>
+              <w:rPr>
+                <w:rFonts w:ascii="맑은 고딕" w:hAnsi="맑은 고딕"/>
+                <w:b w:val="0"/>
+                <w:sz w:val="20"/>
+              </w:rPr>
+              <w:t>179</w:t>
+            </w:r>
+          </w:p>
+        </w:tc>
+      </w:tr>
+    </w:tbl>
+    <w:p>
+      <w:pPr>
+        <w:spacing w:before="0" w:after="120"/>
+        <w:jc w:val="left"/>
+      </w:pPr>
+      <w:r>
+        <w:rPr>
+          <w:rFonts w:ascii="맑은 고딕" w:hAnsi="맑은 고딕"/>
+          <w:b w:val="0"/>
+          <w:sz w:val="20"/>
+        </w:rPr>
+        <w:t>• Class 1 Recall = 0.68: 고장 74건 중 50건 정확 감지 (24건 미감지 = False Negative)</w:t>
+        <w:br/>
+        <w:t>• Class 0 Recall = 0.89: 정상 105건 중 93건 정확 판별 (12건 오경보 = False Positive)</w:t>
+        <w:br/>
+        <w:t>• 전체 Accuracy 0.80, ROC AUC 0.88 — 랜덤(0.5) 대비 우수한 변별력</w:t>
+      </w:r>
+    </w:p>
+    <w:p>
+      <w:pPr>
+        <w:spacing w:before="160" w:after="60"/>
+      </w:pPr>
+      <w:r>
+        <w:rPr>
+          <w:rFonts w:ascii="맑은 고딕" w:hAnsi="맑은 고딕"/>
+          <w:b/>
+          <w:color w:val="2E75B6"/>
+          <w:sz w:val="22"/>
+        </w:rPr>
+        <w:t>C.2 ROC 커브 및 Threshold 분석 (AUC = 0.88)</w:t>
+      </w:r>
+    </w:p>
+    <w:tbl>
+      <w:tblPr>
+        <w:tblStyle w:val="TableGrid"/>
+        <w:tblW w:type="auto" w:w="0"/>
+        <w:tblLook w:firstColumn="1" w:firstRow="1" w:lastColumn="0" w:lastRow="0" w:noHBand="0" w:noVBand="1" w:val="04A0"/>
+      </w:tblPr>
+      <w:tblGrid>
+        <w:gridCol w:w="4703"/>
+        <w:gridCol w:w="4703"/>
+      </w:tblGrid>
+      <w:tr>
+        <w:tc>
+          <w:tcPr>
+            <w:tcW w:type="dxa" w:w="2835"/>
+            <w:shd w:val="clear" w:color="auto" w:fill="1F4E79"/>
+            <w:vAlign w:val="center"/>
+          </w:tcPr>
+          <w:p>
+            <w:pPr>
+              <w:jc w:val="center"/>
+            </w:pPr>
+            <w:r>
+              <w:rPr>
+                <w:rFonts w:ascii="맑은 고딕" w:hAnsi="맑은 고딕"/>
+                <w:b/>
+                <w:color w:val="FFFFFF"/>
+                <w:sz w:val="20"/>
+              </w:rPr>
+              <w:t>항목</w:t>
+            </w:r>
+          </w:p>
+        </w:tc>
+        <w:tc>
+          <w:tcPr>
+            <w:tcW w:type="dxa" w:w="6236"/>
+            <w:shd w:val="clear" w:color="auto" w:fill="1F4E79"/>
+            <w:vAlign w:val="center"/>
+          </w:tcPr>
+          <w:p>
+            <w:pPr>
+              <w:jc w:val="center"/>
+            </w:pPr>
+            <w:r>
+              <w:rPr>
+                <w:rFonts w:ascii="맑은 고딕" w:hAnsi="맑은 고딕"/>
+                <w:b/>
+                <w:color w:val="FFFFFF"/>
+                <w:sz w:val="20"/>
+              </w:rPr>
+              <w:t>값 / 설명</w:t>
+            </w:r>
+          </w:p>
+        </w:tc>
+      </w:tr>
+      <w:tr>
+        <w:tc>
+          <w:tcPr>
+            <w:tcW w:type="dxa" w:w="2835"/>
+            <w:shd w:val="clear" w:color="auto" w:fill="FFFFFF"/>
+            <w:vAlign w:val="center"/>
+          </w:tcPr>
+          <w:p>
+            <w:pPr>
+              <w:jc w:val="left"/>
+            </w:pPr>
+            <w:r>
+              <w:rPr>
+                <w:rFonts w:ascii="맑은 고딕" w:hAnsi="맑은 고딕"/>
+                <w:b w:val="0"/>
+                <w:sz w:val="20"/>
+              </w:rPr>
+              <w:t>AUC (ROC Area)</w:t>
+            </w:r>
+          </w:p>
+        </w:tc>
+        <w:tc>
+          <w:tcPr>
+            <w:tcW w:type="dxa" w:w="6236"/>
+            <w:shd w:val="clear" w:color="auto" w:fill="FFFFFF"/>
+            <w:vAlign w:val="center"/>
+          </w:tcPr>
+          <w:p>
+            <w:pPr>
+              <w:jc w:val="center"/>
+            </w:pPr>
+            <w:r>
+              <w:rPr>
+                <w:rFonts w:ascii="맑은 고딕" w:hAnsi="맑은 고딕"/>
+                <w:b w:val="0"/>
+                <w:sz w:val="20"/>
+              </w:rPr>
+              <w:t>0.88 — Threshold에 무관한 모델 변별력 지표</w:t>
+            </w:r>
+          </w:p>
+        </w:tc>
+      </w:tr>
+      <w:tr>
+        <w:tc>
+          <w:tcPr>
+            <w:tcW w:type="dxa" w:w="2835"/>
+            <w:shd w:val="clear" w:color="auto" w:fill="F2F2F2"/>
+            <w:vAlign w:val="center"/>
+          </w:tcPr>
+          <w:p>
+            <w:pPr>
+              <w:jc w:val="left"/>
+            </w:pPr>
+            <w:r>
+              <w:rPr>
+                <w:rFonts w:ascii="맑은 고딕" w:hAnsi="맑은 고딕"/>
+                <w:b w:val="0"/>
+                <w:sz w:val="20"/>
+              </w:rPr>
+              <w:t>운영 Threshold</w:t>
+            </w:r>
+          </w:p>
+        </w:tc>
+        <w:tc>
+          <w:tcPr>
+            <w:tcW w:type="dxa" w:w="6236"/>
+            <w:shd w:val="clear" w:color="auto" w:fill="F2F2F2"/>
+            <w:vAlign w:val="center"/>
+          </w:tcPr>
+          <w:p>
+            <w:pPr>
+              <w:jc w:val="center"/>
+            </w:pPr>
+            <w:r>
+              <w:rPr>
+                <w:rFonts w:ascii="맑은 고딕" w:hAnsi="맑은 고딕"/>
+                <w:b w:val="0"/>
+                <w:sz w:val="20"/>
+              </w:rPr>
+              <w:t>0.50 (Youden's J 근처: FPR≈0.05, TPR≈0.85~0.90)</w:t>
+            </w:r>
+          </w:p>
+        </w:tc>
+      </w:tr>
+      <w:tr>
+        <w:tc>
+          <w:tcPr>
+            <w:tcW w:type="dxa" w:w="2835"/>
+            <w:shd w:val="clear" w:color="auto" w:fill="FFFFFF"/>
+            <w:vAlign w:val="center"/>
+          </w:tcPr>
+          <w:p>
+            <w:pPr>
+              <w:jc w:val="left"/>
+            </w:pPr>
+            <w:r>
+              <w:rPr>
+                <w:rFonts w:ascii="맑은 고딕" w:hAnsi="맑은 고딕"/>
+                <w:b w:val="0"/>
+                <w:sz w:val="20"/>
+              </w:rPr>
+              <w:t>Youden's J Index</w:t>
+            </w:r>
+          </w:p>
+        </w:tc>
+        <w:tc>
+          <w:tcPr>
+            <w:tcW w:type="dxa" w:w="6236"/>
+            <w:shd w:val="clear" w:color="auto" w:fill="FFFFFF"/>
+            <w:vAlign w:val="center"/>
+          </w:tcPr>
+          <w:p>
+            <w:pPr>
+              <w:jc w:val="center"/>
+            </w:pPr>
+            <w:r>
+              <w:rPr>
+                <w:rFonts w:ascii="맑은 고딕" w:hAnsi="맑은 고딕"/>
+                <w:b w:val="0"/>
+                <w:sz w:val="20"/>
+              </w:rPr>
+              <w:t>max(TPR − FPR) → ROC 커브 좌상단 knee 지점</w:t>
+            </w:r>
+          </w:p>
+        </w:tc>
+      </w:tr>
+      <w:tr>
+        <w:tc>
+          <w:tcPr>
+            <w:tcW w:type="dxa" w:w="2835"/>
+            <w:shd w:val="clear" w:color="auto" w:fill="F2F2F2"/>
+            <w:vAlign w:val="center"/>
+          </w:tcPr>
+          <w:p>
+            <w:pPr>
+              <w:jc w:val="left"/>
+            </w:pPr>
+            <w:r>
+              <w:rPr>
+                <w:rFonts w:ascii="맑은 고딕" w:hAnsi="맑은 고딕"/>
+                <w:b w:val="0"/>
+                <w:sz w:val="20"/>
+              </w:rPr>
+              <w:t>Threshold 0.30 시나리오</w:t>
+            </w:r>
+          </w:p>
+        </w:tc>
+        <w:tc>
+          <w:tcPr>
+            <w:tcW w:type="dxa" w:w="6236"/>
+            <w:shd w:val="clear" w:color="auto" w:fill="F2F2F2"/>
+            <w:vAlign w:val="center"/>
+          </w:tcPr>
+          <w:p>
+            <w:pPr>
+              <w:jc w:val="center"/>
+            </w:pPr>
+            <w:r>
+              <w:rPr>
+                <w:rFonts w:ascii="맑은 고딕" w:hAnsi="맑은 고딕"/>
+                <w:b w:val="0"/>
+                <w:sz w:val="20"/>
+              </w:rPr>
+              <w:t>TPR↑(≈0.95) / FPR↑(≈0.25) — 민감도 우선, 오경보 多</w:t>
+            </w:r>
+          </w:p>
+        </w:tc>
+      </w:tr>
+      <w:tr>
+        <w:tc>
+          <w:tcPr>
+            <w:tcW w:type="dxa" w:w="2835"/>
+            <w:shd w:val="clear" w:color="auto" w:fill="FFFFFF"/>
+            <w:vAlign w:val="center"/>
+          </w:tcPr>
+          <w:p>
+            <w:pPr>
+              <w:jc w:val="left"/>
+            </w:pPr>
+            <w:r>
+              <w:rPr>
+                <w:rFonts w:ascii="맑은 고딕" w:hAnsi="맑은 고딕"/>
+                <w:b w:val="0"/>
+                <w:sz w:val="20"/>
+              </w:rPr>
+              <w:t>Threshold 0.50 ★</w:t>
+            </w:r>
+          </w:p>
+        </w:tc>
+        <w:tc>
+          <w:tcPr>
+            <w:tcW w:type="dxa" w:w="6236"/>
+            <w:shd w:val="clear" w:color="auto" w:fill="FFFFFF"/>
+            <w:vAlign w:val="center"/>
+          </w:tcPr>
+          <w:p>
+            <w:pPr>
+              <w:jc w:val="center"/>
+            </w:pPr>
+            <w:r>
+              <w:rPr>
+                <w:rFonts w:ascii="맑은 고딕" w:hAnsi="맑은 고딕"/>
+                <w:b w:val="0"/>
+                <w:sz w:val="20"/>
+              </w:rPr>
+              <w:t>TPR≈0.85 / FPR≈0.05~0.10 — 기본값, 균형</w:t>
+            </w:r>
+          </w:p>
+        </w:tc>
+      </w:tr>
+      <w:tr>
+        <w:tc>
+          <w:tcPr>
+            <w:tcW w:type="dxa" w:w="2835"/>
+            <w:shd w:val="clear" w:color="auto" w:fill="F2F2F2"/>
+            <w:vAlign w:val="center"/>
+          </w:tcPr>
+          <w:p>
+            <w:pPr>
+              <w:jc w:val="left"/>
+            </w:pPr>
+            <w:r>
+              <w:rPr>
+                <w:rFonts w:ascii="맑은 고딕" w:hAnsi="맑은 고딕"/>
+                <w:b w:val="0"/>
+                <w:sz w:val="20"/>
+              </w:rPr>
+              <w:t>Threshold 0.75 시나리오</w:t>
+            </w:r>
+          </w:p>
+        </w:tc>
+        <w:tc>
+          <w:tcPr>
+            <w:tcW w:type="dxa" w:w="6236"/>
+            <w:shd w:val="clear" w:color="auto" w:fill="F2F2F2"/>
+            <w:vAlign w:val="center"/>
+          </w:tcPr>
+          <w:p>
+            <w:pPr>
+              <w:jc w:val="center"/>
+            </w:pPr>
+            <w:r>
+              <w:rPr>
+                <w:rFonts w:ascii="맑은 고딕" w:hAnsi="맑은 고딕"/>
+                <w:b w:val="0"/>
+                <w:sz w:val="20"/>
+              </w:rPr>
+              <w:t>TPR↓(≈0.68) / FPR↓(&lt;0.05) — 보수적, 오경보 최소</w:t>
+            </w:r>
+          </w:p>
+        </w:tc>
+      </w:tr>
+      <w:tr>
+        <w:tc>
+          <w:tcPr>
+            <w:tcW w:type="dxa" w:w="2835"/>
+            <w:shd w:val="clear" w:color="auto" w:fill="FFFFFF"/>
+            <w:vAlign w:val="center"/>
+          </w:tcPr>
+          <w:p>
+            <w:pPr>
+              <w:jc w:val="left"/>
+            </w:pPr>
+            <w:r>
+              <w:rPr>
+                <w:rFonts w:ascii="맑은 고딕" w:hAnsi="맑은 고딕"/>
+                <w:b w:val="0"/>
+                <w:sz w:val="20"/>
+              </w:rPr>
+              <w:t>Streamlit 슬라이더</w:t>
+            </w:r>
+          </w:p>
+        </w:tc>
+        <w:tc>
+          <w:tcPr>
+            <w:tcW w:type="dxa" w:w="6236"/>
+            <w:shd w:val="clear" w:color="auto" w:fill="FFFFFF"/>
+            <w:vAlign w:val="center"/>
+          </w:tcPr>
+          <w:p>
+            <w:pPr>
+              <w:jc w:val="center"/>
+            </w:pPr>
+            <w:r>
+              <w:rPr>
+                <w:rFonts w:ascii="맑은 고딕" w:hAnsi="맑은 고딕"/>
+                <w:b w:val="0"/>
+                <w:sz w:val="20"/>
+              </w:rPr>
+              <w:t>사용자가 0.1~0.9 범위에서 실시간 조정 가능</w:t>
+            </w:r>
+          </w:p>
+        </w:tc>
+      </w:tr>
+    </w:tbl>
+    <w:p>
+      <w:pPr>
+        <w:spacing w:before="0" w:after="120"/>
+        <w:jc w:val="left"/>
+      </w:pPr>
+      <w:r>
+        <w:rPr>
+          <w:rFonts w:ascii="맑은 고딕" w:hAnsi="맑은 고딕"/>
+          <w:b w:val="0"/>
+          <w:sz w:val="20"/>
+        </w:rPr>
+        <w:t>※ AUC는 Threshold를 변경해도 변하지 않음. Threshold는 운영 민감도(TPR/FPR 균형)만 조절.</w:t>
+      </w:r>
+    </w:p>
+    <w:p>
+      <w:pPr>
+        <w:spacing w:before="160" w:after="60"/>
+      </w:pPr>
+      <w:r>
+        <w:rPr>
+          <w:rFonts w:ascii="맑은 고딕" w:hAnsi="맑은 고딕"/>
+          <w:b/>
+          <w:color w:val="2E75B6"/>
+          <w:sz w:val="22"/>
+        </w:rPr>
+        <w:t>C.3 학습 곡선 해석 (Loss Curve / Accuracy Curve, 60 Epochs)</w:t>
+      </w:r>
+    </w:p>
+    <w:tbl>
+      <w:tblPr>
+        <w:tblStyle w:val="TableGrid"/>
+        <w:tblW w:type="auto" w:w="0"/>
+        <w:tblLook w:firstColumn="1" w:firstRow="1" w:lastColumn="0" w:lastRow="0" w:noHBand="0" w:noVBand="1" w:val="04A0"/>
+      </w:tblPr>
+      <w:tblGrid>
+        <w:gridCol w:w="3135"/>
+        <w:gridCol w:w="3135"/>
+        <w:gridCol w:w="3135"/>
+      </w:tblGrid>
+      <w:tr>
+        <w:tc>
+          <w:tcPr>
+            <w:tcW w:type="dxa" w:w="1701"/>
+            <w:shd w:val="clear" w:color="auto" w:fill="1F4E79"/>
+            <w:vAlign w:val="center"/>
+          </w:tcPr>
+          <w:p>
+            <w:pPr>
+              <w:jc w:val="center"/>
+            </w:pPr>
+            <w:r>
+              <w:rPr>
+                <w:rFonts w:ascii="맑은 고딕" w:hAnsi="맑은 고딕"/>
+                <w:b/>
+                <w:color w:val="FFFFFF"/>
+                <w:sz w:val="20"/>
+              </w:rPr>
+              <w:t>곡선</w:t>
+            </w:r>
+          </w:p>
+        </w:tc>
+        <w:tc>
+          <w:tcPr>
+            <w:tcW w:type="dxa" w:w="3685"/>
+            <w:shd w:val="clear" w:color="auto" w:fill="1F4E79"/>
+            <w:vAlign w:val="center"/>
+          </w:tcPr>
+          <w:p>
+            <w:pPr>
+              <w:jc w:val="center"/>
+            </w:pPr>
+            <w:r>
+              <w:rPr>
+                <w:rFonts w:ascii="맑은 고딕" w:hAnsi="맑은 고딕"/>
+                <w:b/>
+                <w:color w:val="FFFFFF"/>
+                <w:sz w:val="20"/>
+              </w:rPr>
+              <w:t>관찰 내용</w:t>
+            </w:r>
+          </w:p>
+        </w:tc>
+        <w:tc>
+          <w:tcPr>
+            <w:tcW w:type="dxa" w:w="3685"/>
+            <w:shd w:val="clear" w:color="auto" w:fill="1F4E79"/>
+            <w:vAlign w:val="center"/>
+          </w:tcPr>
+          <w:p>
+            <w:pPr>
+              <w:jc w:val="center"/>
+            </w:pPr>
+            <w:r>
+              <w:rPr>
+                <w:rFonts w:ascii="맑은 고딕" w:hAnsi="맑은 고딕"/>
+                <w:b/>
+                <w:color w:val="FFFFFF"/>
+                <w:sz w:val="20"/>
+              </w:rPr>
+              <w:t>해석</w:t>
+            </w:r>
+          </w:p>
+        </w:tc>
+      </w:tr>
+      <w:tr>
+        <w:tc>
+          <w:tcPr>
+            <w:tcW w:type="dxa" w:w="1701"/>
+            <w:shd w:val="clear" w:color="auto" w:fill="FFFFFF"/>
+            <w:vAlign w:val="center"/>
+          </w:tcPr>
+          <w:p>
+            <w:pPr>
+              <w:jc w:val="left"/>
+            </w:pPr>
+            <w:r>
+              <w:rPr>
+                <w:rFonts w:ascii="맑은 고딕" w:hAnsi="맑은 고딕"/>
+                <w:b w:val="0"/>
+                <w:sz w:val="20"/>
+              </w:rPr>
+              <w:t>Loss Curve</w:t>
+            </w:r>
+          </w:p>
+        </w:tc>
+        <w:tc>
+          <w:tcPr>
+            <w:tcW w:type="dxa" w:w="3685"/>
+            <w:shd w:val="clear" w:color="auto" w:fill="FFFFFF"/>
+            <w:vAlign w:val="center"/>
+          </w:tcPr>
+          <w:p>
+            <w:pPr>
+              <w:jc w:val="center"/>
+            </w:pPr>
+            <w:r>
+              <w:rPr>
+                <w:rFonts w:ascii="맑은 고딕" w:hAnsi="맑은 고딕"/>
+                <w:b w:val="0"/>
+                <w:sz w:val="20"/>
+              </w:rPr>
+              <w:t>초기 ~0.67 → Epoch 10 이후 ~0.43 수렴</w:t>
+              <w:br/>
+              <w:t>Train/Val Loss 격차 최소</w:t>
+            </w:r>
+          </w:p>
+        </w:tc>
+        <w:tc>
+          <w:tcPr>
+            <w:tcW w:type="dxa" w:w="3685"/>
+            <w:shd w:val="clear" w:color="auto" w:fill="FFFFFF"/>
+            <w:vAlign w:val="center"/>
+          </w:tcPr>
+          <w:p>
+            <w:pPr>
+              <w:jc w:val="center"/>
+            </w:pPr>
+            <w:r>
+              <w:rPr>
+                <w:rFonts w:ascii="맑은 고딕" w:hAnsi="맑은 고딕"/>
+                <w:b w:val="0"/>
+                <w:sz w:val="20"/>
+              </w:rPr>
+              <w:t>과적합 없음. EarlyStopping(patience=8) + restore_best_weights=True로 최적 가중치 복원</w:t>
+            </w:r>
+          </w:p>
+        </w:tc>
+      </w:tr>
+      <w:tr>
+        <w:tc>
+          <w:tcPr>
+            <w:tcW w:type="dxa" w:w="1701"/>
+            <w:shd w:val="clear" w:color="auto" w:fill="F2F2F2"/>
+            <w:vAlign w:val="center"/>
+          </w:tcPr>
+          <w:p>
+            <w:pPr>
+              <w:jc w:val="left"/>
+            </w:pPr>
+            <w:r>
+              <w:rPr>
+                <w:rFonts w:ascii="맑은 고딕" w:hAnsi="맑은 고딕"/>
+                <w:b w:val="0"/>
+                <w:sz w:val="20"/>
+              </w:rPr>
+              <w:t>Accuracy Curve</w:t>
+            </w:r>
+          </w:p>
+        </w:tc>
+        <w:tc>
+          <w:tcPr>
+            <w:tcW w:type="dxa" w:w="3685"/>
+            <w:shd w:val="clear" w:color="auto" w:fill="F2F2F2"/>
+            <w:vAlign w:val="center"/>
+          </w:tcPr>
+          <w:p>
+            <w:pPr>
+              <w:jc w:val="center"/>
+            </w:pPr>
+            <w:r>
+              <w:rPr>
+                <w:rFonts w:ascii="맑은 고딕" w:hAnsi="맑은 고딕"/>
+                <w:b w:val="0"/>
+                <w:sz w:val="20"/>
+              </w:rPr>
+              <w:t>초기 ~0.62 → Epoch 5 전후 급등 → 0.80 수렴</w:t>
+              <w:br/>
+              <w:t>Train 0.80~0.82 / Val 0.79~0.80</w:t>
+            </w:r>
+          </w:p>
+        </w:tc>
+        <w:tc>
+          <w:tcPr>
+            <w:tcW w:type="dxa" w:w="3685"/>
+            <w:shd w:val="clear" w:color="auto" w:fill="F2F2F2"/>
+            <w:vAlign w:val="center"/>
+          </w:tcPr>
+          <w:p>
+            <w:pPr>
+              <w:jc w:val="center"/>
+            </w:pPr>
+            <w:r>
+              <w:rPr>
+                <w:rFonts w:ascii="맑은 고딕" w:hAnsi="맑은 고딕"/>
+                <w:b w:val="0"/>
+                <w:sz w:val="20"/>
+              </w:rPr>
+              <w:t>Train/Val 차이 ≤ 2%p → 일반화 성능 양호. 60 Epoch 구간 소폭 진동은 BatchNorm 안정화 과정</w:t>
+            </w:r>
+          </w:p>
+        </w:tc>
+      </w:tr>
+    </w:tbl>
+    <w:p>
+      <w:r>
+        <w:br w:type="page"/>
+      </w:r>
+    </w:p>
+    <w:p>
+      <w:r>
+        <w:rPr>
+          <w:rFonts w:ascii="맑은 고딕" w:hAnsi="맑은 고딕"/>
+          <w:b/>
+          <w:color w:val="1F4E79"/>
+          <w:sz w:val="26"/>
+        </w:rPr>
+        <w:t>부록 D. Titanic 탐색적 데이터 분석 (EDA)</w:t>
+      </w:r>
+    </w:p>
+    <w:p>
+      <w:r>
+        <w:rPr>
+          <w:rFonts w:ascii="맑은 고딕" w:hAnsi="맑은 고딕"/>
+          <w:sz w:val="20"/>
+        </w:rPr>
+        <w:t>Titanic 승객 데이터(train set, 891건)를 이용한 이진 분류 사전 분석입니다.</w:t>
+        <w:br/>
+        <w:t>전처리: Age·Fare 결측값 중앙값 대체, Sex → 0(남)/1(여) 인코딩 완료.</w:t>
+      </w:r>
+    </w:p>
+    <w:p/>
+    <w:p>
+      <w:r>
+        <w:rPr>
+          <w:rFonts w:ascii="맑은 고딕" w:hAnsi="맑은 고딕"/>
+          <w:b/>
+          <w:color w:val="1F4E79"/>
+          <w:sz w:val="22"/>
+        </w:rPr>
+        <w:t>▷ D.1 수치형 변수 — Pearson 상관 히트맵</w:t>
+      </w:r>
+    </w:p>
+    <w:p>
+      <w:r>
+        <w:rPr>
+          <w:rFonts w:ascii="맑은 고딕" w:hAnsi="맑은 고딕"/>
+          <w:sz w:val="20"/>
+        </w:rPr>
+        <w:t>연속형·이산형 수치 변수(Age, SibSp, Parch, Fare)와 타깃(Survived) 간 Pearson 선형 상관계수입니다. 값이 클수록 붉은색, 작을수록 파란색으로 표시됩니다.</w:t>
+      </w:r>
+    </w:p>
+    <w:p>
+      <w:r>
+        <w:drawing>
+          <wp:inline xmlns:a="http://schemas.openxmlformats.org/drawingml/2006/main" xmlns:pic="http://schemas.openxmlformats.org/drawingml/2006/picture">
+            <wp:extent cx="3600000" cy="3082105"/>
+            <wp:docPr id="1" name="Picture 1"/>
+            <wp:cNvGraphicFramePr>
+              <a:graphicFrameLocks noChangeAspect="1"/>
+            </wp:cNvGraphicFramePr>
+            <a:graphic>
+              <a:graphicData uri="http://schemas.openxmlformats.org/drawingml/2006/picture">
+                <pic:pic>
+                  <pic:nvPicPr>
+                    <pic:cNvPr id="0" name="T1_heatmap_num.png"/>
+                    <pic:cNvPicPr/>
+                  </pic:nvPicPr>
+                  <pic:blipFill>
+                    <a:blip r:embed="rId9"/>
+                    <a:stretch>
+                      <a:fillRect/>
+                    </a:stretch>
+                  </pic:blipFill>
+                  <pic:spPr>
+                    <a:xfrm>
+                      <a:off x="0" y="0"/>
+                      <a:ext cx="3600000" cy="3082105"/>
+                    </a:xfrm>
+                    <a:prstGeom prst="rect"/>
+                  </pic:spPr>
+                </pic:pic>
+              </a:graphicData>
+            </a:graphic>
+          </wp:inline>
+        </w:drawing>
+      </w:r>
+    </w:p>
+    <w:p/>
+    <w:tbl>
+      <w:tblPr>
+        <w:tblStyle w:val="TableGrid"/>
+        <w:tblW w:type="auto" w:w="0"/>
+        <w:tblLook w:firstColumn="1" w:firstRow="1" w:lastColumn="0" w:lastRow="0" w:noHBand="0" w:noVBand="1" w:val="04A0"/>
+      </w:tblPr>
+      <w:tblGrid>
+        <w:gridCol w:w="3135"/>
+        <w:gridCol w:w="3135"/>
+        <w:gridCol w:w="3135"/>
+      </w:tblGrid>
+      <w:tr>
+        <w:tc>
+          <w:tcPr>
+            <w:tcW w:type="dxa" w:w="2551"/>
+            <w:shd w:val="clear" w:color="auto" w:fill="1F4E79"/>
+          </w:tcPr>
+          <w:p>
+            <w:pPr>
+              <w:jc w:val="center"/>
+            </w:pPr>
+            <w:r>
+              <w:rPr>
+                <w:rFonts w:ascii="맑은 고딕" w:hAnsi="맑은 고딕"/>
+                <w:b/>
+                <w:color w:val="FFFFFF"/>
+                <w:sz w:val="20"/>
+              </w:rPr>
+              <w:t>변수 쌍</w:t>
+            </w:r>
+          </w:p>
+        </w:tc>
+        <w:tc>
+          <w:tcPr>
+            <w:tcW w:type="dxa" w:w="1417"/>
+            <w:shd w:val="clear" w:color="auto" w:fill="1F4E79"/>
+          </w:tcPr>
+          <w:p>
+            <w:pPr>
+              <w:jc w:val="center"/>
+            </w:pPr>
+            <w:r>
+              <w:rPr>
+                <w:rFonts w:ascii="맑은 고딕" w:hAnsi="맑은 고딕"/>
+                <w:b/>
+                <w:color w:val="FFFFFF"/>
+                <w:sz w:val="20"/>
+              </w:rPr>
+              <w:t>상관계수</w:t>
+            </w:r>
+          </w:p>
+        </w:tc>
+        <w:tc>
+          <w:tcPr>
+            <w:tcW w:type="dxa" w:w="5669"/>
+            <w:shd w:val="clear" w:color="auto" w:fill="1F4E79"/>
+          </w:tcPr>
+          <w:p>
+            <w:pPr>
+              <w:jc w:val="center"/>
+            </w:pPr>
+            <w:r>
+              <w:rPr>
+                <w:rFonts w:ascii="맑은 고딕" w:hAnsi="맑은 고딕"/>
+                <w:b/>
+                <w:color w:val="FFFFFF"/>
+                <w:sz w:val="20"/>
+              </w:rPr>
+              <w:t>해석</w:t>
+            </w:r>
+          </w:p>
+        </w:tc>
+      </w:tr>
+      <w:tr>
+        <w:tc>
+          <w:tcPr>
+            <w:tcW w:type="dxa" w:w="2551"/>
+            <w:shd w:val="clear" w:color="auto" w:fill="FFFFFF"/>
+          </w:tcPr>
+          <w:p>
+            <w:pPr>
+              <w:jc w:val="left"/>
+            </w:pPr>
+            <w:r>
+              <w:rPr>
+                <w:rFonts w:ascii="맑은 고딕" w:hAnsi="맑은 고딕"/>
+                <w:sz w:val="20"/>
+              </w:rPr>
+              <w:t>Fare ↔ Survived</w:t>
+            </w:r>
+          </w:p>
+        </w:tc>
+        <w:tc>
+          <w:tcPr>
+            <w:tcW w:type="dxa" w:w="1417"/>
+            <w:shd w:val="clear" w:color="auto" w:fill="FFFFFF"/>
+          </w:tcPr>
+          <w:p>
+            <w:pPr>
+              <w:jc w:val="center"/>
+            </w:pPr>
+            <w:r>
+              <w:rPr>
+                <w:rFonts w:ascii="맑은 고딕" w:hAnsi="맑은 고딕"/>
+                <w:sz w:val="20"/>
+              </w:rPr>
+              <w:t>+0.26</w:t>
+            </w:r>
+          </w:p>
+        </w:tc>
+        <w:tc>
+          <w:tcPr>
+            <w:tcW w:type="dxa" w:w="5669"/>
+            <w:shd w:val="clear" w:color="auto" w:fill="FFFFFF"/>
+          </w:tcPr>
+          <w:p>
+            <w:pPr>
+              <w:jc w:val="center"/>
+            </w:pPr>
+            <w:r>
+              <w:rPr>
+                <w:rFonts w:ascii="맑은 고딕" w:hAnsi="맑은 고딕"/>
+                <w:sz w:val="20"/>
+              </w:rPr>
+              <w:t>요금 높을수록 생존률↑ (1등석 비중 반영)</w:t>
+            </w:r>
+          </w:p>
+        </w:tc>
+      </w:tr>
+      <w:tr>
+        <w:tc>
+          <w:tcPr>
+            <w:tcW w:type="dxa" w:w="2551"/>
+            <w:shd w:val="clear" w:color="auto" w:fill="F2F2F2"/>
+          </w:tcPr>
+          <w:p>
+            <w:pPr>
+              <w:jc w:val="left"/>
+            </w:pPr>
+            <w:r>
+              <w:rPr>
+                <w:rFonts w:ascii="맑은 고딕" w:hAnsi="맑은 고딕"/>
+                <w:sz w:val="20"/>
+              </w:rPr>
+              <w:t>Age ↔ Survived</w:t>
+            </w:r>
+          </w:p>
+        </w:tc>
+        <w:tc>
+          <w:tcPr>
+            <w:tcW w:type="dxa" w:w="1417"/>
+            <w:shd w:val="clear" w:color="auto" w:fill="F2F2F2"/>
+          </w:tcPr>
+          <w:p>
+            <w:pPr>
+              <w:jc w:val="center"/>
+            </w:pPr>
+            <w:r>
+              <w:rPr>
+                <w:rFonts w:ascii="맑은 고딕" w:hAnsi="맑은 고딕"/>
+                <w:sz w:val="20"/>
+              </w:rPr>
+              <w:t>-0.08</w:t>
+            </w:r>
+          </w:p>
+        </w:tc>
+        <w:tc>
+          <w:tcPr>
+            <w:tcW w:type="dxa" w:w="5669"/>
+            <w:shd w:val="clear" w:color="auto" w:fill="F2F2F2"/>
+          </w:tcPr>
+          <w:p>
+            <w:pPr>
+              <w:jc w:val="center"/>
+            </w:pPr>
+            <w:r>
+              <w:rPr>
+                <w:rFonts w:ascii="맑은 고딕" w:hAnsi="맑은 고딕"/>
+                <w:sz w:val="20"/>
+              </w:rPr>
+              <w:t>나이와 생존의 선형 관계 미약 (비선형 패턴 존재)</w:t>
+            </w:r>
+          </w:p>
+        </w:tc>
+      </w:tr>
+      <w:tr>
+        <w:tc>
+          <w:tcPr>
+            <w:tcW w:type="dxa" w:w="2551"/>
+            <w:shd w:val="clear" w:color="auto" w:fill="FFFFFF"/>
+          </w:tcPr>
+          <w:p>
+            <w:pPr>
+              <w:jc w:val="left"/>
+            </w:pPr>
+            <w:r>
+              <w:rPr>
+                <w:rFonts w:ascii="맑은 고딕" w:hAnsi="맑은 고딕"/>
+                <w:sz w:val="20"/>
+              </w:rPr>
+              <w:t>SibSp ↔ Parch</w:t>
+            </w:r>
+          </w:p>
+        </w:tc>
+        <w:tc>
+          <w:tcPr>
+            <w:tcW w:type="dxa" w:w="1417"/>
+            <w:shd w:val="clear" w:color="auto" w:fill="FFFFFF"/>
+          </w:tcPr>
+          <w:p>
+            <w:pPr>
+              <w:jc w:val="center"/>
+            </w:pPr>
+            <w:r>
+              <w:rPr>
+                <w:rFonts w:ascii="맑은 고딕" w:hAnsi="맑은 고딕"/>
+                <w:sz w:val="20"/>
+              </w:rPr>
+              <w:t>+0.41</w:t>
+            </w:r>
+          </w:p>
+        </w:tc>
+        <w:tc>
+          <w:tcPr>
+            <w:tcW w:type="dxa" w:w="5669"/>
+            <w:shd w:val="clear" w:color="auto" w:fill="FFFFFF"/>
+          </w:tcPr>
+          <w:p>
+            <w:pPr>
+              <w:jc w:val="center"/>
+            </w:pPr>
+            <w:r>
+              <w:rPr>
+                <w:rFonts w:ascii="맑은 고딕" w:hAnsi="맑은 고딕"/>
+                <w:sz w:val="20"/>
+              </w:rPr>
+              <w:t>형제자매·부모자녀 동반 여부 공선성</w:t>
+            </w:r>
+          </w:p>
+        </w:tc>
+      </w:tr>
+      <w:tr>
+        <w:tc>
+          <w:tcPr>
+            <w:tcW w:type="dxa" w:w="2551"/>
+            <w:shd w:val="clear" w:color="auto" w:fill="F2F2F2"/>
+          </w:tcPr>
+          <w:p>
+            <w:pPr>
+              <w:jc w:val="left"/>
+            </w:pPr>
+            <w:r>
+              <w:rPr>
+                <w:rFonts w:ascii="맑은 고딕" w:hAnsi="맑은 고딕"/>
+                <w:sz w:val="20"/>
+              </w:rPr>
+              <w:t>Fare ↔ Parch</w:t>
+            </w:r>
+          </w:p>
+        </w:tc>
+        <w:tc>
+          <w:tcPr>
+            <w:tcW w:type="dxa" w:w="1417"/>
+            <w:shd w:val="clear" w:color="auto" w:fill="F2F2F2"/>
+          </w:tcPr>
+          <w:p>
+            <w:pPr>
+              <w:jc w:val="center"/>
+            </w:pPr>
+            <w:r>
+              <w:rPr>
+                <w:rFonts w:ascii="맑은 고딕" w:hAnsi="맑은 고딕"/>
+                <w:sz w:val="20"/>
+              </w:rPr>
+              <w:t>+0.22</w:t>
+            </w:r>
+          </w:p>
+        </w:tc>
+        <w:tc>
+          <w:tcPr>
+            <w:tcW w:type="dxa" w:w="5669"/>
+            <w:shd w:val="clear" w:color="auto" w:fill="F2F2F2"/>
+          </w:tcPr>
+          <w:p>
+            <w:pPr>
+              <w:jc w:val="center"/>
+            </w:pPr>
+            <w:r>
+              <w:rPr>
+                <w:rFonts w:ascii="맑은 고딕" w:hAnsi="맑은 고딕"/>
+                <w:sz w:val="20"/>
+              </w:rPr>
+              <w:t>대가족일수록 고가 티켓 비율 소폭↑</w:t>
+            </w:r>
+          </w:p>
+        </w:tc>
+      </w:tr>
+    </w:tbl>
+    <w:p/>
+    <w:p>
+      <w:r>
+        <w:rPr>
+          <w:rFonts w:ascii="맑은 고딕" w:hAnsi="맑은 고딕"/>
+          <w:sz w:val="18"/>
+        </w:rPr>
+        <w:t>▶ 수치형 변수만으로는 Survived와의 Pearson 상관이 모두 낮음(최대 0.26).</w:t>
+        <w:br/>
+        <w:t xml:space="preserve">   → 범주형 피처(Sex, Pclass)와 조합 시 예측력 크게 향상됨을 D.2에서 확인.</w:t>
+      </w:r>
+    </w:p>
+    <w:p/>
+    <w:p>
+      <w:r>
+        <w:rPr>
+          <w:rFonts w:ascii="맑은 고딕" w:hAnsi="맑은 고딕"/>
+          <w:b/>
+          <w:color w:val="1F4E79"/>
+          <w:sz w:val="22"/>
+        </w:rPr>
+        <w:t>▷ D.2 범주형·서열형 변수 — Cramér's V 히트맵</w:t>
+      </w:r>
+    </w:p>
+    <w:p>
+      <w:r>
+        <w:rPr>
+          <w:rFonts w:ascii="맑은 고딕" w:hAnsi="맑은 고딕"/>
+          <w:sz w:val="20"/>
+        </w:rPr>
+        <w:t>범주형(Sex)·서열형(Pclass) 변수 간 연관 강도를 Cramér's V (χ² 기반, 0~1 범위)로 측정합니다.</w:t>
+        <w:br/>
+        <w:t>Pearson 상관은 명목 변수 간 선형 가정이 부적절하므로, 범주형에는 Cramér's V를 사용합니다.</w:t>
+      </w:r>
+    </w:p>
+    <w:p>
+      <w:r>
+        <w:drawing>
+          <wp:inline xmlns:a="http://schemas.openxmlformats.org/drawingml/2006/main" xmlns:pic="http://schemas.openxmlformats.org/drawingml/2006/picture">
+            <wp:extent cx="2880000" cy="2496568"/>
+            <wp:docPr id="2" name="Picture 2"/>
+            <wp:cNvGraphicFramePr>
+              <a:graphicFrameLocks noChangeAspect="1"/>
+            </wp:cNvGraphicFramePr>
+            <a:graphic>
+              <a:graphicData uri="http://schemas.openxmlformats.org/drawingml/2006/picture">
+                <pic:pic>
+                  <pic:nvPicPr>
+                    <pic:cNvPr id="0" name="T2_heatmap_cat.png"/>
+                    <pic:cNvPicPr/>
+                  </pic:nvPicPr>
+                  <pic:blipFill>
+                    <a:blip r:embed="rId10"/>
+                    <a:stretch>
+                      <a:fillRect/>
+                    </a:stretch>
+                  </pic:blipFill>
+                  <pic:spPr>
+                    <a:xfrm>
+                      <a:off x="0" y="0"/>
+                      <a:ext cx="2880000" cy="2496568"/>
+                    </a:xfrm>
+                    <a:prstGeom prst="rect"/>
+                  </pic:spPr>
+                </pic:pic>
+              </a:graphicData>
+            </a:graphic>
+          </wp:inline>
+        </w:drawing>
+      </w:r>
+    </w:p>
+    <w:p/>
+    <w:tbl>
+      <w:tblPr>
+        <w:tblStyle w:val="TableGrid"/>
+        <w:tblW w:type="auto" w:w="0"/>
+        <w:tblLook w:firstColumn="1" w:firstRow="1" w:lastColumn="0" w:lastRow="0" w:noHBand="0" w:noVBand="1" w:val="04A0"/>
+      </w:tblPr>
+      <w:tblGrid>
+        <w:gridCol w:w="3135"/>
+        <w:gridCol w:w="3135"/>
+        <w:gridCol w:w="3135"/>
+      </w:tblGrid>
+      <w:tr>
+        <w:tc>
+          <w:tcPr>
+            <w:tcW w:type="dxa" w:w="2551"/>
+            <w:shd w:val="clear" w:color="auto" w:fill="1F4E79"/>
+          </w:tcPr>
+          <w:p>
+            <w:pPr>
+              <w:jc w:val="center"/>
+            </w:pPr>
+            <w:r>
+              <w:rPr>
+                <w:rFonts w:ascii="맑은 고딕" w:hAnsi="맑은 고딕"/>
+                <w:b/>
+                <w:color w:val="FFFFFF"/>
+                <w:sz w:val="20"/>
+              </w:rPr>
+              <w:t>변수 쌍</w:t>
+            </w:r>
+          </w:p>
+        </w:tc>
+        <w:tc>
+          <w:tcPr>
+            <w:tcW w:type="dxa" w:w="1417"/>
+            <w:shd w:val="clear" w:color="auto" w:fill="1F4E79"/>
+          </w:tcPr>
+          <w:p>
+            <w:pPr>
+              <w:jc w:val="center"/>
+            </w:pPr>
+            <w:r>
+              <w:rPr>
+                <w:rFonts w:ascii="맑은 고딕" w:hAnsi="맑은 고딕"/>
+                <w:b/>
+                <w:color w:val="FFFFFF"/>
+                <w:sz w:val="20"/>
+              </w:rPr>
+              <w:t>Cramér's V</w:t>
+            </w:r>
+          </w:p>
+        </w:tc>
+        <w:tc>
+          <w:tcPr>
+            <w:tcW w:type="dxa" w:w="5669"/>
+            <w:shd w:val="clear" w:color="auto" w:fill="1F4E79"/>
+          </w:tcPr>
+          <w:p>
+            <w:pPr>
+              <w:jc w:val="center"/>
+            </w:pPr>
+            <w:r>
+              <w:rPr>
+                <w:rFonts w:ascii="맑은 고딕" w:hAnsi="맑은 고딕"/>
+                <w:b/>
+                <w:color w:val="FFFFFF"/>
+                <w:sz w:val="20"/>
+              </w:rPr>
+              <w:t>해석</w:t>
+            </w:r>
+          </w:p>
+        </w:tc>
+      </w:tr>
+      <w:tr>
+        <w:tc>
+          <w:tcPr>
+            <w:tcW w:type="dxa" w:w="2551"/>
+            <w:shd w:val="clear" w:color="auto" w:fill="FFFFFF"/>
+          </w:tcPr>
+          <w:p>
+            <w:pPr>
+              <w:jc w:val="left"/>
+            </w:pPr>
+            <w:r>
+              <w:rPr>
+                <w:rFonts w:ascii="맑은 고딕" w:hAnsi="맑은 고딕"/>
+                <w:sz w:val="20"/>
+              </w:rPr>
+              <w:t>Sex ↔ Survived</w:t>
+            </w:r>
+          </w:p>
+        </w:tc>
+        <w:tc>
+          <w:tcPr>
+            <w:tcW w:type="dxa" w:w="1417"/>
+            <w:shd w:val="clear" w:color="auto" w:fill="FFFFFF"/>
+          </w:tcPr>
+          <w:p>
+            <w:pPr>
+              <w:jc w:val="center"/>
+            </w:pPr>
+            <w:r>
+              <w:rPr>
+                <w:rFonts w:ascii="맑은 고딕" w:hAnsi="맑은 고딕"/>
+                <w:sz w:val="20"/>
+              </w:rPr>
+              <w:t>0.54</w:t>
+            </w:r>
+          </w:p>
+        </w:tc>
+        <w:tc>
+          <w:tcPr>
+            <w:tcW w:type="dxa" w:w="5669"/>
+            <w:shd w:val="clear" w:color="auto" w:fill="FFFFFF"/>
+          </w:tcPr>
+          <w:p>
+            <w:pPr>
+              <w:jc w:val="center"/>
+            </w:pPr>
+            <w:r>
+              <w:rPr>
+                <w:rFonts w:ascii="맑은 고딕" w:hAnsi="맑은 고딕"/>
+                <w:sz w:val="20"/>
+              </w:rPr>
+              <w:t>성별이 생존과 강한 연관 (여성 우선 대피 원칙)</w:t>
+            </w:r>
+          </w:p>
+        </w:tc>
+      </w:tr>
+      <w:tr>
+        <w:tc>
+          <w:tcPr>
+            <w:tcW w:type="dxa" w:w="2551"/>
+            <w:shd w:val="clear" w:color="auto" w:fill="F2F2F2"/>
+          </w:tcPr>
+          <w:p>
+            <w:pPr>
+              <w:jc w:val="left"/>
+            </w:pPr>
+            <w:r>
+              <w:rPr>
+                <w:rFonts w:ascii="맑은 고딕" w:hAnsi="맑은 고딕"/>
+                <w:sz w:val="20"/>
+              </w:rPr>
+              <w:t>Pclass ↔ Survived</w:t>
+            </w:r>
+          </w:p>
+        </w:tc>
+        <w:tc>
+          <w:tcPr>
+            <w:tcW w:type="dxa" w:w="1417"/>
+            <w:shd w:val="clear" w:color="auto" w:fill="F2F2F2"/>
+          </w:tcPr>
+          <w:p>
+            <w:pPr>
+              <w:jc w:val="center"/>
+            </w:pPr>
+            <w:r>
+              <w:rPr>
+                <w:rFonts w:ascii="맑은 고딕" w:hAnsi="맑은 고딕"/>
+                <w:sz w:val="20"/>
+              </w:rPr>
+              <w:t>0.34</w:t>
+            </w:r>
+          </w:p>
+        </w:tc>
+        <w:tc>
+          <w:tcPr>
+            <w:tcW w:type="dxa" w:w="5669"/>
+            <w:shd w:val="clear" w:color="auto" w:fill="F2F2F2"/>
+          </w:tcPr>
+          <w:p>
+            <w:pPr>
+              <w:jc w:val="center"/>
+            </w:pPr>
+            <w:r>
+              <w:rPr>
+                <w:rFonts w:ascii="맑은 고딕" w:hAnsi="맑은 고딕"/>
+                <w:sz w:val="20"/>
+              </w:rPr>
+              <w:t>객실 등급이 생존과 중간 연관 (1등석 생존율 높음)</w:t>
+            </w:r>
+          </w:p>
+        </w:tc>
+      </w:tr>
+      <w:tr>
+        <w:tc>
+          <w:tcPr>
+            <w:tcW w:type="dxa" w:w="2551"/>
+            <w:shd w:val="clear" w:color="auto" w:fill="FFFFFF"/>
+          </w:tcPr>
+          <w:p>
+            <w:pPr>
+              <w:jc w:val="left"/>
+            </w:pPr>
+            <w:r>
+              <w:rPr>
+                <w:rFonts w:ascii="맑은 고딕" w:hAnsi="맑은 고딕"/>
+                <w:sz w:val="20"/>
+              </w:rPr>
+              <w:t>Pclass ↔ Sex</w:t>
+            </w:r>
+          </w:p>
+        </w:tc>
+        <w:tc>
+          <w:tcPr>
+            <w:tcW w:type="dxa" w:w="1417"/>
+            <w:shd w:val="clear" w:color="auto" w:fill="FFFFFF"/>
+          </w:tcPr>
+          <w:p>
+            <w:pPr>
+              <w:jc w:val="center"/>
+            </w:pPr>
+            <w:r>
+              <w:rPr>
+                <w:rFonts w:ascii="맑은 고딕" w:hAnsi="맑은 고딕"/>
+                <w:sz w:val="20"/>
+              </w:rPr>
+              <w:t>0.13</w:t>
+            </w:r>
+          </w:p>
+        </w:tc>
+        <w:tc>
+          <w:tcPr>
+            <w:tcW w:type="dxa" w:w="5669"/>
+            <w:shd w:val="clear" w:color="auto" w:fill="FFFFFF"/>
+          </w:tcPr>
+          <w:p>
+            <w:pPr>
+              <w:jc w:val="center"/>
+            </w:pPr>
+            <w:r>
+              <w:rPr>
+                <w:rFonts w:ascii="맑은 고딕" w:hAnsi="맑은 고딕"/>
+                <w:sz w:val="20"/>
+              </w:rPr>
+              <w:t>객실 등급과 성별 간 약한 연관</w:t>
+            </w:r>
+          </w:p>
+        </w:tc>
+      </w:tr>
+    </w:tbl>
+    <w:p/>
+    <w:p>
+      <w:r>
+        <w:rPr>
+          <w:rFonts w:ascii="맑은 고딕" w:hAnsi="맑은 고딕"/>
+          <w:sz w:val="18"/>
+        </w:rPr>
+        <w:t>※ Cramér's V 해석 기준: 0.1 미만=약함, 0.1~0.3=보통, 0.3~0.5=강함, 0.5 이상=매우 강함</w:t>
+        <w:br/>
+        <w:t>▶ Sex(0.54)가 Pclass(0.34)보다 Survived와 강한 연관 → DL 모델에서 Sex가 핵심 피처로 작용</w:t>
+      </w:r>
+    </w:p>
+    <w:p/>
+    <w:p>
+      <w:r>
+        <w:rPr>
+          <w:rFonts w:ascii="맑은 고딕" w:hAnsi="맑은 고딕"/>
+          <w:b/>
+          <w:color w:val="1F4E79"/>
+          <w:sz w:val="22"/>
+        </w:rPr>
+        <w:t>▷ D.3 변수별 생존/사망 2차원 비교 (4종)</w:t>
+      </w:r>
+    </w:p>
+    <w:p>
+      <w:r>
+        <w:rPr>
+          <w:rFonts w:ascii="맑은 고딕" w:hAnsi="맑은 고딕"/>
+          <w:sz w:val="20"/>
+        </w:rPr>
+        <w:t>각 변수를 x축, 생존/사망 빈도를 y축으로 하여 Death(파랑)·Survived(주황)를 2차원으로 시각화합니다.</w:t>
+      </w:r>
+    </w:p>
+    <w:p>
+      <w:r>
+        <w:drawing>
+          <wp:inline xmlns:a="http://schemas.openxmlformats.org/drawingml/2006/main" xmlns:pic="http://schemas.openxmlformats.org/drawingml/2006/picture">
+            <wp:extent cx="5400000" cy="3829649"/>
+            <wp:docPr id="3" name="Picture 3"/>
+            <wp:cNvGraphicFramePr>
+              <a:graphicFrameLocks noChangeAspect="1"/>
+            </wp:cNvGraphicFramePr>
+            <a:graphic>
+              <a:graphicData uri="http://schemas.openxmlformats.org/drawingml/2006/picture">
+                <pic:pic>
+                  <pic:nvPicPr>
+                    <pic:cNvPr id="0" name="T3_2d_compare.png"/>
+                    <pic:cNvPicPr/>
+                  </pic:nvPicPr>
+                  <pic:blipFill>
+                    <a:blip r:embed="rId11"/>
+                    <a:stretch>
+                      <a:fillRect/>
+                    </a:stretch>
+                  </pic:blipFill>
+                  <pic:spPr>
+                    <a:xfrm>
+                      <a:off x="0" y="0"/>
+                      <a:ext cx="5400000" cy="3829649"/>
+                    </a:xfrm>
+                    <a:prstGeom prst="rect"/>
+                  </pic:spPr>
+                </pic:pic>
+              </a:graphicData>
+            </a:graphic>
+          </wp:inline>
+        </w:drawing>
+      </w:r>
+    </w:p>
+    <w:p/>
+    <w:tbl>
+      <w:tblPr>
+        <w:tblStyle w:val="TableGrid"/>
+        <w:tblW w:type="auto" w:w="0"/>
+        <w:tblLook w:firstColumn="1" w:firstRow="1" w:lastColumn="0" w:lastRow="0" w:noHBand="0" w:noVBand="1" w:val="04A0"/>
+      </w:tblPr>
+      <w:tblGrid>
+        <w:gridCol w:w="3135"/>
+        <w:gridCol w:w="3135"/>
+        <w:gridCol w:w="3135"/>
+      </w:tblGrid>
+      <w:tr>
+        <w:tc>
+          <w:tcPr>
+            <w:tcW w:type="dxa" w:w="1701"/>
+            <w:shd w:val="clear" w:color="auto" w:fill="1F4E79"/>
+          </w:tcPr>
+          <w:p>
+            <w:pPr>
+              <w:jc w:val="center"/>
+            </w:pPr>
+            <w:r>
+              <w:rPr>
+                <w:rFonts w:ascii="맑은 고딕" w:hAnsi="맑은 고딕"/>
+                <w:b/>
+                <w:color w:val="FFFFFF"/>
+                <w:sz w:val="20"/>
+              </w:rPr>
+              <w:t>차트</w:t>
+            </w:r>
+          </w:p>
+        </w:tc>
+        <w:tc>
+          <w:tcPr>
+            <w:tcW w:type="dxa" w:w="3402"/>
+            <w:shd w:val="clear" w:color="auto" w:fill="1F4E79"/>
+          </w:tcPr>
+          <w:p>
+            <w:pPr>
+              <w:jc w:val="center"/>
+            </w:pPr>
+            <w:r>
+              <w:rPr>
+                <w:rFonts w:ascii="맑은 고딕" w:hAnsi="맑은 고딕"/>
+                <w:b/>
+                <w:color w:val="FFFFFF"/>
+                <w:sz w:val="20"/>
+              </w:rPr>
+              <w:t>주요 패턴</w:t>
+            </w:r>
+          </w:p>
+        </w:tc>
+        <w:tc>
+          <w:tcPr>
+            <w:tcW w:type="dxa" w:w="3969"/>
+            <w:shd w:val="clear" w:color="auto" w:fill="1F4E79"/>
+          </w:tcPr>
+          <w:p>
+            <w:pPr>
+              <w:jc w:val="center"/>
+            </w:pPr>
+            <w:r>
+              <w:rPr>
+                <w:rFonts w:ascii="맑은 고딕" w:hAnsi="맑은 고딕"/>
+                <w:b/>
+                <w:color w:val="FFFFFF"/>
+                <w:sz w:val="20"/>
+              </w:rPr>
+              <w:t>DL 모델 시사점</w:t>
+            </w:r>
+          </w:p>
+        </w:tc>
+      </w:tr>
+      <w:tr>
+        <w:tc>
+          <w:tcPr>
+            <w:tcW w:type="dxa" w:w="1701"/>
+            <w:shd w:val="clear" w:color="auto" w:fill="FFFFFF"/>
+          </w:tcPr>
+          <w:p>
+            <w:pPr>
+              <w:jc w:val="left"/>
+            </w:pPr>
+            <w:r>
+              <w:rPr>
+                <w:rFonts w:ascii="맑은 고딕" w:hAnsi="맑은 고딕"/>
+                <w:sz w:val="20"/>
+              </w:rPr>
+              <w:t>① Age 히스토그램</w:t>
+            </w:r>
+          </w:p>
+        </w:tc>
+        <w:tc>
+          <w:tcPr>
+            <w:tcW w:type="dxa" w:w="3402"/>
+            <w:shd w:val="clear" w:color="auto" w:fill="FFFFFF"/>
+          </w:tcPr>
+          <w:p>
+            <w:pPr>
+              <w:jc w:val="center"/>
+            </w:pPr>
+            <w:r>
+              <w:rPr>
+                <w:rFonts w:ascii="맑은 고딕" w:hAnsi="맑은 고딕"/>
+                <w:sz w:val="20"/>
+              </w:rPr>
+              <w:t>10~30대 사망자 많음</w:t>
+              <w:br/>
+              <w:t>영유아(0~10세) 생존율 높음</w:t>
+            </w:r>
+          </w:p>
+        </w:tc>
+        <w:tc>
+          <w:tcPr>
+            <w:tcW w:type="dxa" w:w="3969"/>
+            <w:shd w:val="clear" w:color="auto" w:fill="FFFFFF"/>
+          </w:tcPr>
+          <w:p>
+            <w:pPr>
+              <w:jc w:val="center"/>
+            </w:pPr>
+            <w:r>
+              <w:rPr>
+                <w:rFonts w:ascii="맑은 고딕" w:hAnsi="맑은 고딕"/>
+                <w:sz w:val="20"/>
+              </w:rPr>
+              <w:t>Age는 비선형 패턴 존재</w:t>
+              <w:br/>
+              <w:t>→ CNN/LSTM이 선형 회귀보다 유리</w:t>
+            </w:r>
+          </w:p>
+        </w:tc>
+      </w:tr>
+      <w:tr>
+        <w:tc>
+          <w:tcPr>
+            <w:tcW w:type="dxa" w:w="1701"/>
+            <w:shd w:val="clear" w:color="auto" w:fill="F2F2F2"/>
+          </w:tcPr>
+          <w:p>
+            <w:pPr>
+              <w:jc w:val="left"/>
+            </w:pPr>
+            <w:r>
+              <w:rPr>
+                <w:rFonts w:ascii="맑은 고딕" w:hAnsi="맑은 고딕"/>
+                <w:sz w:val="20"/>
+              </w:rPr>
+              <w:t>② Pclass 막대</w:t>
+            </w:r>
+          </w:p>
+        </w:tc>
+        <w:tc>
+          <w:tcPr>
+            <w:tcW w:type="dxa" w:w="3402"/>
+            <w:shd w:val="clear" w:color="auto" w:fill="F2F2F2"/>
+          </w:tcPr>
+          <w:p>
+            <w:pPr>
+              <w:jc w:val="center"/>
+            </w:pPr>
+            <w:r>
+              <w:rPr>
+                <w:rFonts w:ascii="맑은 고딕" w:hAnsi="맑은 고딕"/>
+                <w:sz w:val="20"/>
+              </w:rPr>
+              <w:t>3등석 사망자 압도적</w:t>
+              <w:br/>
+              <w:t>1등석 생존율≈63%, 3등석≈24%</w:t>
+            </w:r>
+          </w:p>
+        </w:tc>
+        <w:tc>
+          <w:tcPr>
+            <w:tcW w:type="dxa" w:w="3969"/>
+            <w:shd w:val="clear" w:color="auto" w:fill="F2F2F2"/>
+          </w:tcPr>
+          <w:p>
+            <w:pPr>
+              <w:jc w:val="center"/>
+            </w:pPr>
+            <w:r>
+              <w:rPr>
+                <w:rFonts w:ascii="맑은 고딕" w:hAnsi="맑은 고딕"/>
+                <w:sz w:val="20"/>
+              </w:rPr>
+              <w:t>Pclass는 핵심 피처</w:t>
+              <w:br/>
+              <w:t>→ 원-핫 인코딩 또는 임베딩 권장</w:t>
+            </w:r>
+          </w:p>
+        </w:tc>
+      </w:tr>
+      <w:tr>
+        <w:tc>
+          <w:tcPr>
+            <w:tcW w:type="dxa" w:w="1701"/>
+            <w:shd w:val="clear" w:color="auto" w:fill="FFFFFF"/>
+          </w:tcPr>
+          <w:p>
+            <w:pPr>
+              <w:jc w:val="left"/>
+            </w:pPr>
+            <w:r>
+              <w:rPr>
+                <w:rFonts w:ascii="맑은 고딕" w:hAnsi="맑은 고딕"/>
+                <w:sz w:val="20"/>
+              </w:rPr>
+              <w:t>③ Sex 막대</w:t>
+            </w:r>
+          </w:p>
+        </w:tc>
+        <w:tc>
+          <w:tcPr>
+            <w:tcW w:type="dxa" w:w="3402"/>
+            <w:shd w:val="clear" w:color="auto" w:fill="FFFFFF"/>
+          </w:tcPr>
+          <w:p>
+            <w:pPr>
+              <w:jc w:val="center"/>
+            </w:pPr>
+            <w:r>
+              <w:rPr>
+                <w:rFonts w:ascii="맑은 고딕" w:hAnsi="맑은 고딕"/>
+                <w:sz w:val="20"/>
+              </w:rPr>
+              <w:t>남성 사망 468명 (생존율≈19%)</w:t>
+              <w:br/>
+              <w:t>여성 생존 233명 (생존율≈74%)</w:t>
+            </w:r>
+          </w:p>
+        </w:tc>
+        <w:tc>
+          <w:tcPr>
+            <w:tcW w:type="dxa" w:w="3969"/>
+            <w:shd w:val="clear" w:color="auto" w:fill="FFFFFF"/>
+          </w:tcPr>
+          <w:p>
+            <w:pPr>
+              <w:jc w:val="center"/>
+            </w:pPr>
+            <w:r>
+              <w:rPr>
+                <w:rFonts w:ascii="맑은 고딕" w:hAnsi="맑은 고딕"/>
+                <w:sz w:val="20"/>
+              </w:rPr>
+              <w:t>Sex가 단일 최강 피처</w:t>
+              <w:br/>
+              <w:t>Cramér's V 0.54로 확인</w:t>
+            </w:r>
+          </w:p>
+        </w:tc>
+      </w:tr>
+      <w:tr>
+        <w:tc>
+          <w:tcPr>
+            <w:tcW w:type="dxa" w:w="1701"/>
+            <w:shd w:val="clear" w:color="auto" w:fill="F2F2F2"/>
+          </w:tcPr>
+          <w:p>
+            <w:pPr>
+              <w:jc w:val="left"/>
+            </w:pPr>
+            <w:r>
+              <w:rPr>
+                <w:rFonts w:ascii="맑은 고딕" w:hAnsi="맑은 고딕"/>
+                <w:sz w:val="20"/>
+              </w:rPr>
+              <w:t>④ Fare 박스플롯</w:t>
+            </w:r>
+          </w:p>
+        </w:tc>
+        <w:tc>
+          <w:tcPr>
+            <w:tcW w:type="dxa" w:w="3402"/>
+            <w:shd w:val="clear" w:color="auto" w:fill="F2F2F2"/>
+          </w:tcPr>
+          <w:p>
+            <w:pPr>
+              <w:jc w:val="center"/>
+            </w:pPr>
+            <w:r>
+              <w:rPr>
+                <w:rFonts w:ascii="맑은 고딕" w:hAnsi="맑은 고딕"/>
+                <w:sz w:val="20"/>
+              </w:rPr>
+              <w:t>생존자 Fare 중앙값 &gt; 사망자</w:t>
+              <w:br/>
+              <w:t>약 2~3배 차이</w:t>
+            </w:r>
+          </w:p>
+        </w:tc>
+        <w:tc>
+          <w:tcPr>
+            <w:tcW w:type="dxa" w:w="3969"/>
+            <w:shd w:val="clear" w:color="auto" w:fill="F2F2F2"/>
+          </w:tcPr>
+          <w:p>
+            <w:pPr>
+              <w:jc w:val="center"/>
+            </w:pPr>
+            <w:r>
+              <w:rPr>
+                <w:rFonts w:ascii="맑은 고딕" w:hAnsi="맑은 고딕"/>
+                <w:sz w:val="20"/>
+              </w:rPr>
+              <w:t>Fare는 Pclass와 공선성 있음</w:t>
+              <w:br/>
+              <w:t>→ VIF 확인 후 피처 선택</w:t>
+            </w:r>
+          </w:p>
+        </w:tc>
+      </w:tr>
+    </w:tbl>
+    <w:p>
+      <w:r>
+        <w:br w:type="page"/>
+      </w:r>
+    </w:p>
+    <w:p>
+      <w:r>
+        <w:rPr>
+          <w:rFonts w:ascii="맑은 고딕" w:hAnsi="맑은 고딕"/>
+          <w:b/>
+          <w:color w:val="1F4E79"/>
+          <w:sz w:val="26"/>
+        </w:rPr>
+        <w:t>부록 E. SHAP 예측 설명 분석</w:t>
+      </w:r>
+    </w:p>
+    <w:p>
+      <w:r>
+        <w:rPr>
+          <w:rFonts w:ascii="맑은 고딕" w:hAnsi="맑은 고딕"/>
+          <w:sz w:val="20"/>
+        </w:rPr>
+        <w:t>SHAP(SHapley Additive exPlanations)은 게임이론 기반 피처 기여도 분해 방법입니다.</w:t>
+        <w:br/>
+        <w:t>각 피처가 개별 예측에 얼마나 기여했는지 정량화하여 모델의 예측 근거를 설명합니다.</w:t>
+      </w:r>
+    </w:p>
+    <w:p/>
+    <w:tbl>
+      <w:tblPr>
+        <w:tblStyle w:val="TableGrid"/>
+        <w:tblW w:type="auto" w:w="0"/>
+        <w:tblLook w:firstColumn="1" w:firstRow="1" w:lastColumn="0" w:lastRow="0" w:noHBand="0" w:noVBand="1" w:val="04A0"/>
+      </w:tblPr>
+      <w:tblGrid>
+        <w:gridCol w:w="3135"/>
+        <w:gridCol w:w="3135"/>
+        <w:gridCol w:w="3135"/>
+      </w:tblGrid>
+      <w:tr>
+        <w:tc>
+          <w:tcPr>
+            <w:tcW w:type="dxa" w:w="1984"/>
+            <w:shd w:val="clear" w:color="auto" w:fill="1F4E79"/>
+          </w:tcPr>
+          <w:p>
+            <w:pPr>
+              <w:jc w:val="center"/>
+            </w:pPr>
+            <w:r>
+              <w:rPr>
+                <w:rFonts w:ascii="맑은 고딕" w:hAnsi="맑은 고딕"/>
+                <w:b/>
+                <w:color w:val="FFFFFF"/>
+                <w:sz w:val="20"/>
+              </w:rPr>
+              <w:t>항목</w:t>
+            </w:r>
+          </w:p>
+        </w:tc>
+        <w:tc>
+          <w:tcPr>
+            <w:tcW w:type="dxa" w:w="3118"/>
+            <w:shd w:val="clear" w:color="auto" w:fill="1F4E79"/>
+          </w:tcPr>
+          <w:p>
+            <w:pPr>
+              <w:jc w:val="center"/>
+            </w:pPr>
+            <w:r>
+              <w:rPr>
+                <w:rFonts w:ascii="맑은 고딕" w:hAnsi="맑은 고딕"/>
+                <w:b/>
+                <w:color w:val="FFFFFF"/>
+                <w:sz w:val="20"/>
+              </w:rPr>
+              <w:t>분류 모델</w:t>
+            </w:r>
+          </w:p>
+        </w:tc>
+        <w:tc>
+          <w:tcPr>
+            <w:tcW w:type="dxa" w:w="3118"/>
+            <w:shd w:val="clear" w:color="auto" w:fill="1F4E79"/>
+          </w:tcPr>
+          <w:p>
+            <w:pPr>
+              <w:jc w:val="center"/>
+            </w:pPr>
+            <w:r>
+              <w:rPr>
+                <w:rFonts w:ascii="맑은 고딕" w:hAnsi="맑은 고딕"/>
+                <w:b/>
+                <w:color w:val="FFFFFF"/>
+                <w:sz w:val="20"/>
+              </w:rPr>
+              <w:t>GRU v2 RUL 모델</w:t>
+            </w:r>
+          </w:p>
+        </w:tc>
+      </w:tr>
+      <w:tr>
+        <w:tc>
+          <w:tcPr>
+            <w:tcW w:type="dxa" w:w="1984"/>
+            <w:shd w:val="clear" w:color="auto" w:fill="FFFFFF"/>
+          </w:tcPr>
+          <w:p>
+            <w:pPr>
+              <w:jc w:val="left"/>
+            </w:pPr>
+            <w:r>
+              <w:rPr>
+                <w:rFonts w:ascii="맑은 고딕" w:hAnsi="맑은 고딕"/>
+                <w:sz w:val="20"/>
+              </w:rPr>
+              <w:t>모델 유형</w:t>
+            </w:r>
+          </w:p>
+        </w:tc>
+        <w:tc>
+          <w:tcPr>
+            <w:tcW w:type="dxa" w:w="3118"/>
+            <w:shd w:val="clear" w:color="auto" w:fill="FFFFFF"/>
+          </w:tcPr>
+          <w:p>
+            <w:pPr>
+              <w:jc w:val="center"/>
+            </w:pPr>
+            <w:r>
+              <w:rPr>
+                <w:rFonts w:ascii="맑은 고딕" w:hAnsi="맑은 고딕"/>
+                <w:sz w:val="20"/>
+              </w:rPr>
+              <w:t>LogisticRegression</w:t>
+            </w:r>
+          </w:p>
+        </w:tc>
+        <w:tc>
+          <w:tcPr>
+            <w:tcW w:type="dxa" w:w="3118"/>
+            <w:shd w:val="clear" w:color="auto" w:fill="FFFFFF"/>
+          </w:tcPr>
+          <w:p>
+            <w:pPr>
+              <w:jc w:val="center"/>
+            </w:pPr>
+            <w:r>
+              <w:rPr>
+                <w:rFonts w:ascii="맑은 고딕" w:hAnsi="맑은 고딕"/>
+                <w:sz w:val="20"/>
+              </w:rPr>
+              <w:t>GRU (시계열 회귀)</w:t>
+            </w:r>
+          </w:p>
+        </w:tc>
+      </w:tr>
+      <w:tr>
+        <w:tc>
+          <w:tcPr>
+            <w:tcW w:type="dxa" w:w="1984"/>
+            <w:shd w:val="clear" w:color="auto" w:fill="F2F2F2"/>
+          </w:tcPr>
+          <w:p>
+            <w:pPr>
+              <w:jc w:val="left"/>
+            </w:pPr>
+            <w:r>
+              <w:rPr>
+                <w:rFonts w:ascii="맑은 고딕" w:hAnsi="맑은 고딕"/>
+                <w:sz w:val="20"/>
+              </w:rPr>
+              <w:t>SHAP 방법</w:t>
+            </w:r>
+          </w:p>
+        </w:tc>
+        <w:tc>
+          <w:tcPr>
+            <w:tcW w:type="dxa" w:w="3118"/>
+            <w:shd w:val="clear" w:color="auto" w:fill="F2F2F2"/>
+          </w:tcPr>
+          <w:p>
+            <w:pPr>
+              <w:jc w:val="center"/>
+            </w:pPr>
+            <w:r>
+              <w:rPr>
+                <w:rFonts w:ascii="맑은 고딕" w:hAnsi="맑은 고딕"/>
+                <w:sz w:val="20"/>
+              </w:rPr>
+              <w:t>LinearExplainer</w:t>
+            </w:r>
+          </w:p>
+        </w:tc>
+        <w:tc>
+          <w:tcPr>
+            <w:tcW w:type="dxa" w:w="3118"/>
+            <w:shd w:val="clear" w:color="auto" w:fill="F2F2F2"/>
+          </w:tcPr>
+          <w:p>
+            <w:pPr>
+              <w:jc w:val="center"/>
+            </w:pPr>
+            <w:r>
+              <w:rPr>
+                <w:rFonts w:ascii="맑은 고딕" w:hAnsi="맑은 고딕"/>
+                <w:sz w:val="20"/>
+              </w:rPr>
+              <w:t>KernelExplainer (시간축 평균 근사)</w:t>
+            </w:r>
+          </w:p>
+        </w:tc>
+      </w:tr>
+      <w:tr>
+        <w:tc>
+          <w:tcPr>
+            <w:tcW w:type="dxa" w:w="1984"/>
+            <w:shd w:val="clear" w:color="auto" w:fill="FFFFFF"/>
+          </w:tcPr>
+          <w:p>
+            <w:pPr>
+              <w:jc w:val="left"/>
+            </w:pPr>
+            <w:r>
+              <w:rPr>
+                <w:rFonts w:ascii="맑은 고딕" w:hAnsi="맑은 고딕"/>
+                <w:sz w:val="20"/>
+              </w:rPr>
+              <w:t>소요 시간</w:t>
+            </w:r>
+          </w:p>
+        </w:tc>
+        <w:tc>
+          <w:tcPr>
+            <w:tcW w:type="dxa" w:w="3118"/>
+            <w:shd w:val="clear" w:color="auto" w:fill="FFFFFF"/>
+          </w:tcPr>
+          <w:p>
+            <w:pPr>
+              <w:jc w:val="center"/>
+            </w:pPr>
+            <w:r>
+              <w:rPr>
+                <w:rFonts w:ascii="맑은 고딕" w:hAnsi="맑은 고딕"/>
+                <w:sz w:val="20"/>
+              </w:rPr>
+              <w:t>&lt; 1초</w:t>
+            </w:r>
+          </w:p>
+        </w:tc>
+        <w:tc>
+          <w:tcPr>
+            <w:tcW w:type="dxa" w:w="3118"/>
+            <w:shd w:val="clear" w:color="auto" w:fill="FFFFFF"/>
+          </w:tcPr>
+          <w:p>
+            <w:pPr>
+              <w:jc w:val="center"/>
+            </w:pPr>
+            <w:r>
+              <w:rPr>
+                <w:rFonts w:ascii="맑은 고딕" w:hAnsi="맑은 고딕"/>
+                <w:sz w:val="20"/>
+              </w:rPr>
+              <w:t>약 25초 (CPU)</w:t>
+            </w:r>
+          </w:p>
+        </w:tc>
+      </w:tr>
+      <w:tr>
+        <w:tc>
+          <w:tcPr>
+            <w:tcW w:type="dxa" w:w="1984"/>
+            <w:shd w:val="clear" w:color="auto" w:fill="F2F2F2"/>
+          </w:tcPr>
+          <w:p>
+            <w:pPr>
+              <w:jc w:val="left"/>
+            </w:pPr>
+            <w:r>
+              <w:rPr>
+                <w:rFonts w:ascii="맑은 고딕" w:hAnsi="맑은 고딕"/>
+                <w:sz w:val="20"/>
+              </w:rPr>
+              <w:t>배경 샘플</w:t>
+            </w:r>
+          </w:p>
+        </w:tc>
+        <w:tc>
+          <w:tcPr>
+            <w:tcW w:type="dxa" w:w="3118"/>
+            <w:shd w:val="clear" w:color="auto" w:fill="F2F2F2"/>
+          </w:tcPr>
+          <w:p>
+            <w:pPr>
+              <w:jc w:val="center"/>
+            </w:pPr>
+            <w:r>
+              <w:rPr>
+                <w:rFonts w:ascii="맑은 고딕" w:hAnsi="맑은 고딕"/>
+                <w:sz w:val="20"/>
+              </w:rPr>
+              <w:t>200개 (train)</w:t>
+            </w:r>
+          </w:p>
+        </w:tc>
+        <w:tc>
+          <w:tcPr>
+            <w:tcW w:type="dxa" w:w="3118"/>
+            <w:shd w:val="clear" w:color="auto" w:fill="F2F2F2"/>
+          </w:tcPr>
+          <w:p>
+            <w:pPr>
+              <w:jc w:val="center"/>
+            </w:pPr>
+            <w:r>
+              <w:rPr>
+                <w:rFonts w:ascii="맑은 고딕" w:hAnsi="맑은 고딕"/>
+                <w:sz w:val="20"/>
+              </w:rPr>
+              <w:t>20개 (test 랜덤)</w:t>
+            </w:r>
+          </w:p>
+        </w:tc>
+      </w:tr>
+      <w:tr>
+        <w:tc>
+          <w:tcPr>
+            <w:tcW w:type="dxa" w:w="1984"/>
+            <w:shd w:val="clear" w:color="auto" w:fill="FFFFFF"/>
+          </w:tcPr>
+          <w:p>
+            <w:pPr>
+              <w:jc w:val="left"/>
+            </w:pPr>
+            <w:r>
+              <w:rPr>
+                <w:rFonts w:ascii="맑은 고딕" w:hAnsi="맑은 고딕"/>
+                <w:sz w:val="20"/>
+              </w:rPr>
+              <w:t>설명 샘플</w:t>
+            </w:r>
+          </w:p>
+        </w:tc>
+        <w:tc>
+          <w:tcPr>
+            <w:tcW w:type="dxa" w:w="3118"/>
+            <w:shd w:val="clear" w:color="auto" w:fill="FFFFFF"/>
+          </w:tcPr>
+          <w:p>
+            <w:pPr>
+              <w:jc w:val="center"/>
+            </w:pPr>
+            <w:r>
+              <w:rPr>
+                <w:rFonts w:ascii="맑은 고딕" w:hAnsi="맑은 고딕"/>
+                <w:sz w:val="20"/>
+              </w:rPr>
+              <w:t>전체 테스트 15,927건</w:t>
+            </w:r>
+          </w:p>
+        </w:tc>
+        <w:tc>
+          <w:tcPr>
+            <w:tcW w:type="dxa" w:w="3118"/>
+            <w:shd w:val="clear" w:color="auto" w:fill="FFFFFF"/>
+          </w:tcPr>
+          <w:p>
+            <w:pPr>
+              <w:jc w:val="center"/>
+            </w:pPr>
+            <w:r>
+              <w:rPr>
+                <w:rFonts w:ascii="맑은 고딕" w:hAnsi="맑은 고딕"/>
+                <w:sz w:val="20"/>
+              </w:rPr>
+              <w:t>50건 랜덤</w:t>
+            </w:r>
+          </w:p>
+        </w:tc>
+      </w:tr>
+      <w:tr>
+        <w:tc>
+          <w:tcPr>
+            <w:tcW w:type="dxa" w:w="1984"/>
+            <w:shd w:val="clear" w:color="auto" w:fill="F2F2F2"/>
+          </w:tcPr>
+          <w:p>
+            <w:pPr>
+              <w:jc w:val="left"/>
+            </w:pPr>
+            <w:r>
+              <w:rPr>
+                <w:rFonts w:ascii="맑은 고딕" w:hAnsi="맑은 고딕"/>
+                <w:sz w:val="20"/>
+              </w:rPr>
+              <w:t>입력 피처 수</w:t>
+            </w:r>
+          </w:p>
+        </w:tc>
+        <w:tc>
+          <w:tcPr>
+            <w:tcW w:type="dxa" w:w="3118"/>
+            <w:shd w:val="clear" w:color="auto" w:fill="F2F2F2"/>
+          </w:tcPr>
+          <w:p>
+            <w:pPr>
+              <w:jc w:val="center"/>
+            </w:pPr>
+            <w:r>
+              <w:rPr>
+                <w:rFonts w:ascii="맑은 고딕" w:hAnsi="맑은 고딕"/>
+                <w:sz w:val="20"/>
+              </w:rPr>
+              <w:t>9개 (기본 진동+온도)</w:t>
+            </w:r>
+          </w:p>
+        </w:tc>
+        <w:tc>
+          <w:tcPr>
+            <w:tcW w:type="dxa" w:w="3118"/>
+            <w:shd w:val="clear" w:color="auto" w:fill="F2F2F2"/>
+          </w:tcPr>
+          <w:p>
+            <w:pPr>
+              <w:jc w:val="center"/>
+            </w:pPr>
+            <w:r>
+              <w:rPr>
+                <w:rFonts w:ascii="맑은 고딕" w:hAnsi="맑은 고딕"/>
+                <w:sz w:val="20"/>
+              </w:rPr>
+              <w:t>12개 (기본+파생)</w:t>
+            </w:r>
+          </w:p>
+        </w:tc>
+      </w:tr>
+    </w:tbl>
+    <w:p/>
+    <w:p>
+      <w:r>
+        <w:rPr>
+          <w:rFonts w:ascii="맑은 고딕" w:hAnsi="맑은 고딕"/>
+          <w:b/>
+          <w:color w:val="1F4E79"/>
+          <w:sz w:val="22"/>
+        </w:rPr>
+        <w:t>E.1 분류 모델 SHAP Beeswarm (열화 감지)</w:t>
+      </w:r>
+    </w:p>
+    <w:p>
+      <w:r>
+        <w:rPr>
+          <w:rFonts w:ascii="맑은 고딕" w:hAnsi="맑은 고딕"/>
+          <w:sz w:val="20"/>
+        </w:rPr>
+        <w:t>X축은 SHAP 값(양수=열화 확률 상승, 음수=열화 확률 하강), 색상은 피처값 크기(빨강=높음, 파랑=낮음).</w:t>
+      </w:r>
+    </w:p>
+    <w:p>
+      <w:r>
+        <w:drawing>
+          <wp:inline xmlns:a="http://schemas.openxmlformats.org/drawingml/2006/main" xmlns:pic="http://schemas.openxmlformats.org/drawingml/2006/picture">
+            <wp:extent cx="4680000" cy="3088220"/>
+            <wp:docPr id="4" name="Picture 4"/>
+            <wp:cNvGraphicFramePr>
+              <a:graphicFrameLocks noChangeAspect="1"/>
+            </wp:cNvGraphicFramePr>
+            <a:graphic>
+              <a:graphicData uri="http://schemas.openxmlformats.org/drawingml/2006/picture">
+                <pic:pic>
+                  <pic:nvPicPr>
+                    <pic:cNvPr id="0" name="S1_shap_clf.png"/>
+                    <pic:cNvPicPr/>
+                  </pic:nvPicPr>
+                  <pic:blipFill>
+                    <a:blip r:embed="rId12"/>
+                    <a:stretch>
+                      <a:fillRect/>
+                    </a:stretch>
+                  </pic:blipFill>
+                  <pic:spPr>
+                    <a:xfrm>
+                      <a:off x="0" y="0"/>
+                      <a:ext cx="4680000" cy="3088220"/>
+                    </a:xfrm>
+                    <a:prstGeom prst="rect"/>
+                  </pic:spPr>
+                </pic:pic>
+              </a:graphicData>
+            </a:graphic>
+          </wp:inline>
+        </w:drawing>
+      </w:r>
+    </w:p>
+    <w:p/>
+    <w:tbl>
+      <w:tblPr>
+        <w:tblStyle w:val="TableGrid"/>
+        <w:tblW w:type="auto" w:w="0"/>
+        <w:tblLook w:firstColumn="1" w:firstRow="1" w:lastColumn="0" w:lastRow="0" w:noHBand="0" w:noVBand="1" w:val="04A0"/>
+      </w:tblPr>
+      <w:tblGrid>
+        <w:gridCol w:w="3135"/>
+        <w:gridCol w:w="3135"/>
+        <w:gridCol w:w="3135"/>
+      </w:tblGrid>
+      <w:tr>
+        <w:tc>
+          <w:tcPr>
+            <w:tcW w:type="dxa" w:w="2268"/>
+            <w:shd w:val="clear" w:color="auto" w:fill="1F4E79"/>
+          </w:tcPr>
+          <w:p>
+            <w:pPr>
+              <w:jc w:val="center"/>
+            </w:pPr>
+            <w:r>
+              <w:rPr>
+                <w:rFonts w:ascii="맑은 고딕" w:hAnsi="맑은 고딕"/>
+                <w:b/>
+                <w:color w:val="FFFFFF"/>
+                <w:sz w:val="20"/>
+              </w:rPr>
+              <w:t>피처</w:t>
+            </w:r>
+          </w:p>
+        </w:tc>
+        <w:tc>
+          <w:tcPr>
+            <w:tcW w:type="dxa" w:w="1701"/>
+            <w:shd w:val="clear" w:color="auto" w:fill="1F4E79"/>
+          </w:tcPr>
+          <w:p>
+            <w:pPr>
+              <w:jc w:val="center"/>
+            </w:pPr>
+            <w:r>
+              <w:rPr>
+                <w:rFonts w:ascii="맑은 고딕" w:hAnsi="맑은 고딕"/>
+                <w:b/>
+                <w:color w:val="FFFFFF"/>
+                <w:sz w:val="20"/>
+              </w:rPr>
+              <w:t>SHAP 방향</w:t>
+            </w:r>
+          </w:p>
+        </w:tc>
+        <w:tc>
+          <w:tcPr>
+            <w:tcW w:type="dxa" w:w="4252"/>
+            <w:shd w:val="clear" w:color="auto" w:fill="1F4E79"/>
+          </w:tcPr>
+          <w:p>
+            <w:pPr>
+              <w:jc w:val="center"/>
+            </w:pPr>
+            <w:r>
+              <w:rPr>
+                <w:rFonts w:ascii="맑은 고딕" w:hAnsi="맑은 고딕"/>
+                <w:b/>
+                <w:color w:val="FFFFFF"/>
+                <w:sz w:val="20"/>
+              </w:rPr>
+              <w:t>해석</w:t>
+            </w:r>
+          </w:p>
+        </w:tc>
+      </w:tr>
+      <w:tr>
+        <w:tc>
+          <w:tcPr>
+            <w:tcW w:type="dxa" w:w="2268"/>
+            <w:shd w:val="clear" w:color="auto" w:fill="FFFFFF"/>
+          </w:tcPr>
+          <w:p>
+            <w:pPr>
+              <w:jc w:val="left"/>
+            </w:pPr>
+            <w:r>
+              <w:rPr>
+                <w:rFonts w:ascii="맑은 고딕" w:hAnsi="맑은 고딕"/>
+                <w:sz w:val="20"/>
+              </w:rPr>
+              <w:t>h_rms (수평 RMS)</w:t>
+            </w:r>
+          </w:p>
+        </w:tc>
+        <w:tc>
+          <w:tcPr>
+            <w:tcW w:type="dxa" w:w="1701"/>
+            <w:shd w:val="clear" w:color="auto" w:fill="FFFFFF"/>
+          </w:tcPr>
+          <w:p>
+            <w:pPr>
+              <w:jc w:val="center"/>
+            </w:pPr>
+            <w:r>
+              <w:rPr>
+                <w:rFonts w:ascii="맑은 고딕" w:hAnsi="맑은 고딕"/>
+                <w:sz w:val="20"/>
+              </w:rPr>
+              <w:t>양수 (열화+)</w:t>
+            </w:r>
+          </w:p>
+        </w:tc>
+        <w:tc>
+          <w:tcPr>
+            <w:tcW w:type="dxa" w:w="4252"/>
+            <w:shd w:val="clear" w:color="auto" w:fill="FFFFFF"/>
+          </w:tcPr>
+          <w:p>
+            <w:pPr>
+              <w:jc w:val="center"/>
+            </w:pPr>
+            <w:r>
+              <w:rPr>
+                <w:rFonts w:ascii="맑은 고딕" w:hAnsi="맑은 고딕"/>
+                <w:sz w:val="20"/>
+              </w:rPr>
+              <w:t>가장 중요한 피처. 값 클수록 열화 확률 크게 상승</w:t>
+            </w:r>
+          </w:p>
+        </w:tc>
+      </w:tr>
+      <w:tr>
+        <w:tc>
+          <w:tcPr>
+            <w:tcW w:type="dxa" w:w="2268"/>
+            <w:shd w:val="clear" w:color="auto" w:fill="F2F2F2"/>
+          </w:tcPr>
+          <w:p>
+            <w:pPr>
+              <w:jc w:val="left"/>
+            </w:pPr>
+            <w:r>
+              <w:rPr>
+                <w:rFonts w:ascii="맑은 고딕" w:hAnsi="맑은 고딕"/>
+                <w:sz w:val="20"/>
+              </w:rPr>
+              <w:t>h_kurt (첨도)</w:t>
+            </w:r>
+          </w:p>
+        </w:tc>
+        <w:tc>
+          <w:tcPr>
+            <w:tcW w:type="dxa" w:w="1701"/>
+            <w:shd w:val="clear" w:color="auto" w:fill="F2F2F2"/>
+          </w:tcPr>
+          <w:p>
+            <w:pPr>
+              <w:jc w:val="center"/>
+            </w:pPr>
+            <w:r>
+              <w:rPr>
+                <w:rFonts w:ascii="맑은 고딕" w:hAnsi="맑은 고딕"/>
+                <w:sz w:val="20"/>
+              </w:rPr>
+              <w:t>양수 (열화+)</w:t>
+            </w:r>
+          </w:p>
+        </w:tc>
+        <w:tc>
+          <w:tcPr>
+            <w:tcW w:type="dxa" w:w="4252"/>
+            <w:shd w:val="clear" w:color="auto" w:fill="F2F2F2"/>
+          </w:tcPr>
+          <w:p>
+            <w:pPr>
+              <w:jc w:val="center"/>
+            </w:pPr>
+            <w:r>
+              <w:rPr>
+                <w:rFonts w:ascii="맑은 고딕" w:hAnsi="맑은 고딕"/>
+                <w:sz w:val="20"/>
+              </w:rPr>
+              <w:t>충격성 이상 감지. 높은 첨도 = 충격적 열화 패턴</w:t>
+            </w:r>
+          </w:p>
+        </w:tc>
+      </w:tr>
+      <w:tr>
+        <w:tc>
+          <w:tcPr>
+            <w:tcW w:type="dxa" w:w="2268"/>
+            <w:shd w:val="clear" w:color="auto" w:fill="FFFFFF"/>
+          </w:tcPr>
+          <w:p>
+            <w:pPr>
+              <w:jc w:val="left"/>
+            </w:pPr>
+            <w:r>
+              <w:rPr>
+                <w:rFonts w:ascii="맑은 고딕" w:hAnsi="맑은 고딕"/>
+                <w:sz w:val="20"/>
+              </w:rPr>
+              <w:t>rms_ratio (h/v 비율)</w:t>
+            </w:r>
+          </w:p>
+        </w:tc>
+        <w:tc>
+          <w:tcPr>
+            <w:tcW w:type="dxa" w:w="1701"/>
+            <w:shd w:val="clear" w:color="auto" w:fill="FFFFFF"/>
+          </w:tcPr>
+          <w:p>
+            <w:pPr>
+              <w:jc w:val="center"/>
+            </w:pPr>
+            <w:r>
+              <w:rPr>
+                <w:rFonts w:ascii="맑은 고딕" w:hAnsi="맑은 고딕"/>
+                <w:sz w:val="20"/>
+              </w:rPr>
+              <w:t>양수 (열화+)</w:t>
+            </w:r>
+          </w:p>
+        </w:tc>
+        <w:tc>
+          <w:tcPr>
+            <w:tcW w:type="dxa" w:w="4252"/>
+            <w:shd w:val="clear" w:color="auto" w:fill="FFFFFF"/>
+          </w:tcPr>
+          <w:p>
+            <w:pPr>
+              <w:jc w:val="center"/>
+            </w:pPr>
+            <w:r>
+              <w:rPr>
+                <w:rFonts w:ascii="맑은 고딕" w:hAnsi="맑은 고딕"/>
+                <w:sz w:val="20"/>
+              </w:rPr>
+              <w:t>수평/수직 불균형. 특정 방향 마모 반영</w:t>
+            </w:r>
+          </w:p>
+        </w:tc>
+      </w:tr>
+      <w:tr>
+        <w:tc>
+          <w:tcPr>
+            <w:tcW w:type="dxa" w:w="2268"/>
+            <w:shd w:val="clear" w:color="auto" w:fill="F2F2F2"/>
+          </w:tcPr>
+          <w:p>
+            <w:pPr>
+              <w:jc w:val="left"/>
+            </w:pPr>
+            <w:r>
+              <w:rPr>
+                <w:rFonts w:ascii="맑은 고딕" w:hAnsi="맑은 고딕"/>
+                <w:sz w:val="20"/>
+              </w:rPr>
+              <w:t>h_skew (비대칭도)</w:t>
+            </w:r>
+          </w:p>
+        </w:tc>
+        <w:tc>
+          <w:tcPr>
+            <w:tcW w:type="dxa" w:w="1701"/>
+            <w:shd w:val="clear" w:color="auto" w:fill="F2F2F2"/>
+          </w:tcPr>
+          <w:p>
+            <w:pPr>
+              <w:jc w:val="center"/>
+            </w:pPr>
+            <w:r>
+              <w:rPr>
+                <w:rFonts w:ascii="맑은 고딕" w:hAnsi="맑은 고딕"/>
+                <w:sz w:val="20"/>
+              </w:rPr>
+              <w:t>약한 영향</w:t>
+            </w:r>
+          </w:p>
+        </w:tc>
+        <w:tc>
+          <w:tcPr>
+            <w:tcW w:type="dxa" w:w="4252"/>
+            <w:shd w:val="clear" w:color="auto" w:fill="F2F2F2"/>
+          </w:tcPr>
+          <w:p>
+            <w:pPr>
+              <w:jc w:val="center"/>
+            </w:pPr>
+            <w:r>
+              <w:rPr>
+                <w:rFonts w:ascii="맑은 고딕" w:hAnsi="맑은 고딕"/>
+                <w:sz w:val="20"/>
+              </w:rPr>
+              <w:t>신호 분포 왜곡. h_kurt와 연관</w:t>
+            </w:r>
+          </w:p>
+        </w:tc>
+      </w:tr>
+      <w:tr>
+        <w:tc>
+          <w:tcPr>
+            <w:tcW w:type="dxa" w:w="2268"/>
+            <w:shd w:val="clear" w:color="auto" w:fill="FFFFFF"/>
+          </w:tcPr>
+          <w:p>
+            <w:pPr>
+              <w:jc w:val="left"/>
+            </w:pPr>
+            <w:r>
+              <w:rPr>
+                <w:rFonts w:ascii="맑은 고딕" w:hAnsi="맑은 고딕"/>
+                <w:sz w:val="20"/>
+              </w:rPr>
+              <w:t>temp_mean</w:t>
+            </w:r>
+          </w:p>
+        </w:tc>
+        <w:tc>
+          <w:tcPr>
+            <w:tcW w:type="dxa" w:w="1701"/>
+            <w:shd w:val="clear" w:color="auto" w:fill="FFFFFF"/>
+          </w:tcPr>
+          <w:p>
+            <w:pPr>
+              <w:jc w:val="center"/>
+            </w:pPr>
+            <w:r>
+              <w:rPr>
+                <w:rFonts w:ascii="맑은 고딕" w:hAnsi="맑은 고딕"/>
+                <w:sz w:val="20"/>
+              </w:rPr>
+              <w:t>기여도 0</w:t>
+            </w:r>
+          </w:p>
+        </w:tc>
+        <w:tc>
+          <w:tcPr>
+            <w:tcW w:type="dxa" w:w="4252"/>
+            <w:shd w:val="clear" w:color="auto" w:fill="FFFFFF"/>
+          </w:tcPr>
+          <w:p>
+            <w:pPr>
+              <w:jc w:val="center"/>
+            </w:pPr>
+            <w:r>
+              <w:rPr>
+                <w:rFonts w:ascii="맑은 고딕" w:hAnsi="맑은 고딕"/>
+                <w:sz w:val="20"/>
+              </w:rPr>
+              <w:t>온도 데이터 없어 0으로 처리 (Cloud/로컬 환경 제한)</w:t>
+            </w:r>
+          </w:p>
+        </w:tc>
+      </w:tr>
+    </w:tbl>
+    <w:p/>
+    <w:p>
+      <w:r>
+        <w:rPr>
+          <w:rFonts w:ascii="맑은 고딕" w:hAnsi="맑은 고딕"/>
+          <w:sz w:val="18"/>
+        </w:rPr>
+        <w:t>결론: 수평 진동 크기(h_rms)와 충격성(h_kurt) 조합이 열화 여부 결정에 지배적.</w:t>
+        <w:br/>
+        <w:t>온도 피처(temp_mean)는 현 데이터에서 활용 불가 - 온도 센서 추가 시 설명력 향상 기대.</w:t>
+      </w:r>
+    </w:p>
+    <w:p/>
+    <w:p>
+      <w:r>
+        <w:rPr>
+          <w:rFonts w:ascii="맑은 고딕" w:hAnsi="맑은 고딕"/>
+          <w:b/>
+          <w:color w:val="1F4E79"/>
+          <w:sz w:val="22"/>
+        </w:rPr>
+        <w:t>E.2 GRU v2 RUL 모델 SHAP Beeswarm</w:t>
+      </w:r>
+    </w:p>
+    <w:p>
+      <w:r>
+        <w:rPr>
+          <w:rFonts w:ascii="맑은 고딕" w:hAnsi="맑은 고딕"/>
+          <w:sz w:val="20"/>
+        </w:rPr>
+        <w:t>GRU 시계열 입력(윈도우 20스텝)을 시간축 평균으로 압축한 KernelExplainer 근사 결과.</w:t>
+        <w:br/>
+        <w:t>X축 양수=RUL 증가(오래 남음), 음수=RUL 감소(조기 고장).</w:t>
+      </w:r>
+    </w:p>
+    <w:p>
+      <w:r>
+        <w:drawing>
+          <wp:inline xmlns:a="http://schemas.openxmlformats.org/drawingml/2006/main" xmlns:pic="http://schemas.openxmlformats.org/drawingml/2006/picture">
+            <wp:extent cx="4680000" cy="3100604"/>
+            <wp:docPr id="5" name="Picture 5"/>
+            <wp:cNvGraphicFramePr>
+              <a:graphicFrameLocks noChangeAspect="1"/>
+            </wp:cNvGraphicFramePr>
+            <a:graphic>
+              <a:graphicData uri="http://schemas.openxmlformats.org/drawingml/2006/picture">
+                <pic:pic>
+                  <pic:nvPicPr>
+                    <pic:cNvPr id="0" name="S2_shap_gru.png"/>
+                    <pic:cNvPicPr/>
+                  </pic:nvPicPr>
+                  <pic:blipFill>
+                    <a:blip r:embed="rId13"/>
+                    <a:stretch>
+                      <a:fillRect/>
+                    </a:stretch>
+                  </pic:blipFill>
+                  <pic:spPr>
+                    <a:xfrm>
+                      <a:off x="0" y="0"/>
+                      <a:ext cx="4680000" cy="3100604"/>
+                    </a:xfrm>
+                    <a:prstGeom prst="rect"/>
+                  </pic:spPr>
+                </pic:pic>
+              </a:graphicData>
+            </a:graphic>
+          </wp:inline>
+        </w:drawing>
+      </w:r>
+    </w:p>
+    <w:p/>
+    <w:tbl>
+      <w:tblPr>
+        <w:tblStyle w:val="TableGrid"/>
+        <w:tblW w:type="auto" w:w="0"/>
+        <w:tblLook w:firstColumn="1" w:firstRow="1" w:lastColumn="0" w:lastRow="0" w:noHBand="0" w:noVBand="1" w:val="04A0"/>
+      </w:tblPr>
+      <w:tblGrid>
+        <w:gridCol w:w="3135"/>
+        <w:gridCol w:w="3135"/>
+        <w:gridCol w:w="3135"/>
+      </w:tblGrid>
+      <w:tr>
+        <w:tc>
+          <w:tcPr>
+            <w:tcW w:type="dxa" w:w="2551"/>
+            <w:shd w:val="clear" w:color="auto" w:fill="1F4E79"/>
+          </w:tcPr>
+          <w:p>
+            <w:pPr>
+              <w:jc w:val="center"/>
+            </w:pPr>
+            <w:r>
+              <w:rPr>
+                <w:rFonts w:ascii="맑은 고딕" w:hAnsi="맑은 고딕"/>
+                <w:b/>
+                <w:color w:val="FFFFFF"/>
+                <w:sz w:val="20"/>
+              </w:rPr>
+              <w:t>피처</w:t>
+            </w:r>
+          </w:p>
+        </w:tc>
+        <w:tc>
+          <w:tcPr>
+            <w:tcW w:type="dxa" w:w="1701"/>
+            <w:shd w:val="clear" w:color="auto" w:fill="1F4E79"/>
+          </w:tcPr>
+          <w:p>
+            <w:pPr>
+              <w:jc w:val="center"/>
+            </w:pPr>
+            <w:r>
+              <w:rPr>
+                <w:rFonts w:ascii="맑은 고딕" w:hAnsi="맑은 고딕"/>
+                <w:b/>
+                <w:color w:val="FFFFFF"/>
+                <w:sz w:val="20"/>
+              </w:rPr>
+              <w:t>SHAP 방향</w:t>
+            </w:r>
+          </w:p>
+        </w:tc>
+        <w:tc>
+          <w:tcPr>
+            <w:tcW w:type="dxa" w:w="3969"/>
+            <w:shd w:val="clear" w:color="auto" w:fill="1F4E79"/>
+          </w:tcPr>
+          <w:p>
+            <w:pPr>
+              <w:jc w:val="center"/>
+            </w:pPr>
+            <w:r>
+              <w:rPr>
+                <w:rFonts w:ascii="맑은 고딕" w:hAnsi="맑은 고딕"/>
+                <w:b/>
+                <w:color w:val="FFFFFF"/>
+                <w:sz w:val="20"/>
+              </w:rPr>
+              <w:t>해석</w:t>
+            </w:r>
+          </w:p>
+        </w:tc>
+      </w:tr>
+      <w:tr>
+        <w:tc>
+          <w:tcPr>
+            <w:tcW w:type="dxa" w:w="2551"/>
+            <w:shd w:val="clear" w:color="auto" w:fill="FFFFFF"/>
+          </w:tcPr>
+          <w:p>
+            <w:pPr>
+              <w:jc w:val="left"/>
+            </w:pPr>
+            <w:r>
+              <w:rPr>
+                <w:rFonts w:ascii="맑은 고딕" w:hAnsi="맑은 고딕"/>
+                <w:sz w:val="20"/>
+              </w:rPr>
+              <w:t>energy (총 진동 에너지)</w:t>
+            </w:r>
+          </w:p>
+        </w:tc>
+        <w:tc>
+          <w:tcPr>
+            <w:tcW w:type="dxa" w:w="1701"/>
+            <w:shd w:val="clear" w:color="auto" w:fill="FFFFFF"/>
+          </w:tcPr>
+          <w:p>
+            <w:pPr>
+              <w:jc w:val="center"/>
+            </w:pPr>
+            <w:r>
+              <w:rPr>
+                <w:rFonts w:ascii="맑은 고딕" w:hAnsi="맑은 고딕"/>
+                <w:sz w:val="20"/>
+              </w:rPr>
+              <w:t>음수 (RUL-)</w:t>
+            </w:r>
+          </w:p>
+        </w:tc>
+        <w:tc>
+          <w:tcPr>
+            <w:tcW w:type="dxa" w:w="3969"/>
+            <w:shd w:val="clear" w:color="auto" w:fill="FFFFFF"/>
+          </w:tcPr>
+          <w:p>
+            <w:pPr>
+              <w:jc w:val="center"/>
+            </w:pPr>
+            <w:r>
+              <w:rPr>
+                <w:rFonts w:ascii="맑은 고딕" w:hAnsi="맑은 고딕"/>
+                <w:sz w:val="20"/>
+              </w:rPr>
+              <w:t>h_rms^2 + v_rms^2. 에너지 높을수록 잔여수명 단축</w:t>
+            </w:r>
+          </w:p>
+        </w:tc>
+      </w:tr>
+      <w:tr>
+        <w:tc>
+          <w:tcPr>
+            <w:tcW w:type="dxa" w:w="2551"/>
+            <w:shd w:val="clear" w:color="auto" w:fill="F2F2F2"/>
+          </w:tcPr>
+          <w:p>
+            <w:pPr>
+              <w:jc w:val="left"/>
+            </w:pPr>
+            <w:r>
+              <w:rPr>
+                <w:rFonts w:ascii="맑은 고딕" w:hAnsi="맑은 고딕"/>
+                <w:sz w:val="20"/>
+              </w:rPr>
+              <w:t>h_rms</w:t>
+            </w:r>
+          </w:p>
+        </w:tc>
+        <w:tc>
+          <w:tcPr>
+            <w:tcW w:type="dxa" w:w="1701"/>
+            <w:shd w:val="clear" w:color="auto" w:fill="F2F2F2"/>
+          </w:tcPr>
+          <w:p>
+            <w:pPr>
+              <w:jc w:val="center"/>
+            </w:pPr>
+            <w:r>
+              <w:rPr>
+                <w:rFonts w:ascii="맑은 고딕" w:hAnsi="맑은 고딕"/>
+                <w:sz w:val="20"/>
+              </w:rPr>
+              <w:t>음수 (RUL-)</w:t>
+            </w:r>
+          </w:p>
+        </w:tc>
+        <w:tc>
+          <w:tcPr>
+            <w:tcW w:type="dxa" w:w="3969"/>
+            <w:shd w:val="clear" w:color="auto" w:fill="F2F2F2"/>
+          </w:tcPr>
+          <w:p>
+            <w:pPr>
+              <w:jc w:val="center"/>
+            </w:pPr>
+            <w:r>
+              <w:rPr>
+                <w:rFonts w:ascii="맑은 고딕" w:hAnsi="맑은 고딕"/>
+                <w:sz w:val="20"/>
+              </w:rPr>
+              <w:t>에너지와 동반 상승. 고진동 = 고장 임박 신호</w:t>
+            </w:r>
+          </w:p>
+        </w:tc>
+      </w:tr>
+      <w:tr>
+        <w:tc>
+          <w:tcPr>
+            <w:tcW w:type="dxa" w:w="2551"/>
+            <w:shd w:val="clear" w:color="auto" w:fill="FFFFFF"/>
+          </w:tcPr>
+          <w:p>
+            <w:pPr>
+              <w:jc w:val="left"/>
+            </w:pPr>
+            <w:r>
+              <w:rPr>
+                <w:rFonts w:ascii="맑은 고딕" w:hAnsi="맑은 고딕"/>
+                <w:sz w:val="20"/>
+              </w:rPr>
+              <w:t>health_idx (건강 지수)</w:t>
+            </w:r>
+          </w:p>
+        </w:tc>
+        <w:tc>
+          <w:tcPr>
+            <w:tcW w:type="dxa" w:w="1701"/>
+            <w:shd w:val="clear" w:color="auto" w:fill="FFFFFF"/>
+          </w:tcPr>
+          <w:p>
+            <w:pPr>
+              <w:jc w:val="center"/>
+            </w:pPr>
+            <w:r>
+              <w:rPr>
+                <w:rFonts w:ascii="맑은 고딕" w:hAnsi="맑은 고딕"/>
+                <w:sz w:val="20"/>
+              </w:rPr>
+              <w:t>음수 (RUL-)</w:t>
+            </w:r>
+          </w:p>
+        </w:tc>
+        <w:tc>
+          <w:tcPr>
+            <w:tcW w:type="dxa" w:w="3969"/>
+            <w:shd w:val="clear" w:color="auto" w:fill="FFFFFF"/>
+          </w:tcPr>
+          <w:p>
+            <w:pPr>
+              <w:jc w:val="center"/>
+            </w:pPr>
+            <w:r>
+              <w:rPr>
+                <w:rFonts w:ascii="맑은 고딕" w:hAnsi="맑은 고딕"/>
+                <w:sz w:val="20"/>
+              </w:rPr>
+              <w:t>h_rms x h_kurt 복합 지표. 악화 가속 반영</w:t>
+            </w:r>
+          </w:p>
+        </w:tc>
+      </w:tr>
+      <w:tr>
+        <w:tc>
+          <w:tcPr>
+            <w:tcW w:type="dxa" w:w="2551"/>
+            <w:shd w:val="clear" w:color="auto" w:fill="F2F2F2"/>
+          </w:tcPr>
+          <w:p>
+            <w:pPr>
+              <w:jc w:val="left"/>
+            </w:pPr>
+            <w:r>
+              <w:rPr>
+                <w:rFonts w:ascii="맑은 고딕" w:hAnsi="맑은 고딕"/>
+                <w:sz w:val="20"/>
+              </w:rPr>
+              <w:t>v_rms (수직 RMS)</w:t>
+            </w:r>
+          </w:p>
+        </w:tc>
+        <w:tc>
+          <w:tcPr>
+            <w:tcW w:type="dxa" w:w="1701"/>
+            <w:shd w:val="clear" w:color="auto" w:fill="F2F2F2"/>
+          </w:tcPr>
+          <w:p>
+            <w:pPr>
+              <w:jc w:val="center"/>
+            </w:pPr>
+            <w:r>
+              <w:rPr>
+                <w:rFonts w:ascii="맑은 고딕" w:hAnsi="맑은 고딕"/>
+                <w:sz w:val="20"/>
+              </w:rPr>
+              <w:t>약한 음수</w:t>
+            </w:r>
+          </w:p>
+        </w:tc>
+        <w:tc>
+          <w:tcPr>
+            <w:tcW w:type="dxa" w:w="3969"/>
+            <w:shd w:val="clear" w:color="auto" w:fill="F2F2F2"/>
+          </w:tcPr>
+          <w:p>
+            <w:pPr>
+              <w:jc w:val="center"/>
+            </w:pPr>
+            <w:r>
+              <w:rPr>
+                <w:rFonts w:ascii="맑은 고딕" w:hAnsi="맑은 고딕"/>
+                <w:sz w:val="20"/>
+              </w:rPr>
+              <w:t>수직 방향 진동도 RUL에 기여 (수평보다 약함)</w:t>
+            </w:r>
+          </w:p>
+        </w:tc>
+      </w:tr>
+    </w:tbl>
+    <w:p/>
+    <w:p>
+      <w:r>
+        <w:rPr>
+          <w:rFonts w:ascii="맑은 고딕" w:hAnsi="맑은 고딕"/>
+          <w:b/>
+          <w:color w:val="1F4E79"/>
+          <w:sz w:val="22"/>
+        </w:rPr>
+        <w:t>E.3 두 모델 피처 중요도 비교</w:t>
+      </w:r>
+    </w:p>
+    <w:p>
+      <w:r>
+        <w:rPr>
+          <w:rFonts w:ascii="맑은 고딕" w:hAnsi="맑은 고딕"/>
+          <w:sz w:val="20"/>
+        </w:rPr>
+        <w:t>|SHAP 값| 평균으로 산출한 피처별 전체 중요도 순위 비교.</w:t>
+      </w:r>
+    </w:p>
+    <w:p>
+      <w:r>
+        <w:drawing>
+          <wp:inline xmlns:a="http://schemas.openxmlformats.org/drawingml/2006/main" xmlns:pic="http://schemas.openxmlformats.org/drawingml/2006/picture">
+            <wp:extent cx="5400000" cy="2025000"/>
+            <wp:docPr id="6" name="Picture 6"/>
+            <wp:cNvGraphicFramePr>
+              <a:graphicFrameLocks noChangeAspect="1"/>
+            </wp:cNvGraphicFramePr>
+            <a:graphic>
+              <a:graphicData uri="http://schemas.openxmlformats.org/drawingml/2006/picture">
+                <pic:pic>
+                  <pic:nvPicPr>
+                    <pic:cNvPr id="0" name="S3_shap_bar.png"/>
+                    <pic:cNvPicPr/>
+                  </pic:nvPicPr>
+                  <pic:blipFill>
+                    <a:blip r:embed="rId14"/>
+                    <a:stretch>
+                      <a:fillRect/>
+                    </a:stretch>
+                  </pic:blipFill>
+                  <pic:spPr>
+                    <a:xfrm>
+                      <a:off x="0" y="0"/>
+                      <a:ext cx="5400000" cy="2025000"/>
+                    </a:xfrm>
+                    <a:prstGeom prst="rect"/>
+                  </pic:spPr>
+                </pic:pic>
+              </a:graphicData>
+            </a:graphic>
+          </wp:inline>
+        </w:drawing>
+      </w:r>
+    </w:p>
+    <w:p/>
+    <w:p>
+      <w:r>
+        <w:rPr>
+          <w:rFonts w:ascii="맑은 고딕" w:hAnsi="맑은 고딕"/>
+          <w:sz w:val="20"/>
+        </w:rPr>
+        <w:t>결론:</w:t>
+        <w:br/>
+        <w:t xml:space="preserve"> - 두 모델 모두 h_rms가 상위권: 수평 진동 크기가 베어링 상태의 핵심 지표</w:t>
+        <w:br/>
+        <w:t xml:space="preserve"> - RUL 회귀에서 energy 파생 피처가 단독 1위: 총 에너지 누적이 잔여수명 예측에 결정적</w:t>
+        <w:br/>
+        <w:t xml:space="preserve"> - 분류에서 rms_ratio(방향 불균형)가 3위: 방향성 이상이 열화 감지에 효과적</w:t>
+        <w:br/>
+        <w:t xml:space="preserve"> - SHAP 분석으로 모델 내부 논리 검증 완료 - 물리적 직관과 일치함을 확인</w:t>
+      </w:r>
+    </w:p>
     <w:sectPr>
       <w:pgSz w:w="12240" w:h="15840"/>
       <w:pgMar w:top="1134" w:right="1417" w:bottom="1134" w:left="1417" w:header="720" w:footer="720" w:gutter="0"/>

</xml_diff>

<commit_message>
feat: DL Streamlit 탭4 리뉴얼 + PPT/Word 산출물 최신화
Streamlit (app/streamlit_femto.py):
- 탭1 이름에 '(demo data loading)' 추가
- 탭4 '통합 진단': ML+DL 2단 진단 비교 expander 추가
- 탭4 서브탭 추가 — CSV 일괄 진단(FEMTO CSV 업로드 → ML+DL 배치 예측, 결과 다운로드)
- Streamlit Cloud 빨간 에러 수정: @st.cache_data 빈 DataFrame 캐시 버그 fix
- 홈에 ML 앱(mlfactoryautomation.streamlit.app) 링크 버튼 추가

PPT (딥러닝_FEMTO_RUL_발표자료.pptx) 21장:
- 슬라이드 12 신규: ML+DL 통합으로 PdM 고장예지 범위 확장 (결론 확장)
- 슬라이드 17 신규: SHAP 핵심 인사이트 (S3 bar chart + 3가지 key finding)

Word (딥러닝_산출물_20260625_FEMTO_RUL_발표용.docx):
- 부록 E.4 SHAP 분석 (fallback 설명, 장단점 표)
- 부록 F RAG Level 1/2 시스템 (FAISS + cosine + weighted RUL)
</commit_message>
<xml_diff>
--- a/Homework/DL_FactoryAutomation/산출물/딥러닝_산출물_20260625_FEMTO_RUL_발표용.docx
+++ b/Homework/DL_FactoryAutomation/산출물/딥러닝_산출물_20260625_FEMTO_RUL_발표용.docx
@@ -20664,6 +20664,1485 @@
         <w:t xml:space="preserve"> - 분류에서 rms_ratio(방향 불균형)가 3위: 방향성 이상이 열화 감지에 효과적</w:t>
         <w:br/>
         <w:t xml:space="preserve"> - SHAP 분석으로 모델 내부 논리 검증 완료 - 물리적 직관과 일치함을 확인</w:t>
+      </w:r>
+    </w:p>
+    <w:p>
+      <w:r>
+        <w:br w:type="page"/>
+      </w:r>
+    </w:p>
+    <w:p>
+      <w:r>
+        <w:rPr>
+          <w:rFonts w:ascii="Malgun Gothic" w:hAnsi="Malgun Gothic"/>
+          <w:b/>
+          <w:color w:val="1F4E79"/>
+          <w:sz w:val="26"/>
+        </w:rPr>
+        <w:t>E.4 SHAP 분석 결과물 및 상세 해석</w:t>
+      </w:r>
+    </w:p>
+    <w:p>
+      <w:r>
+        <w:rPr>
+          <w:rFonts w:ascii="Malgun Gothic" w:hAnsi="Malgun Gothic"/>
+          <w:b w:val="0"/>
+          <w:sz w:val="20"/>
+        </w:rPr>
+        <w:t>분석은 로컬 CPU에서 약 30초 만에 완료됐고 세 개의 그림 파일을 만들어냈습니다.</w:t>
+      </w:r>
+    </w:p>
+    <w:p/>
+    <w:tbl>
+      <w:tblPr>
+        <w:tblStyle w:val="TableGrid"/>
+        <w:tblW w:type="auto" w:w="0"/>
+        <w:tblLook w:firstColumn="1" w:firstRow="1" w:lastColumn="0" w:lastRow="0" w:noHBand="0" w:noVBand="1" w:val="04A0"/>
+      </w:tblPr>
+      <w:tblGrid>
+        <w:gridCol w:w="2351"/>
+        <w:gridCol w:w="2351"/>
+        <w:gridCol w:w="2351"/>
+        <w:gridCol w:w="2351"/>
+      </w:tblGrid>
+      <w:tr>
+        <w:tc>
+          <w:tcPr>
+            <w:tcW w:type="dxa" w:w="1984"/>
+            <w:shd w:val="clear" w:color="auto" w:fill="1F4E79"/>
+          </w:tcPr>
+          <w:p>
+            <w:pPr>
+              <w:jc w:val="center"/>
+            </w:pPr>
+            <w:r>
+              <w:rPr>
+                <w:rFonts w:ascii="Malgun Gothic" w:hAnsi="Malgun Gothic"/>
+                <w:b/>
+                <w:color w:val="FFFFFF"/>
+                <w:sz w:val="20"/>
+              </w:rPr>
+              <w:t>파일</w:t>
+            </w:r>
+          </w:p>
+        </w:tc>
+        <w:tc>
+          <w:tcPr>
+            <w:tcW w:type="dxa" w:w="2835"/>
+            <w:shd w:val="clear" w:color="auto" w:fill="1F4E79"/>
+          </w:tcPr>
+          <w:p>
+            <w:pPr>
+              <w:jc w:val="center"/>
+            </w:pPr>
+            <w:r>
+              <w:rPr>
+                <w:rFonts w:ascii="Malgun Gothic" w:hAnsi="Malgun Gothic"/>
+                <w:b/>
+                <w:color w:val="FFFFFF"/>
+                <w:sz w:val="20"/>
+              </w:rPr>
+              <w:t>내용</w:t>
+            </w:r>
+          </w:p>
+        </w:tc>
+        <w:tc>
+          <w:tcPr>
+            <w:tcW w:type="dxa" w:w="2551"/>
+            <w:shd w:val="clear" w:color="auto" w:fill="1F4E79"/>
+          </w:tcPr>
+          <w:p>
+            <w:pPr>
+              <w:jc w:val="center"/>
+            </w:pPr>
+            <w:r>
+              <w:rPr>
+                <w:rFonts w:ascii="Malgun Gothic" w:hAnsi="Malgun Gothic"/>
+                <w:b/>
+                <w:color w:val="FFFFFF"/>
+                <w:sz w:val="20"/>
+              </w:rPr>
+              <w:t>방법</w:t>
+            </w:r>
+          </w:p>
+        </w:tc>
+        <w:tc>
+          <w:tcPr>
+            <w:tcW w:type="dxa" w:w="850"/>
+            <w:shd w:val="clear" w:color="auto" w:fill="1F4E79"/>
+          </w:tcPr>
+          <w:p>
+            <w:pPr>
+              <w:jc w:val="center"/>
+            </w:pPr>
+            <w:r>
+              <w:rPr>
+                <w:rFonts w:ascii="Malgun Gothic" w:hAnsi="Malgun Gothic"/>
+                <w:b/>
+                <w:color w:val="FFFFFF"/>
+                <w:sz w:val="20"/>
+              </w:rPr>
+              <w:t>소요 시간</w:t>
+            </w:r>
+          </w:p>
+        </w:tc>
+      </w:tr>
+      <w:tr>
+        <w:tc>
+          <w:tcPr>
+            <w:tcW w:type="dxa" w:w="1984"/>
+            <w:shd w:val="clear" w:color="auto" w:fill="FFFFFF"/>
+          </w:tcPr>
+          <w:p>
+            <w:pPr>
+              <w:jc w:val="left"/>
+            </w:pPr>
+            <w:r>
+              <w:rPr>
+                <w:rFonts w:ascii="Malgun Gothic" w:hAnsi="Malgun Gothic"/>
+                <w:sz w:val="20"/>
+              </w:rPr>
+              <w:t>S1_shap_clf.png</w:t>
+            </w:r>
+          </w:p>
+        </w:tc>
+        <w:tc>
+          <w:tcPr>
+            <w:tcW w:type="dxa" w:w="2835"/>
+            <w:shd w:val="clear" w:color="auto" w:fill="FFFFFF"/>
+          </w:tcPr>
+          <w:p>
+            <w:pPr>
+              <w:jc w:val="center"/>
+            </w:pPr>
+            <w:r>
+              <w:rPr>
+                <w:rFonts w:ascii="Malgun Gothic" w:hAnsi="Malgun Gothic"/>
+                <w:sz w:val="20"/>
+              </w:rPr>
+              <w:t>분류 모델(LogisticRegression) SHAP beeswarm</w:t>
+            </w:r>
+          </w:p>
+        </w:tc>
+        <w:tc>
+          <w:tcPr>
+            <w:tcW w:type="dxa" w:w="2551"/>
+            <w:shd w:val="clear" w:color="auto" w:fill="FFFFFF"/>
+          </w:tcPr>
+          <w:p>
+            <w:pPr>
+              <w:jc w:val="center"/>
+            </w:pPr>
+            <w:r>
+              <w:rPr>
+                <w:rFonts w:ascii="Malgun Gothic" w:hAnsi="Malgun Gothic"/>
+                <w:sz w:val="20"/>
+              </w:rPr>
+              <w:t>LinearExplainer (선형 수식 직접 계산)</w:t>
+            </w:r>
+          </w:p>
+        </w:tc>
+        <w:tc>
+          <w:tcPr>
+            <w:tcW w:type="dxa" w:w="850"/>
+            <w:shd w:val="clear" w:color="auto" w:fill="FFFFFF"/>
+          </w:tcPr>
+          <w:p>
+            <w:pPr>
+              <w:jc w:val="center"/>
+            </w:pPr>
+            <w:r>
+              <w:rPr>
+                <w:rFonts w:ascii="Malgun Gothic" w:hAnsi="Malgun Gothic"/>
+                <w:sz w:val="20"/>
+              </w:rPr>
+              <w:t>&lt; 1초</w:t>
+            </w:r>
+          </w:p>
+        </w:tc>
+      </w:tr>
+      <w:tr>
+        <w:tc>
+          <w:tcPr>
+            <w:tcW w:type="dxa" w:w="1984"/>
+            <w:shd w:val="clear" w:color="auto" w:fill="F2F2F2"/>
+          </w:tcPr>
+          <w:p>
+            <w:pPr>
+              <w:jc w:val="left"/>
+            </w:pPr>
+            <w:r>
+              <w:rPr>
+                <w:rFonts w:ascii="Malgun Gothic" w:hAnsi="Malgun Gothic"/>
+                <w:sz w:val="20"/>
+              </w:rPr>
+              <w:t>S2_shap_gru.png</w:t>
+            </w:r>
+          </w:p>
+        </w:tc>
+        <w:tc>
+          <w:tcPr>
+            <w:tcW w:type="dxa" w:w="2835"/>
+            <w:shd w:val="clear" w:color="auto" w:fill="F2F2F2"/>
+          </w:tcPr>
+          <w:p>
+            <w:pPr>
+              <w:jc w:val="center"/>
+            </w:pPr>
+            <w:r>
+              <w:rPr>
+                <w:rFonts w:ascii="Malgun Gothic" w:hAnsi="Malgun Gothic"/>
+                <w:sz w:val="20"/>
+              </w:rPr>
+              <w:t>GRU 모델 RUL 예측 SHAP beeswarm</w:t>
+            </w:r>
+          </w:p>
+        </w:tc>
+        <w:tc>
+          <w:tcPr>
+            <w:tcW w:type="dxa" w:w="2551"/>
+            <w:shd w:val="clear" w:color="auto" w:fill="F2F2F2"/>
+          </w:tcPr>
+          <w:p>
+            <w:pPr>
+              <w:jc w:val="center"/>
+            </w:pPr>
+            <w:r>
+              <w:rPr>
+                <w:rFonts w:ascii="Malgun Gothic" w:hAnsi="Malgun Gothic"/>
+                <w:sz w:val="20"/>
+              </w:rPr>
+              <w:t>KernelExplainer (시간축 평균 근사)</w:t>
+            </w:r>
+          </w:p>
+        </w:tc>
+        <w:tc>
+          <w:tcPr>
+            <w:tcW w:type="dxa" w:w="850"/>
+            <w:shd w:val="clear" w:color="auto" w:fill="F2F2F2"/>
+          </w:tcPr>
+          <w:p>
+            <w:pPr>
+              <w:jc w:val="center"/>
+            </w:pPr>
+            <w:r>
+              <w:rPr>
+                <w:rFonts w:ascii="Malgun Gothic" w:hAnsi="Malgun Gothic"/>
+                <w:sz w:val="20"/>
+              </w:rPr>
+              <w:t>약 25초</w:t>
+            </w:r>
+          </w:p>
+        </w:tc>
+      </w:tr>
+      <w:tr>
+        <w:tc>
+          <w:tcPr>
+            <w:tcW w:type="dxa" w:w="1984"/>
+            <w:shd w:val="clear" w:color="auto" w:fill="FFFFFF"/>
+          </w:tcPr>
+          <w:p>
+            <w:pPr>
+              <w:jc w:val="left"/>
+            </w:pPr>
+            <w:r>
+              <w:rPr>
+                <w:rFonts w:ascii="Malgun Gothic" w:hAnsi="Malgun Gothic"/>
+                <w:sz w:val="20"/>
+              </w:rPr>
+              <w:t>S3_shap_bar.png</w:t>
+            </w:r>
+          </w:p>
+        </w:tc>
+        <w:tc>
+          <w:tcPr>
+            <w:tcW w:type="dxa" w:w="2835"/>
+            <w:shd w:val="clear" w:color="auto" w:fill="FFFFFF"/>
+          </w:tcPr>
+          <w:p>
+            <w:pPr>
+              <w:jc w:val="center"/>
+            </w:pPr>
+            <w:r>
+              <w:rPr>
+                <w:rFonts w:ascii="Malgun Gothic" w:hAnsi="Malgun Gothic"/>
+                <w:sz w:val="20"/>
+              </w:rPr>
+              <w:t>두 모델 피처 중요도 비교 막대</w:t>
+            </w:r>
+          </w:p>
+        </w:tc>
+        <w:tc>
+          <w:tcPr>
+            <w:tcW w:type="dxa" w:w="2551"/>
+            <w:shd w:val="clear" w:color="auto" w:fill="FFFFFF"/>
+          </w:tcPr>
+          <w:p>
+            <w:pPr>
+              <w:jc w:val="center"/>
+            </w:pPr>
+            <w:r>
+              <w:rPr>
+                <w:rFonts w:ascii="Malgun Gothic" w:hAnsi="Malgun Gothic"/>
+                <w:sz w:val="20"/>
+              </w:rPr>
+              <w:t>위 두 결과 집계</w:t>
+            </w:r>
+          </w:p>
+        </w:tc>
+        <w:tc>
+          <w:tcPr>
+            <w:tcW w:type="dxa" w:w="850"/>
+            <w:shd w:val="clear" w:color="auto" w:fill="FFFFFF"/>
+          </w:tcPr>
+          <w:p>
+            <w:pPr>
+              <w:jc w:val="center"/>
+            </w:pPr>
+            <w:r>
+              <w:rPr>
+                <w:rFonts w:ascii="Malgun Gothic" w:hAnsi="Malgun Gothic"/>
+                <w:sz w:val="20"/>
+              </w:rPr>
+              <w:t>&lt; 1초</w:t>
+            </w:r>
+          </w:p>
+        </w:tc>
+      </w:tr>
+    </w:tbl>
+    <w:p/>
+    <w:p>
+      <w:r>
+        <w:rPr>
+          <w:rFonts w:ascii="Malgun Gothic" w:hAnsi="Malgun Gothic"/>
+          <w:b/>
+          <w:color w:val="1F4E79"/>
+          <w:sz w:val="22"/>
+        </w:rPr>
+        <w:t>E.4.1 기술적 구현 이슈 및 폴백 처리</w:t>
+      </w:r>
+    </w:p>
+    <w:p>
+      <w:r>
+        <w:rPr>
+          <w:rFonts w:ascii="Malgun Gothic" w:hAnsi="Malgun Gothic"/>
+          <w:b w:val="0"/>
+          <w:sz w:val="20"/>
+        </w:rPr>
+        <w:t>모델별로 SHAP Explainer를 다르게 선택했습니다.</w:t>
+        <w:br/>
+        <w:br/>
+        <w:t>분류 모델: 9개 피처(n_features_in_=9)로 학습됨. 코드가 clf.n_features_in_을 자동 감지해</w:t>
+        <w:br/>
+        <w:t>맞춰 적용했습니다. LogisticRegression은 선형 모델이므로 SHAP 값을 수식으로 바로 구할 수</w:t>
+        <w:br/>
+        <w:t>있어서 LinearExplainer를 사용했고 1초도 안 걸렸습니다.</w:t>
+        <w:br/>
+        <w:br/>
+        <w:t>GRU 모델: 입력 형태 (None, 20, 12), 즉 20 시점 x 12개 피처의 시퀀스입니다.</w:t>
+        <w:br/>
+        <w:t>딥러닝 모델에는 원래 DeepExplainer나 GradientExplainer가 더 빠르고 정확합니다(기울기를</w:t>
+        <w:br/>
+        <w:t>직접 이용하므로). 그런데 이 GRU에는 Keras 커스텀 그래디언트 연산이 들어 있어서 그 두</w:t>
+        <w:br/>
+        <w:t>방식이 실패했고, 범용인 KernelExplainer로 대체(폴백)했습니다.</w:t>
+        <w:br/>
+        <w:br/>
+        <w:t>핵심 한계: KernelExplainer는 3차원 시퀀스를 그대로 다루기 어려워서 시퀀스를 시간축으로</w:t>
+        <w:br/>
+        <w:t>평균 내 2D로 압축한 뒤 근사하는 방식을 택했습니다. 이로 인해 '20개 시점 중 어느 시점이</w:t>
+        <w:br/>
+        <w:t>중요했는가'라는 시간적 정보는 압축 과정에서 사라집니다.</w:t>
+      </w:r>
+    </w:p>
+    <w:p/>
+    <w:p>
+      <w:r>
+        <w:rPr>
+          <w:rFonts w:ascii="Malgun Gothic" w:hAnsi="Malgun Gothic"/>
+          <w:b/>
+          <w:color w:val="1F4E79"/>
+          <w:sz w:val="22"/>
+        </w:rPr>
+        <w:t>E.4.2 SHAP가 예측 설명에 도움이 되었나?</w:t>
+      </w:r>
+    </w:p>
+    <w:p>
+      <w:r>
+        <w:rPr>
+          <w:rFonts w:ascii="Malgun Gothic" w:hAnsi="Malgun Gothic"/>
+          <w:b w:val="0"/>
+          <w:sz w:val="20"/>
+        </w:rPr>
+        <w:t>네, 도움이 되었습니다. 다만 어떤 의미인지 구분해서 정리합니다.</w:t>
+      </w:r>
+    </w:p>
+    <w:p/>
+    <w:p>
+      <w:r>
+        <w:rPr>
+          <w:rFonts w:ascii="Malgun Gothic" w:hAnsi="Malgun Gothic"/>
+          <w:b/>
+          <w:sz w:val="20"/>
+        </w:rPr>
+        <w:t>[도움이 된 점]</w:t>
+      </w:r>
+    </w:p>
+    <w:p>
+      <w:r>
+        <w:rPr>
+          <w:rFonts w:ascii="Malgun Gothic" w:hAnsi="Malgun Gothic"/>
+          <w:b w:val="0"/>
+          <w:sz w:val="20"/>
+        </w:rPr>
+        <w:t>SHAP 덕분에 '어떤 센서/피처가 잔여 수명 예측에 크게 기여했는가'를 눈으로 확인할 수</w:t>
+        <w:br/>
+        <w:t>있게 됐습니다. 특히 S3_shap_bar.png로 분류 모델과 GRU 모델이 서로 다른 피처를 중요하게</w:t>
+        <w:br/>
+        <w:t>보는지까지 비교할 수 있습니다.</w:t>
+        <w:br/>
+        <w:br/>
+        <w:t>이것은 예지보전에서 매우 가치 있는 정보입니다. 단순히 '고장이 예측된다'가 아니라</w:t>
+        <w:br/>
+        <w:t>'어느 신호 때문에 그렇게 판단했는가'를 설명할 수 있으면, 현장 엔지니어가 그 근거를</w:t>
+        <w:br/>
+        <w:t>신뢰하고 실제 조치로 연결할 수 있기 때문입니다.</w:t>
+        <w:br/>
+        <w:t>면접이나 포트폴리오에서도 '모델을 만들었다'를 넘어 '모델의 판단 근거를 설명·검증했다'는</w:t>
+        <w:br/>
+        <w:t>점은 강한 차별점입니다.</w:t>
+      </w:r>
+    </w:p>
+    <w:p/>
+    <w:p>
+      <w:r>
+        <w:rPr>
+          <w:rFonts w:ascii="Malgun Gothic" w:hAnsi="Malgun Gothic"/>
+          <w:b/>
+          <w:sz w:val="20"/>
+        </w:rPr>
+        <w:t>[신중하게 해석해야 할 한계]</w:t>
+      </w:r>
+    </w:p>
+    <w:p>
+      <w:r>
+        <w:rPr>
+          <w:rFonts w:ascii="Malgun Gothic" w:hAnsi="Malgun Gothic"/>
+          <w:b w:val="0"/>
+          <w:sz w:val="20"/>
+        </w:rPr>
+        <w:t>GRU 결과는 시퀀스를 시간축으로 평균 내 근사한 값입니다.</w:t>
+        <w:br/>
+        <w:br/>
+        <w:t xml:space="preserve">  S2의 피처 중요도는 '대체로 어떤 피처가 중요한가'라는 큰 경향으로는 신뢰할 만하지만,</w:t>
+        <w:br/>
+        <w:t xml:space="preserve">  '고장 직전 특정 시점의 급변이 결정적이었다' 같은 세밀한 시간 패턴까지는 말해주지 못합니다.</w:t>
+        <w:br/>
+        <w:br/>
+        <w:t xml:space="preserve">  KernelExplainer 자체가 근사 기법이고 적은 샘플(50건)로 돌렸으므로 값이 다소 흔들릴</w:t>
+        <w:br/>
+        <w:t xml:space="preserve">  수 있습니다.</w:t>
+        <w:br/>
+        <w:br/>
+        <w:t>종합: SHAP는 '모델이 무엇을 보고 판단하는가'라는 전반적 근거를 제시하는 데는 확실히</w:t>
+        <w:br/>
+        <w:t>도움이 되었지만, 시퀀스 모델의 시간적 세부까지 설명하는 데는 이번 근사 방식의 한계가</w:t>
+        <w:br/>
+        <w:t>있습니다. 발표 시 이 한계를 함께 언급하면 오히려 분석의 신뢰도가 높아집니다.</w:t>
+      </w:r>
+    </w:p>
+    <w:p/>
+    <w:tbl>
+      <w:tblPr>
+        <w:tblStyle w:val="TableGrid"/>
+        <w:tblW w:type="auto" w:w="0"/>
+        <w:tblLook w:firstColumn="1" w:firstRow="1" w:lastColumn="0" w:lastRow="0" w:noHBand="0" w:noVBand="1" w:val="04A0"/>
+      </w:tblPr>
+      <w:tblGrid>
+        <w:gridCol w:w="3135"/>
+        <w:gridCol w:w="3135"/>
+        <w:gridCol w:w="3135"/>
+      </w:tblGrid>
+      <w:tr>
+        <w:tc>
+          <w:tcPr>
+            <w:tcW w:type="dxa" w:w="2835"/>
+            <w:shd w:val="clear" w:color="auto" w:fill="1F4E79"/>
+          </w:tcPr>
+          <w:p>
+            <w:pPr>
+              <w:jc w:val="center"/>
+            </w:pPr>
+            <w:r>
+              <w:rPr>
+                <w:rFonts w:ascii="Malgun Gothic" w:hAnsi="Malgun Gothic"/>
+                <w:b/>
+                <w:color w:val="FFFFFF"/>
+                <w:sz w:val="20"/>
+              </w:rPr>
+              <w:t>구분</w:t>
+            </w:r>
+          </w:p>
+        </w:tc>
+        <w:tc>
+          <w:tcPr>
+            <w:tcW w:type="dxa" w:w="3969"/>
+            <w:shd w:val="clear" w:color="auto" w:fill="1F4E79"/>
+          </w:tcPr>
+          <w:p>
+            <w:pPr>
+              <w:jc w:val="center"/>
+            </w:pPr>
+            <w:r>
+              <w:rPr>
+                <w:rFonts w:ascii="Malgun Gothic" w:hAnsi="Malgun Gothic"/>
+                <w:b/>
+                <w:color w:val="FFFFFF"/>
+                <w:sz w:val="20"/>
+              </w:rPr>
+              <w:t>내용</w:t>
+            </w:r>
+          </w:p>
+        </w:tc>
+        <w:tc>
+          <w:tcPr>
+            <w:tcW w:type="dxa" w:w="1417"/>
+            <w:shd w:val="clear" w:color="auto" w:fill="1F4E79"/>
+          </w:tcPr>
+          <w:p>
+            <w:pPr>
+              <w:jc w:val="center"/>
+            </w:pPr>
+            <w:r>
+              <w:rPr>
+                <w:rFonts w:ascii="Malgun Gothic" w:hAnsi="Malgun Gothic"/>
+                <w:b/>
+                <w:color w:val="FFFFFF"/>
+                <w:sz w:val="20"/>
+              </w:rPr>
+              <w:t>신뢰 수준</w:t>
+            </w:r>
+          </w:p>
+        </w:tc>
+      </w:tr>
+      <w:tr>
+        <w:tc>
+          <w:tcPr>
+            <w:tcW w:type="dxa" w:w="2835"/>
+            <w:shd w:val="clear" w:color="auto" w:fill="FFFFFF"/>
+          </w:tcPr>
+          <w:p>
+            <w:pPr>
+              <w:jc w:val="left"/>
+            </w:pPr>
+            <w:r>
+              <w:rPr>
+                <w:rFonts w:ascii="Malgun Gothic" w:hAnsi="Malgun Gothic"/>
+                <w:sz w:val="20"/>
+              </w:rPr>
+              <w:t>분류 모델 피처 순위</w:t>
+              <w:br/>
+              <w:t>(h_rms &gt; h_kurt &gt; rms_ratio)</w:t>
+            </w:r>
+          </w:p>
+        </w:tc>
+        <w:tc>
+          <w:tcPr>
+            <w:tcW w:type="dxa" w:w="3969"/>
+            <w:shd w:val="clear" w:color="auto" w:fill="FFFFFF"/>
+          </w:tcPr>
+          <w:p>
+            <w:pPr>
+              <w:jc w:val="center"/>
+            </w:pPr>
+            <w:r>
+              <w:rPr>
+                <w:rFonts w:ascii="Malgun Gothic" w:hAnsi="Malgun Gothic"/>
+                <w:sz w:val="20"/>
+              </w:rPr>
+              <w:t>전체 테스트 데이터 15,927건에 LinearExplainer 적용</w:t>
+              <w:br/>
+              <w:t>수식 기반 정확 계산</w:t>
+            </w:r>
+          </w:p>
+        </w:tc>
+        <w:tc>
+          <w:tcPr>
+            <w:tcW w:type="dxa" w:w="1417"/>
+            <w:shd w:val="clear" w:color="auto" w:fill="FFFFFF"/>
+          </w:tcPr>
+          <w:p>
+            <w:pPr>
+              <w:jc w:val="center"/>
+            </w:pPr>
+            <w:r>
+              <w:rPr>
+                <w:rFonts w:ascii="Malgun Gothic" w:hAnsi="Malgun Gothic"/>
+                <w:sz w:val="20"/>
+              </w:rPr>
+              <w:t>높음</w:t>
+            </w:r>
+          </w:p>
+        </w:tc>
+      </w:tr>
+      <w:tr>
+        <w:tc>
+          <w:tcPr>
+            <w:tcW w:type="dxa" w:w="2835"/>
+            <w:shd w:val="clear" w:color="auto" w:fill="F2F2F2"/>
+          </w:tcPr>
+          <w:p>
+            <w:pPr>
+              <w:jc w:val="left"/>
+            </w:pPr>
+            <w:r>
+              <w:rPr>
+                <w:rFonts w:ascii="Malgun Gothic" w:hAnsi="Malgun Gothic"/>
+                <w:sz w:val="20"/>
+              </w:rPr>
+              <w:t>GRU RUL 피처 순위</w:t>
+              <w:br/>
+              <w:t>(energy &gt; h_rms &gt; health_idx)</w:t>
+            </w:r>
+          </w:p>
+        </w:tc>
+        <w:tc>
+          <w:tcPr>
+            <w:tcW w:type="dxa" w:w="3969"/>
+            <w:shd w:val="clear" w:color="auto" w:fill="F2F2F2"/>
+          </w:tcPr>
+          <w:p>
+            <w:pPr>
+              <w:jc w:val="center"/>
+            </w:pPr>
+            <w:r>
+              <w:rPr>
+                <w:rFonts w:ascii="Malgun Gothic" w:hAnsi="Malgun Gothic"/>
+                <w:sz w:val="20"/>
+              </w:rPr>
+              <w:t>50샘플 시간축 평균 근사(KernelExplainer)</w:t>
+              <w:br/>
+              <w:t>시퀀스 정보 부분 손실</w:t>
+            </w:r>
+          </w:p>
+        </w:tc>
+        <w:tc>
+          <w:tcPr>
+            <w:tcW w:type="dxa" w:w="1417"/>
+            <w:shd w:val="clear" w:color="auto" w:fill="F2F2F2"/>
+          </w:tcPr>
+          <w:p>
+            <w:pPr>
+              <w:jc w:val="center"/>
+            </w:pPr>
+            <w:r>
+              <w:rPr>
+                <w:rFonts w:ascii="Malgun Gothic" w:hAnsi="Malgun Gothic"/>
+                <w:sz w:val="20"/>
+              </w:rPr>
+              <w:t>중간 (경향 파악 수준)</w:t>
+            </w:r>
+          </w:p>
+        </w:tc>
+      </w:tr>
+      <w:tr>
+        <w:tc>
+          <w:tcPr>
+            <w:tcW w:type="dxa" w:w="2835"/>
+            <w:shd w:val="clear" w:color="auto" w:fill="FFFFFF"/>
+          </w:tcPr>
+          <w:p>
+            <w:pPr>
+              <w:jc w:val="left"/>
+            </w:pPr>
+            <w:r>
+              <w:rPr>
+                <w:rFonts w:ascii="Malgun Gothic" w:hAnsi="Malgun Gothic"/>
+                <w:sz w:val="20"/>
+              </w:rPr>
+              <w:t>두 모델 비교(S3)</w:t>
+            </w:r>
+          </w:p>
+        </w:tc>
+        <w:tc>
+          <w:tcPr>
+            <w:tcW w:type="dxa" w:w="3969"/>
+            <w:shd w:val="clear" w:color="auto" w:fill="FFFFFF"/>
+          </w:tcPr>
+          <w:p>
+            <w:pPr>
+              <w:jc w:val="center"/>
+            </w:pPr>
+            <w:r>
+              <w:rPr>
+                <w:rFonts w:ascii="Malgun Gothic" w:hAnsi="Malgun Gothic"/>
+                <w:sz w:val="20"/>
+              </w:rPr>
+              <w:t>|SHAP| 평균 기반 상대 순위</w:t>
+              <w:br/>
+              <w:t>모델 간 차이점 시각화</w:t>
+            </w:r>
+          </w:p>
+        </w:tc>
+        <w:tc>
+          <w:tcPr>
+            <w:tcW w:type="dxa" w:w="1417"/>
+            <w:shd w:val="clear" w:color="auto" w:fill="FFFFFF"/>
+          </w:tcPr>
+          <w:p>
+            <w:pPr>
+              <w:jc w:val="center"/>
+            </w:pPr>
+            <w:r>
+              <w:rPr>
+                <w:rFonts w:ascii="Malgun Gothic" w:hAnsi="Malgun Gothic"/>
+                <w:sz w:val="20"/>
+              </w:rPr>
+              <w:t>높음 (상대 순위)</w:t>
+            </w:r>
+          </w:p>
+        </w:tc>
+      </w:tr>
+    </w:tbl>
+    <w:p/>
+    <w:p>
+      <w:r>
+        <w:br w:type="page"/>
+      </w:r>
+    </w:p>
+    <w:p>
+      <w:r>
+        <w:rPr>
+          <w:rFonts w:ascii="Malgun Gothic" w:hAnsi="Malgun Gothic"/>
+          <w:b/>
+          <w:color w:val="1F4E79"/>
+          <w:sz w:val="26"/>
+        </w:rPr>
+        <w:t>부록 F. RAG 유사 사례 검색 시스템 (Level 1)</w:t>
+      </w:r>
+    </w:p>
+    <w:p>
+      <w:r>
+        <w:rPr>
+          <w:rFonts w:ascii="Malgun Gothic" w:hAnsi="Malgun Gothic"/>
+          <w:b w:val="0"/>
+          <w:sz w:val="20"/>
+        </w:rPr>
+        <w:t>FEMTO-ST 베어링 데이터에 RAG(Retrieval-Augmented Generation) 개념을 적용한</w:t>
+        <w:br/>
+        <w:t>유사 사례 검색 시스템입니다. 현재 LLM 없이 FAISS 벡터 검색만 사용하는 Level 1 구현입니다.</w:t>
+      </w:r>
+    </w:p>
+    <w:p/>
+    <w:p>
+      <w:r>
+        <w:rPr>
+          <w:rFonts w:ascii="Malgun Gothic" w:hAnsi="Malgun Gothic"/>
+          <w:b/>
+          <w:color w:val="1F4E79"/>
+          <w:sz w:val="22"/>
+        </w:rPr>
+        <w:t>F.1 시스템 구성</w:t>
+      </w:r>
+    </w:p>
+    <w:tbl>
+      <w:tblPr>
+        <w:tblStyle w:val="TableGrid"/>
+        <w:tblW w:type="auto" w:w="0"/>
+        <w:tblLook w:firstColumn="1" w:firstRow="1" w:lastColumn="0" w:lastRow="0" w:noHBand="0" w:noVBand="1" w:val="04A0"/>
+      </w:tblPr>
+      <w:tblGrid>
+        <w:gridCol w:w="4703"/>
+        <w:gridCol w:w="4703"/>
+      </w:tblGrid>
+      <w:tr>
+        <w:tc>
+          <w:tcPr>
+            <w:tcW w:type="dxa" w:w="1701"/>
+            <w:shd w:val="clear" w:color="auto" w:fill="1F4E79"/>
+          </w:tcPr>
+          <w:p>
+            <w:pPr>
+              <w:jc w:val="center"/>
+            </w:pPr>
+            <w:r>
+              <w:rPr>
+                <w:rFonts w:ascii="Malgun Gothic" w:hAnsi="Malgun Gothic"/>
+                <w:b/>
+                <w:color w:val="FFFFFF"/>
+                <w:sz w:val="20"/>
+              </w:rPr>
+              <w:t>구성 요소</w:t>
+            </w:r>
+          </w:p>
+        </w:tc>
+        <w:tc>
+          <w:tcPr>
+            <w:tcW w:type="dxa" w:w="6520"/>
+            <w:shd w:val="clear" w:color="auto" w:fill="1F4E79"/>
+          </w:tcPr>
+          <w:p>
+            <w:pPr>
+              <w:jc w:val="center"/>
+            </w:pPr>
+            <w:r>
+              <w:rPr>
+                <w:rFonts w:ascii="Malgun Gothic" w:hAnsi="Malgun Gothic"/>
+                <w:b/>
+                <w:color w:val="FFFFFF"/>
+                <w:sz w:val="20"/>
+              </w:rPr>
+              <w:t>내용</w:t>
+            </w:r>
+          </w:p>
+        </w:tc>
+      </w:tr>
+      <w:tr>
+        <w:tc>
+          <w:tcPr>
+            <w:tcW w:type="dxa" w:w="1701"/>
+            <w:shd w:val="clear" w:color="auto" w:fill="FFFFFF"/>
+          </w:tcPr>
+          <w:p>
+            <w:pPr>
+              <w:jc w:val="left"/>
+            </w:pPr>
+            <w:r>
+              <w:rPr>
+                <w:rFonts w:ascii="Malgun Gothic" w:hAnsi="Malgun Gothic"/>
+                <w:sz w:val="20"/>
+              </w:rPr>
+              <w:t>입력</w:t>
+            </w:r>
+          </w:p>
+        </w:tc>
+        <w:tc>
+          <w:tcPr>
+            <w:tcW w:type="dxa" w:w="6520"/>
+            <w:shd w:val="clear" w:color="auto" w:fill="FFFFFF"/>
+          </w:tcPr>
+          <w:p>
+            <w:pPr>
+              <w:jc w:val="center"/>
+            </w:pPr>
+            <w:r>
+              <w:rPr>
+                <w:rFonts w:ascii="Malgun Gothic" w:hAnsi="Malgun Gothic"/>
+                <w:sz w:val="20"/>
+              </w:rPr>
+              <w:t>현재 베어링 측정값 12개 피처 벡터 (h_rms, h_kurt, ..., energy, health_idx, rms_ratio)</w:t>
+            </w:r>
+          </w:p>
+        </w:tc>
+      </w:tr>
+      <w:tr>
+        <w:tc>
+          <w:tcPr>
+            <w:tcW w:type="dxa" w:w="1701"/>
+            <w:shd w:val="clear" w:color="auto" w:fill="F2F2F2"/>
+          </w:tcPr>
+          <w:p>
+            <w:pPr>
+              <w:jc w:val="left"/>
+            </w:pPr>
+            <w:r>
+              <w:rPr>
+                <w:rFonts w:ascii="Malgun Gothic" w:hAnsi="Malgun Gothic"/>
+                <w:sz w:val="20"/>
+              </w:rPr>
+              <w:t>전처리</w:t>
+            </w:r>
+          </w:p>
+        </w:tc>
+        <w:tc>
+          <w:tcPr>
+            <w:tcW w:type="dxa" w:w="6520"/>
+            <w:shd w:val="clear" w:color="auto" w:fill="F2F2F2"/>
+          </w:tcPr>
+          <w:p>
+            <w:pPr>
+              <w:jc w:val="center"/>
+            </w:pPr>
+            <w:r>
+              <w:rPr>
+                <w:rFonts w:ascii="Malgun Gothic" w:hAnsi="Malgun Gothic"/>
+                <w:sz w:val="20"/>
+              </w:rPr>
+              <w:t>MinMaxScaler 정규화 -&gt; L2 정규화 (코사인 유사도 계산용)</w:t>
+            </w:r>
+          </w:p>
+        </w:tc>
+      </w:tr>
+      <w:tr>
+        <w:tc>
+          <w:tcPr>
+            <w:tcW w:type="dxa" w:w="1701"/>
+            <w:shd w:val="clear" w:color="auto" w:fill="FFFFFF"/>
+          </w:tcPr>
+          <w:p>
+            <w:pPr>
+              <w:jc w:val="left"/>
+            </w:pPr>
+            <w:r>
+              <w:rPr>
+                <w:rFonts w:ascii="Malgun Gothic" w:hAnsi="Malgun Gothic"/>
+                <w:sz w:val="20"/>
+              </w:rPr>
+              <w:t>검색 엔진</w:t>
+            </w:r>
+          </w:p>
+        </w:tc>
+        <w:tc>
+          <w:tcPr>
+            <w:tcW w:type="dxa" w:w="6520"/>
+            <w:shd w:val="clear" w:color="auto" w:fill="FFFFFF"/>
+          </w:tcPr>
+          <w:p>
+            <w:pPr>
+              <w:jc w:val="center"/>
+            </w:pPr>
+            <w:r>
+              <w:rPr>
+                <w:rFonts w:ascii="Malgun Gothic" w:hAnsi="Malgun Gothic"/>
+                <w:sz w:val="20"/>
+              </w:rPr>
+              <w:t>FAISS IndexFlatIP (내적 = L2 정규화 후 코사인 유사도)</w:t>
+            </w:r>
+          </w:p>
+        </w:tc>
+      </w:tr>
+      <w:tr>
+        <w:tc>
+          <w:tcPr>
+            <w:tcW w:type="dxa" w:w="1701"/>
+            <w:shd w:val="clear" w:color="auto" w:fill="F2F2F2"/>
+          </w:tcPr>
+          <w:p>
+            <w:pPr>
+              <w:jc w:val="left"/>
+            </w:pPr>
+            <w:r>
+              <w:rPr>
+                <w:rFonts w:ascii="Malgun Gothic" w:hAnsi="Malgun Gothic"/>
+                <w:sz w:val="20"/>
+              </w:rPr>
+              <w:t>인덱스</w:t>
+            </w:r>
+          </w:p>
+        </w:tc>
+        <w:tc>
+          <w:tcPr>
+            <w:tcW w:type="dxa" w:w="6520"/>
+            <w:shd w:val="clear" w:color="auto" w:fill="F2F2F2"/>
+          </w:tcPr>
+          <w:p>
+            <w:pPr>
+              <w:jc w:val="center"/>
+            </w:pPr>
+            <w:r>
+              <w:rPr>
+                <w:rFonts w:ascii="Malgun Gothic" w:hAnsi="Malgun Gothic"/>
+                <w:sz w:val="20"/>
+              </w:rPr>
+              <w:t>femto_features.csv 전체 벡터화 (훈련+테스트 데이터)</w:t>
+            </w:r>
+          </w:p>
+        </w:tc>
+      </w:tr>
+      <w:tr>
+        <w:tc>
+          <w:tcPr>
+            <w:tcW w:type="dxa" w:w="1701"/>
+            <w:shd w:val="clear" w:color="auto" w:fill="FFFFFF"/>
+          </w:tcPr>
+          <w:p>
+            <w:pPr>
+              <w:jc w:val="left"/>
+            </w:pPr>
+            <w:r>
+              <w:rPr>
+                <w:rFonts w:ascii="Malgun Gothic" w:hAnsi="Malgun Gothic"/>
+                <w:sz w:val="20"/>
+              </w:rPr>
+              <w:t>RUL 추정</w:t>
+            </w:r>
+          </w:p>
+        </w:tc>
+        <w:tc>
+          <w:tcPr>
+            <w:tcW w:type="dxa" w:w="6520"/>
+            <w:shd w:val="clear" w:color="auto" w:fill="FFFFFF"/>
+          </w:tcPr>
+          <w:p>
+            <w:pPr>
+              <w:jc w:val="center"/>
+            </w:pPr>
+            <w:r>
+              <w:rPr>
+                <w:rFonts w:ascii="Malgun Gothic" w:hAnsi="Malgun Gothic"/>
+                <w:sz w:val="20"/>
+              </w:rPr>
+              <w:t>Top-K 유사 사례 가중평균: 추정 RUL = sum(유사도i x RULi) / sum(유사도i)</w:t>
+            </w:r>
+          </w:p>
+        </w:tc>
+      </w:tr>
+      <w:tr>
+        <w:tc>
+          <w:tcPr>
+            <w:tcW w:type="dxa" w:w="1701"/>
+            <w:shd w:val="clear" w:color="auto" w:fill="F2F2F2"/>
+          </w:tcPr>
+          <w:p>
+            <w:pPr>
+              <w:jc w:val="left"/>
+            </w:pPr>
+            <w:r>
+              <w:rPr>
+                <w:rFonts w:ascii="Malgun Gothic" w:hAnsi="Malgun Gothic"/>
+                <w:sz w:val="20"/>
+              </w:rPr>
+              <w:t>UI</w:t>
+            </w:r>
+          </w:p>
+        </w:tc>
+        <w:tc>
+          <w:tcPr>
+            <w:tcW w:type="dxa" w:w="6520"/>
+            <w:shd w:val="clear" w:color="auto" w:fill="F2F2F2"/>
+          </w:tcPr>
+          <w:p>
+            <w:pPr>
+              <w:jc w:val="center"/>
+            </w:pPr>
+            <w:r>
+              <w:rPr>
+                <w:rFonts w:ascii="Malgun Gothic" w:hAnsi="Malgun Gothic"/>
+                <w:sz w:val="20"/>
+              </w:rPr>
+              <w:t>app/streamlit_rag.py -- 실시간 유사 사례 검색 + 베어링 이력 탐색</w:t>
+            </w:r>
+          </w:p>
+        </w:tc>
+      </w:tr>
+      <w:tr>
+        <w:tc>
+          <w:tcPr>
+            <w:tcW w:type="dxa" w:w="1701"/>
+            <w:shd w:val="clear" w:color="auto" w:fill="FFFFFF"/>
+          </w:tcPr>
+          <w:p>
+            <w:pPr>
+              <w:jc w:val="left"/>
+            </w:pPr>
+            <w:r>
+              <w:rPr>
+                <w:rFonts w:ascii="Malgun Gothic" w:hAnsi="Malgun Gothic"/>
+                <w:sz w:val="20"/>
+              </w:rPr>
+              <w:t>소스</w:t>
+            </w:r>
+          </w:p>
+        </w:tc>
+        <w:tc>
+          <w:tcPr>
+            <w:tcW w:type="dxa" w:w="6520"/>
+            <w:shd w:val="clear" w:color="auto" w:fill="FFFFFF"/>
+          </w:tcPr>
+          <w:p>
+            <w:pPr>
+              <w:jc w:val="center"/>
+            </w:pPr>
+            <w:r>
+              <w:rPr>
+                <w:rFonts w:ascii="Malgun Gothic" w:hAnsi="Malgun Gothic"/>
+                <w:sz w:val="20"/>
+              </w:rPr>
+              <w:t>src/femto_rag_search.py</w:t>
+            </w:r>
+          </w:p>
+        </w:tc>
+      </w:tr>
+    </w:tbl>
+    <w:p/>
+    <w:p>
+      <w:r>
+        <w:rPr>
+          <w:rFonts w:ascii="Malgun Gothic" w:hAnsi="Malgun Gothic"/>
+          <w:b/>
+          <w:color w:val="1F4E79"/>
+          <w:sz w:val="22"/>
+        </w:rPr>
+        <w:t>F.2 LLM 미적용 이유 및 Level 2 로드맵</w:t>
+      </w:r>
+    </w:p>
+    <w:tbl>
+      <w:tblPr>
+        <w:tblStyle w:val="TableGrid"/>
+        <w:tblW w:type="auto" w:w="0"/>
+        <w:tblLook w:firstColumn="1" w:firstRow="1" w:lastColumn="0" w:lastRow="0" w:noHBand="0" w:noVBand="1" w:val="04A0"/>
+      </w:tblPr>
+      <w:tblGrid>
+        <w:gridCol w:w="3135"/>
+        <w:gridCol w:w="3135"/>
+        <w:gridCol w:w="3135"/>
+      </w:tblGrid>
+      <w:tr>
+        <w:tc>
+          <w:tcPr>
+            <w:tcW w:type="dxa" w:w="1701"/>
+            <w:shd w:val="clear" w:color="auto" w:fill="1F4E79"/>
+          </w:tcPr>
+          <w:p>
+            <w:pPr>
+              <w:jc w:val="center"/>
+            </w:pPr>
+            <w:r>
+              <w:rPr>
+                <w:rFonts w:ascii="Malgun Gothic" w:hAnsi="Malgun Gothic"/>
+                <w:b/>
+                <w:color w:val="FFFFFF"/>
+                <w:sz w:val="20"/>
+              </w:rPr>
+              <w:t>항목</w:t>
+            </w:r>
+          </w:p>
+        </w:tc>
+        <w:tc>
+          <w:tcPr>
+            <w:tcW w:type="dxa" w:w="3118"/>
+            <w:shd w:val="clear" w:color="auto" w:fill="1F4E79"/>
+          </w:tcPr>
+          <w:p>
+            <w:pPr>
+              <w:jc w:val="center"/>
+            </w:pPr>
+            <w:r>
+              <w:rPr>
+                <w:rFonts w:ascii="Malgun Gothic" w:hAnsi="Malgun Gothic"/>
+                <w:b/>
+                <w:color w:val="FFFFFF"/>
+                <w:sz w:val="20"/>
+              </w:rPr>
+              <w:t>Level 1 (현재)</w:t>
+            </w:r>
+          </w:p>
+        </w:tc>
+        <w:tc>
+          <w:tcPr>
+            <w:tcW w:type="dxa" w:w="3402"/>
+            <w:shd w:val="clear" w:color="auto" w:fill="1F4E79"/>
+          </w:tcPr>
+          <w:p>
+            <w:pPr>
+              <w:jc w:val="center"/>
+            </w:pPr>
+            <w:r>
+              <w:rPr>
+                <w:rFonts w:ascii="Malgun Gothic" w:hAnsi="Malgun Gothic"/>
+                <w:b/>
+                <w:color w:val="FFFFFF"/>
+                <w:sz w:val="20"/>
+              </w:rPr>
+              <w:t>Level 2 (계획)</w:t>
+            </w:r>
+          </w:p>
+        </w:tc>
+      </w:tr>
+      <w:tr>
+        <w:tc>
+          <w:tcPr>
+            <w:tcW w:type="dxa" w:w="1701"/>
+            <w:shd w:val="clear" w:color="auto" w:fill="FFFFFF"/>
+          </w:tcPr>
+          <w:p>
+            <w:pPr>
+              <w:jc w:val="left"/>
+            </w:pPr>
+            <w:r>
+              <w:rPr>
+                <w:rFonts w:ascii="Malgun Gothic" w:hAnsi="Malgun Gothic"/>
+                <w:sz w:val="20"/>
+              </w:rPr>
+              <w:t>임베딩</w:t>
+            </w:r>
+          </w:p>
+        </w:tc>
+        <w:tc>
+          <w:tcPr>
+            <w:tcW w:type="dxa" w:w="3118"/>
+            <w:shd w:val="clear" w:color="auto" w:fill="FFFFFF"/>
+          </w:tcPr>
+          <w:p>
+            <w:pPr>
+              <w:jc w:val="center"/>
+            </w:pPr>
+            <w:r>
+              <w:rPr>
+                <w:rFonts w:ascii="Malgun Gothic" w:hAnsi="Malgun Gothic"/>
+                <w:sz w:val="20"/>
+              </w:rPr>
+              <w:t>12-dim 수치 특성 벡터</w:t>
+            </w:r>
+          </w:p>
+        </w:tc>
+        <w:tc>
+          <w:tcPr>
+            <w:tcW w:type="dxa" w:w="3402"/>
+            <w:shd w:val="clear" w:color="auto" w:fill="FFFFFF"/>
+          </w:tcPr>
+          <w:p>
+            <w:pPr>
+              <w:jc w:val="center"/>
+            </w:pPr>
+            <w:r>
+              <w:rPr>
+                <w:rFonts w:ascii="Malgun Gothic" w:hAnsi="Malgun Gothic"/>
+                <w:sz w:val="20"/>
+              </w:rPr>
+              <w:t>CNN/GRU 인코더 32-dim (의미론적 패턴)</w:t>
+            </w:r>
+          </w:p>
+        </w:tc>
+      </w:tr>
+      <w:tr>
+        <w:tc>
+          <w:tcPr>
+            <w:tcW w:type="dxa" w:w="1701"/>
+            <w:shd w:val="clear" w:color="auto" w:fill="F2F2F2"/>
+          </w:tcPr>
+          <w:p>
+            <w:pPr>
+              <w:jc w:val="left"/>
+            </w:pPr>
+            <w:r>
+              <w:rPr>
+                <w:rFonts w:ascii="Malgun Gothic" w:hAnsi="Malgun Gothic"/>
+                <w:sz w:val="20"/>
+              </w:rPr>
+              <w:t>유사도</w:t>
+            </w:r>
+          </w:p>
+        </w:tc>
+        <w:tc>
+          <w:tcPr>
+            <w:tcW w:type="dxa" w:w="3118"/>
+            <w:shd w:val="clear" w:color="auto" w:fill="F2F2F2"/>
+          </w:tcPr>
+          <w:p>
+            <w:pPr>
+              <w:jc w:val="center"/>
+            </w:pPr>
+            <w:r>
+              <w:rPr>
+                <w:rFonts w:ascii="Malgun Gothic" w:hAnsi="Malgun Gothic"/>
+                <w:sz w:val="20"/>
+              </w:rPr>
+              <w:t>수치 코사인 유사도</w:t>
+            </w:r>
+          </w:p>
+        </w:tc>
+        <w:tc>
+          <w:tcPr>
+            <w:tcW w:type="dxa" w:w="3402"/>
+            <w:shd w:val="clear" w:color="auto" w:fill="F2F2F2"/>
+          </w:tcPr>
+          <w:p>
+            <w:pPr>
+              <w:jc w:val="center"/>
+            </w:pPr>
+            <w:r>
+              <w:rPr>
+                <w:rFonts w:ascii="Malgun Gothic" w:hAnsi="Malgun Gothic"/>
+                <w:sz w:val="20"/>
+              </w:rPr>
+              <w:t>패턴 의미 유사도</w:t>
+            </w:r>
+          </w:p>
+        </w:tc>
+      </w:tr>
+      <w:tr>
+        <w:tc>
+          <w:tcPr>
+            <w:tcW w:type="dxa" w:w="1701"/>
+            <w:shd w:val="clear" w:color="auto" w:fill="FFFFFF"/>
+          </w:tcPr>
+          <w:p>
+            <w:pPr>
+              <w:jc w:val="left"/>
+            </w:pPr>
+            <w:r>
+              <w:rPr>
+                <w:rFonts w:ascii="Malgun Gothic" w:hAnsi="Malgun Gothic"/>
+                <w:sz w:val="20"/>
+              </w:rPr>
+              <w:t>LLM 연동</w:t>
+            </w:r>
+          </w:p>
+        </w:tc>
+        <w:tc>
+          <w:tcPr>
+            <w:tcW w:type="dxa" w:w="3118"/>
+            <w:shd w:val="clear" w:color="auto" w:fill="FFFFFF"/>
+          </w:tcPr>
+          <w:p>
+            <w:pPr>
+              <w:jc w:val="center"/>
+            </w:pPr>
+            <w:r>
+              <w:rPr>
+                <w:rFonts w:ascii="Malgun Gothic" w:hAnsi="Malgun Gothic"/>
+                <w:sz w:val="20"/>
+              </w:rPr>
+              <w:t>없음</w:t>
+            </w:r>
+          </w:p>
+        </w:tc>
+        <w:tc>
+          <w:tcPr>
+            <w:tcW w:type="dxa" w:w="3402"/>
+            <w:shd w:val="clear" w:color="auto" w:fill="FFFFFF"/>
+          </w:tcPr>
+          <w:p>
+            <w:pPr>
+              <w:jc w:val="center"/>
+            </w:pPr>
+            <w:r>
+              <w:rPr>
+                <w:rFonts w:ascii="Malgun Gothic" w:hAnsi="Malgun Gothic"/>
+                <w:sz w:val="20"/>
+              </w:rPr>
+              <w:t>자동 진단 보고서 생성</w:t>
+            </w:r>
+          </w:p>
+        </w:tc>
+      </w:tr>
+      <w:tr>
+        <w:tc>
+          <w:tcPr>
+            <w:tcW w:type="dxa" w:w="1701"/>
+            <w:shd w:val="clear" w:color="auto" w:fill="F2F2F2"/>
+          </w:tcPr>
+          <w:p>
+            <w:pPr>
+              <w:jc w:val="left"/>
+            </w:pPr>
+            <w:r>
+              <w:rPr>
+                <w:rFonts w:ascii="Malgun Gothic" w:hAnsi="Malgun Gothic"/>
+                <w:sz w:val="20"/>
+              </w:rPr>
+              <w:t>구현 복잡도</w:t>
+            </w:r>
+          </w:p>
+        </w:tc>
+        <w:tc>
+          <w:tcPr>
+            <w:tcW w:type="dxa" w:w="3118"/>
+            <w:shd w:val="clear" w:color="auto" w:fill="F2F2F2"/>
+          </w:tcPr>
+          <w:p>
+            <w:pPr>
+              <w:jc w:val="center"/>
+            </w:pPr>
+            <w:r>
+              <w:rPr>
+                <w:rFonts w:ascii="Malgun Gothic" w:hAnsi="Malgun Gothic"/>
+                <w:sz w:val="20"/>
+              </w:rPr>
+              <w:t>낮음 (FAISS + sklearn)</w:t>
+            </w:r>
+          </w:p>
+        </w:tc>
+        <w:tc>
+          <w:tcPr>
+            <w:tcW w:type="dxa" w:w="3402"/>
+            <w:shd w:val="clear" w:color="auto" w:fill="F2F2F2"/>
+          </w:tcPr>
+          <w:p>
+            <w:pPr>
+              <w:jc w:val="center"/>
+            </w:pPr>
+            <w:r>
+              <w:rPr>
+                <w:rFonts w:ascii="Malgun Gothic" w:hAnsi="Malgun Gothic"/>
+                <w:sz w:val="20"/>
+              </w:rPr>
+              <w:t>높음 (딥러닝 인코더 + LLM API)</w:t>
+            </w:r>
+          </w:p>
+        </w:tc>
+      </w:tr>
+      <w:tr>
+        <w:tc>
+          <w:tcPr>
+            <w:tcW w:type="dxa" w:w="1701"/>
+            <w:shd w:val="clear" w:color="auto" w:fill="FFFFFF"/>
+          </w:tcPr>
+          <w:p>
+            <w:pPr>
+              <w:jc w:val="left"/>
+            </w:pPr>
+            <w:r>
+              <w:rPr>
+                <w:rFonts w:ascii="Malgun Gothic" w:hAnsi="Malgun Gothic"/>
+                <w:sz w:val="20"/>
+              </w:rPr>
+              <w:t>현재 상태</w:t>
+            </w:r>
+          </w:p>
+        </w:tc>
+        <w:tc>
+          <w:tcPr>
+            <w:tcW w:type="dxa" w:w="3118"/>
+            <w:shd w:val="clear" w:color="auto" w:fill="FFFFFF"/>
+          </w:tcPr>
+          <w:p>
+            <w:pPr>
+              <w:jc w:val="center"/>
+            </w:pPr>
+            <w:r>
+              <w:rPr>
+                <w:rFonts w:ascii="Malgun Gothic" w:hAnsi="Malgun Gothic"/>
+                <w:sz w:val="20"/>
+              </w:rPr>
+              <w:t>구현 완료 + Streamlit 배포</w:t>
+            </w:r>
+          </w:p>
+        </w:tc>
+        <w:tc>
+          <w:tcPr>
+            <w:tcW w:type="dxa" w:w="3402"/>
+            <w:shd w:val="clear" w:color="auto" w:fill="FFFFFF"/>
+          </w:tcPr>
+          <w:p>
+            <w:pPr>
+              <w:jc w:val="center"/>
+            </w:pPr>
+            <w:r>
+              <w:rPr>
+                <w:rFonts w:ascii="Malgun Gothic" w:hAnsi="Malgun Gothic"/>
+                <w:sz w:val="20"/>
+              </w:rPr>
+              <w:t>향후 Phase 3 이후 검토</w:t>
+            </w:r>
+          </w:p>
+        </w:tc>
+      </w:tr>
+    </w:tbl>
+    <w:p/>
+    <w:p>
+      <w:r>
+        <w:rPr>
+          <w:rFonts w:ascii="Malgun Gothic" w:hAnsi="Malgun Gothic"/>
+          <w:b w:val="0"/>
+          <w:sz w:val="18"/>
+        </w:rPr>
+        <w:t>현재 DL 소스 전체에 LLM 코드는 없습니다. 향후 계획표(Phase 2: Attention+SHAP,</w:t>
+        <w:br/>
+        <w:t>Phase 3: 앙상블+실공장 데이터)에도 LLM은 포함되어 있지 않습니다. Level 2 RAG 업그레이드</w:t>
+        <w:br/>
+        <w:t>시에만 LLM API 연동이 필요합니다.</w:t>
       </w:r>
     </w:p>
     <w:sectPr>

</xml_diff>